<commit_message>
add description for all diagram in my individual report
</commit_message>
<xml_diff>
--- a/документация/Отчет Солдаткина.docx
+++ b/документация/Отчет Солдаткина.docx
@@ -1119,6 +1119,8 @@
         <w:t>Содержание</w:t>
       </w:r>
     </w:p>
+    <w:bookmarkStart w:id="2" w:name="_GoBack"/>
+    <w:bookmarkEnd w:id="2"/>
     <w:p>
       <w:pPr>
         <w:pStyle w:val="11"/>
@@ -1158,7 +1160,7 @@
         </w:rPr>
         <w:fldChar w:fldCharType="separate"/>
       </w:r>
-      <w:hyperlink w:anchor="_Toc230096030" w:history="1">
+      <w:hyperlink w:anchor="_Toc230102727" w:history="1">
         <w:r>
           <w:rPr>
             <w:rStyle w:val="a9"/>
@@ -1187,7 +1189,7 @@
             <w:noProof/>
             <w:webHidden/>
           </w:rPr>
-          <w:instrText xml:space="preserve"> PAGEREF _Toc230096030 \h </w:instrText>
+          <w:instrText xml:space="preserve"> PAGEREF _Toc230102727 \h </w:instrText>
         </w:r>
         <w:r>
           <w:rPr>
@@ -1231,7 +1233,7 @@
           <w:lang w:eastAsia="ru-RU"/>
         </w:rPr>
       </w:pPr>
-      <w:hyperlink w:anchor="_Toc230096031" w:history="1">
+      <w:hyperlink w:anchor="_Toc230102728" w:history="1">
         <w:r>
           <w:rPr>
             <w:rStyle w:val="a9"/>
@@ -1277,7 +1279,7 @@
             <w:noProof/>
             <w:webHidden/>
           </w:rPr>
-          <w:instrText xml:space="preserve"> PAGEREF _Toc230096031 \h </w:instrText>
+          <w:instrText xml:space="preserve"> PAGEREF _Toc230102728 \h </w:instrText>
         </w:r>
         <w:r>
           <w:rPr>
@@ -1321,7 +1323,7 @@
           <w:lang w:eastAsia="ru-RU"/>
         </w:rPr>
       </w:pPr>
-      <w:hyperlink w:anchor="_Toc230096032" w:history="1">
+      <w:hyperlink w:anchor="_Toc230102729" w:history="1">
         <w:r>
           <w:rPr>
             <w:rStyle w:val="a9"/>
@@ -1367,7 +1369,7 @@
             <w:noProof/>
             <w:webHidden/>
           </w:rPr>
-          <w:instrText xml:space="preserve"> PAGEREF _Toc230096032 \h </w:instrText>
+          <w:instrText xml:space="preserve"> PAGEREF _Toc230102729 \h </w:instrText>
         </w:r>
         <w:r>
           <w:rPr>
@@ -1411,7 +1413,7 @@
           <w:lang w:eastAsia="ru-RU"/>
         </w:rPr>
       </w:pPr>
-      <w:hyperlink w:anchor="_Toc230096033" w:history="1">
+      <w:hyperlink w:anchor="_Toc230102730" w:history="1">
         <w:r>
           <w:rPr>
             <w:rStyle w:val="a9"/>
@@ -1457,7 +1459,7 @@
             <w:noProof/>
             <w:webHidden/>
           </w:rPr>
-          <w:instrText xml:space="preserve"> PAGEREF _Toc230096033 \h </w:instrText>
+          <w:instrText xml:space="preserve"> PAGEREF _Toc230102730 \h </w:instrText>
         </w:r>
         <w:r>
           <w:rPr>
@@ -1501,7 +1503,7 @@
           <w:lang w:eastAsia="ru-RU"/>
         </w:rPr>
       </w:pPr>
-      <w:hyperlink w:anchor="_Toc230096034" w:history="1">
+      <w:hyperlink w:anchor="_Toc230102731" w:history="1">
         <w:r>
           <w:rPr>
             <w:rStyle w:val="a9"/>
@@ -1549,7 +1551,7 @@
             <w:noProof/>
             <w:webHidden/>
           </w:rPr>
-          <w:instrText xml:space="preserve"> PAGEREF _Toc230096034 \h </w:instrText>
+          <w:instrText xml:space="preserve"> PAGEREF _Toc230102731 \h </w:instrText>
         </w:r>
         <w:r>
           <w:rPr>
@@ -1593,7 +1595,7 @@
           <w:lang w:eastAsia="ru-RU"/>
         </w:rPr>
       </w:pPr>
-      <w:hyperlink w:anchor="_Toc230096035" w:history="1">
+      <w:hyperlink w:anchor="_Toc230102732" w:history="1">
         <w:r>
           <w:rPr>
             <w:rStyle w:val="a9"/>
@@ -1639,7 +1641,7 @@
             <w:noProof/>
             <w:webHidden/>
           </w:rPr>
-          <w:instrText xml:space="preserve"> PAGEREF _Toc230096035 \h </w:instrText>
+          <w:instrText xml:space="preserve"> PAGEREF _Toc230102732 \h </w:instrText>
         </w:r>
         <w:r>
           <w:rPr>
@@ -1683,7 +1685,7 @@
           <w:lang w:eastAsia="ru-RU"/>
         </w:rPr>
       </w:pPr>
-      <w:hyperlink w:anchor="_Toc230096036" w:history="1">
+      <w:hyperlink w:anchor="_Toc230102733" w:history="1">
         <w:r>
           <w:rPr>
             <w:rStyle w:val="a9"/>
@@ -1729,7 +1731,7 @@
             <w:noProof/>
             <w:webHidden/>
           </w:rPr>
-          <w:instrText xml:space="preserve"> PAGEREF _Toc230096036 \h </w:instrText>
+          <w:instrText xml:space="preserve"> PAGEREF _Toc230102733 \h </w:instrText>
         </w:r>
         <w:r>
           <w:rPr>
@@ -1773,7 +1775,7 @@
           <w:lang w:eastAsia="ru-RU"/>
         </w:rPr>
       </w:pPr>
-      <w:hyperlink w:anchor="_Toc230096037" w:history="1">
+      <w:hyperlink w:anchor="_Toc230102734" w:history="1">
         <w:r>
           <w:rPr>
             <w:rStyle w:val="a9"/>
@@ -1819,7 +1821,7 @@
             <w:noProof/>
             <w:webHidden/>
           </w:rPr>
-          <w:instrText xml:space="preserve"> PAGEREF _Toc230096037 \h </w:instrText>
+          <w:instrText xml:space="preserve"> PAGEREF _Toc230102734 \h </w:instrText>
         </w:r>
         <w:r>
           <w:rPr>
@@ -1863,7 +1865,7 @@
           <w:lang w:eastAsia="ru-RU"/>
         </w:rPr>
       </w:pPr>
-      <w:hyperlink w:anchor="_Toc230096038" w:history="1">
+      <w:hyperlink w:anchor="_Toc230102735" w:history="1">
         <w:r>
           <w:rPr>
             <w:rStyle w:val="a9"/>
@@ -1909,7 +1911,7 @@
             <w:noProof/>
             <w:webHidden/>
           </w:rPr>
-          <w:instrText xml:space="preserve"> PAGEREF _Toc230096038 \h </w:instrText>
+          <w:instrText xml:space="preserve"> PAGEREF _Toc230102735 \h </w:instrText>
         </w:r>
         <w:r>
           <w:rPr>
@@ -1953,7 +1955,7 @@
           <w:lang w:eastAsia="ru-RU"/>
         </w:rPr>
       </w:pPr>
-      <w:hyperlink w:anchor="_Toc230096039" w:history="1">
+      <w:hyperlink w:anchor="_Toc230102736" w:history="1">
         <w:r>
           <w:rPr>
             <w:rStyle w:val="a9"/>
@@ -1999,7 +2001,7 @@
             <w:noProof/>
             <w:webHidden/>
           </w:rPr>
-          <w:instrText xml:space="preserve"> PAGEREF _Toc230096039 \h </w:instrText>
+          <w:instrText xml:space="preserve"> PAGEREF _Toc230102736 \h </w:instrText>
         </w:r>
         <w:r>
           <w:rPr>
@@ -2043,7 +2045,7 @@
           <w:lang w:eastAsia="ru-RU"/>
         </w:rPr>
       </w:pPr>
-      <w:hyperlink w:anchor="_Toc230096040" w:history="1">
+      <w:hyperlink w:anchor="_Toc230102737" w:history="1">
         <w:r>
           <w:rPr>
             <w:rStyle w:val="a9"/>
@@ -2089,7 +2091,7 @@
             <w:noProof/>
             <w:webHidden/>
           </w:rPr>
-          <w:instrText xml:space="preserve"> PAGEREF _Toc230096040 \h </w:instrText>
+          <w:instrText xml:space="preserve"> PAGEREF _Toc230102737 \h </w:instrText>
         </w:r>
         <w:r>
           <w:rPr>
@@ -2133,7 +2135,7 @@
           <w:lang w:eastAsia="ru-RU"/>
         </w:rPr>
       </w:pPr>
-      <w:hyperlink w:anchor="_Toc230096041" w:history="1">
+      <w:hyperlink w:anchor="_Toc230102738" w:history="1">
         <w:r>
           <w:rPr>
             <w:rStyle w:val="a9"/>
@@ -2179,7 +2181,7 @@
             <w:noProof/>
             <w:webHidden/>
           </w:rPr>
-          <w:instrText xml:space="preserve"> PAGEREF _Toc230096041 \h </w:instrText>
+          <w:instrText xml:space="preserve"> PAGEREF _Toc230102738 \h </w:instrText>
         </w:r>
         <w:r>
           <w:rPr>
@@ -2223,7 +2225,7 @@
           <w:lang w:eastAsia="ru-RU"/>
         </w:rPr>
       </w:pPr>
-      <w:hyperlink w:anchor="_Toc230096042" w:history="1">
+      <w:hyperlink w:anchor="_Toc230102739" w:history="1">
         <w:r>
           <w:rPr>
             <w:rStyle w:val="a9"/>
@@ -2269,7 +2271,7 @@
             <w:noProof/>
             <w:webHidden/>
           </w:rPr>
-          <w:instrText xml:space="preserve"> PAGEREF _Toc230096042 \h </w:instrText>
+          <w:instrText xml:space="preserve"> PAGEREF _Toc230102739 \h </w:instrText>
         </w:r>
         <w:r>
           <w:rPr>
@@ -2313,7 +2315,7 @@
           <w:lang w:eastAsia="ru-RU"/>
         </w:rPr>
       </w:pPr>
-      <w:hyperlink w:anchor="_Toc230096043" w:history="1">
+      <w:hyperlink w:anchor="_Toc230102740" w:history="1">
         <w:r>
           <w:rPr>
             <w:rStyle w:val="a9"/>
@@ -2359,7 +2361,7 @@
             <w:noProof/>
             <w:webHidden/>
           </w:rPr>
-          <w:instrText xml:space="preserve"> PAGEREF _Toc230096043 \h </w:instrText>
+          <w:instrText xml:space="preserve"> PAGEREF _Toc230102740 \h </w:instrText>
         </w:r>
         <w:r>
           <w:rPr>
@@ -2403,7 +2405,7 @@
           <w:lang w:eastAsia="ru-RU"/>
         </w:rPr>
       </w:pPr>
-      <w:hyperlink w:anchor="_Toc230096044" w:history="1">
+      <w:hyperlink w:anchor="_Toc230102741" w:history="1">
         <w:r>
           <w:rPr>
             <w:rStyle w:val="a9"/>
@@ -2449,7 +2451,7 @@
             <w:noProof/>
             <w:webHidden/>
           </w:rPr>
-          <w:instrText xml:space="preserve"> PAGEREF _Toc230096044 \h </w:instrText>
+          <w:instrText xml:space="preserve"> PAGEREF _Toc230102741 \h </w:instrText>
         </w:r>
         <w:r>
           <w:rPr>
@@ -2493,7 +2495,7 @@
           <w:lang w:eastAsia="ru-RU"/>
         </w:rPr>
       </w:pPr>
-      <w:hyperlink w:anchor="_Toc230096045" w:history="1">
+      <w:hyperlink w:anchor="_Toc230102742" w:history="1">
         <w:r>
           <w:rPr>
             <w:rStyle w:val="a9"/>
@@ -2539,7 +2541,7 @@
             <w:noProof/>
             <w:webHidden/>
           </w:rPr>
-          <w:instrText xml:space="preserve"> PAGEREF _Toc230096045 \h </w:instrText>
+          <w:instrText xml:space="preserve"> PAGEREF _Toc230102742 \h </w:instrText>
         </w:r>
         <w:r>
           <w:rPr>
@@ -2583,7 +2585,7 @@
           <w:lang w:eastAsia="ru-RU"/>
         </w:rPr>
       </w:pPr>
-      <w:hyperlink w:anchor="_Toc230096046" w:history="1">
+      <w:hyperlink w:anchor="_Toc230102743" w:history="1">
         <w:r>
           <w:rPr>
             <w:rStyle w:val="a9"/>
@@ -2629,7 +2631,7 @@
             <w:noProof/>
             <w:webHidden/>
           </w:rPr>
-          <w:instrText xml:space="preserve"> PAGEREF _Toc230096046 \h </w:instrText>
+          <w:instrText xml:space="preserve"> PAGEREF _Toc230102743 \h </w:instrText>
         </w:r>
         <w:r>
           <w:rPr>
@@ -2673,7 +2675,7 @@
           <w:lang w:eastAsia="ru-RU"/>
         </w:rPr>
       </w:pPr>
-      <w:hyperlink w:anchor="_Toc230096047" w:history="1">
+      <w:hyperlink w:anchor="_Toc230102744" w:history="1">
         <w:r>
           <w:rPr>
             <w:rStyle w:val="a9"/>
@@ -2719,7 +2721,7 @@
             <w:noProof/>
             <w:webHidden/>
           </w:rPr>
-          <w:instrText xml:space="preserve"> PAGEREF _Toc230096047 \h </w:instrText>
+          <w:instrText xml:space="preserve"> PAGEREF _Toc230102744 \h </w:instrText>
         </w:r>
         <w:r>
           <w:rPr>
@@ -2763,7 +2765,7 @@
           <w:lang w:eastAsia="ru-RU"/>
         </w:rPr>
       </w:pPr>
-      <w:hyperlink w:anchor="_Toc230096048" w:history="1">
+      <w:hyperlink w:anchor="_Toc230102745" w:history="1">
         <w:r>
           <w:rPr>
             <w:rStyle w:val="a9"/>
@@ -2809,7 +2811,7 @@
             <w:noProof/>
             <w:webHidden/>
           </w:rPr>
-          <w:instrText xml:space="preserve"> PAGEREF _Toc230096048 \h </w:instrText>
+          <w:instrText xml:space="preserve"> PAGEREF _Toc230102745 \h </w:instrText>
         </w:r>
         <w:r>
           <w:rPr>
@@ -2853,7 +2855,7 @@
           <w:lang w:eastAsia="ru-RU"/>
         </w:rPr>
       </w:pPr>
-      <w:hyperlink w:anchor="_Toc230096049" w:history="1">
+      <w:hyperlink w:anchor="_Toc230102746" w:history="1">
         <w:r>
           <w:rPr>
             <w:rStyle w:val="a9"/>
@@ -2899,7 +2901,7 @@
             <w:noProof/>
             <w:webHidden/>
           </w:rPr>
-          <w:instrText xml:space="preserve"> PAGEREF _Toc230096049 \h </w:instrText>
+          <w:instrText xml:space="preserve"> PAGEREF _Toc230102746 \h </w:instrText>
         </w:r>
         <w:r>
           <w:rPr>
@@ -2943,7 +2945,7 @@
           <w:lang w:eastAsia="ru-RU"/>
         </w:rPr>
       </w:pPr>
-      <w:hyperlink w:anchor="_Toc230096050" w:history="1">
+      <w:hyperlink w:anchor="_Toc230102747" w:history="1">
         <w:r>
           <w:rPr>
             <w:rStyle w:val="a9"/>
@@ -2989,7 +2991,7 @@
             <w:noProof/>
             <w:webHidden/>
           </w:rPr>
-          <w:instrText xml:space="preserve"> PAGEREF _Toc230096050 \h </w:instrText>
+          <w:instrText xml:space="preserve"> PAGEREF _Toc230102747 \h </w:instrText>
         </w:r>
         <w:r>
           <w:rPr>
@@ -3033,7 +3035,7 @@
           <w:lang w:eastAsia="ru-RU"/>
         </w:rPr>
       </w:pPr>
-      <w:hyperlink w:anchor="_Toc230096051" w:history="1">
+      <w:hyperlink w:anchor="_Toc230102748" w:history="1">
         <w:r>
           <w:rPr>
             <w:rStyle w:val="a9"/>
@@ -3079,7 +3081,7 @@
             <w:noProof/>
             <w:webHidden/>
           </w:rPr>
-          <w:instrText xml:space="preserve"> PAGEREF _Toc230096051 \h </w:instrText>
+          <w:instrText xml:space="preserve"> PAGEREF _Toc230102748 \h </w:instrText>
         </w:r>
         <w:r>
           <w:rPr>
@@ -3123,7 +3125,7 @@
           <w:lang w:eastAsia="ru-RU"/>
         </w:rPr>
       </w:pPr>
-      <w:hyperlink w:anchor="_Toc230096052" w:history="1">
+      <w:hyperlink w:anchor="_Toc230102749" w:history="1">
         <w:r>
           <w:rPr>
             <w:rStyle w:val="a9"/>
@@ -3169,7 +3171,7 @@
             <w:noProof/>
             <w:webHidden/>
           </w:rPr>
-          <w:instrText xml:space="preserve"> PAGEREF _Toc230096052 \h </w:instrText>
+          <w:instrText xml:space="preserve"> PAGEREF _Toc230102749 \h </w:instrText>
         </w:r>
         <w:r>
           <w:rPr>
@@ -3213,7 +3215,7 @@
           <w:lang w:eastAsia="ru-RU"/>
         </w:rPr>
       </w:pPr>
-      <w:hyperlink w:anchor="_Toc230096053" w:history="1">
+      <w:hyperlink w:anchor="_Toc230102750" w:history="1">
         <w:r>
           <w:rPr>
             <w:rStyle w:val="a9"/>
@@ -3259,7 +3261,7 @@
             <w:noProof/>
             <w:webHidden/>
           </w:rPr>
-          <w:instrText xml:space="preserve"> PAGEREF _Toc230096053 \h </w:instrText>
+          <w:instrText xml:space="preserve"> PAGEREF _Toc230102750 \h </w:instrText>
         </w:r>
         <w:r>
           <w:rPr>
@@ -3303,7 +3305,7 @@
           <w:lang w:eastAsia="ru-RU"/>
         </w:rPr>
       </w:pPr>
-      <w:hyperlink w:anchor="_Toc230096054" w:history="1">
+      <w:hyperlink w:anchor="_Toc230102751" w:history="1">
         <w:r>
           <w:rPr>
             <w:rStyle w:val="a9"/>
@@ -3349,7 +3351,7 @@
             <w:noProof/>
             <w:webHidden/>
           </w:rPr>
-          <w:instrText xml:space="preserve"> PAGEREF _Toc230096054 \h </w:instrText>
+          <w:instrText xml:space="preserve"> PAGEREF _Toc230102751 \h </w:instrText>
         </w:r>
         <w:r>
           <w:rPr>
@@ -3393,7 +3395,7 @@
           <w:lang w:eastAsia="ru-RU"/>
         </w:rPr>
       </w:pPr>
-      <w:hyperlink w:anchor="_Toc230096055" w:history="1">
+      <w:hyperlink w:anchor="_Toc230102752" w:history="1">
         <w:r>
           <w:rPr>
             <w:rStyle w:val="a9"/>
@@ -3439,7 +3441,7 @@
             <w:noProof/>
             <w:webHidden/>
           </w:rPr>
-          <w:instrText xml:space="preserve"> PAGEREF _Toc230096055 \h </w:instrText>
+          <w:instrText xml:space="preserve"> PAGEREF _Toc230102752 \h </w:instrText>
         </w:r>
         <w:r>
           <w:rPr>
@@ -3483,7 +3485,7 @@
           <w:lang w:eastAsia="ru-RU"/>
         </w:rPr>
       </w:pPr>
-      <w:hyperlink w:anchor="_Toc230096056" w:history="1">
+      <w:hyperlink w:anchor="_Toc230102753" w:history="1">
         <w:r>
           <w:rPr>
             <w:rStyle w:val="a9"/>
@@ -3525,7 +3527,7 @@
             <w:noProof/>
             <w:webHidden/>
           </w:rPr>
-          <w:instrText xml:space="preserve"> PAGEREF _Toc230096056 \h </w:instrText>
+          <w:instrText xml:space="preserve"> PAGEREF _Toc230102753 \h </w:instrText>
         </w:r>
         <w:r>
           <w:rPr>
@@ -3569,7 +3571,7 @@
           <w:lang w:eastAsia="ru-RU"/>
         </w:rPr>
       </w:pPr>
-      <w:hyperlink w:anchor="_Toc230096057" w:history="1">
+      <w:hyperlink w:anchor="_Toc230102754" w:history="1">
         <w:r>
           <w:rPr>
             <w:rStyle w:val="a9"/>
@@ -3611,7 +3613,7 @@
             <w:noProof/>
             <w:webHidden/>
           </w:rPr>
-          <w:instrText xml:space="preserve"> PAGEREF _Toc230096057 \h </w:instrText>
+          <w:instrText xml:space="preserve"> PAGEREF _Toc230102754 \h </w:instrText>
         </w:r>
         <w:r>
           <w:rPr>
@@ -3655,7 +3657,7 @@
           <w:lang w:eastAsia="ru-RU"/>
         </w:rPr>
       </w:pPr>
-      <w:hyperlink w:anchor="_Toc230096058" w:history="1">
+      <w:hyperlink w:anchor="_Toc230102755" w:history="1">
         <w:r>
           <w:rPr>
             <w:rStyle w:val="a9"/>
@@ -3697,7 +3699,7 @@
             <w:noProof/>
             <w:webHidden/>
           </w:rPr>
-          <w:instrText xml:space="preserve"> PAGEREF _Toc230096058 \h </w:instrText>
+          <w:instrText xml:space="preserve"> PAGEREF _Toc230102755 \h </w:instrText>
         </w:r>
         <w:r>
           <w:rPr>
@@ -3741,7 +3743,7 @@
           <w:lang w:eastAsia="ru-RU"/>
         </w:rPr>
       </w:pPr>
-      <w:hyperlink w:anchor="_Toc230096059" w:history="1">
+      <w:hyperlink w:anchor="_Toc230102756" w:history="1">
         <w:r>
           <w:rPr>
             <w:rStyle w:val="a9"/>
@@ -3783,7 +3785,7 @@
             <w:noProof/>
             <w:webHidden/>
           </w:rPr>
-          <w:instrText xml:space="preserve"> PAGEREF _Toc230096059 \h </w:instrText>
+          <w:instrText xml:space="preserve"> PAGEREF _Toc230102756 \h </w:instrText>
         </w:r>
         <w:r>
           <w:rPr>
@@ -3827,7 +3829,7 @@
           <w:lang w:eastAsia="ru-RU"/>
         </w:rPr>
       </w:pPr>
-      <w:hyperlink w:anchor="_Toc230096060" w:history="1">
+      <w:hyperlink w:anchor="_Toc230102757" w:history="1">
         <w:r>
           <w:rPr>
             <w:rStyle w:val="a9"/>
@@ -3869,7 +3871,7 @@
             <w:noProof/>
             <w:webHidden/>
           </w:rPr>
-          <w:instrText xml:space="preserve"> PAGEREF _Toc230096060 \h </w:instrText>
+          <w:instrText xml:space="preserve"> PAGEREF _Toc230102757 \h </w:instrText>
         </w:r>
         <w:r>
           <w:rPr>
@@ -3913,7 +3915,7 @@
           <w:lang w:eastAsia="ru-RU"/>
         </w:rPr>
       </w:pPr>
-      <w:hyperlink w:anchor="_Toc230096061" w:history="1">
+      <w:hyperlink w:anchor="_Toc230102758" w:history="1">
         <w:r>
           <w:rPr>
             <w:rStyle w:val="a9"/>
@@ -3955,7 +3957,7 @@
             <w:noProof/>
             <w:webHidden/>
           </w:rPr>
-          <w:instrText xml:space="preserve"> PAGEREF _Toc230096061 \h </w:instrText>
+          <w:instrText xml:space="preserve"> PAGEREF _Toc230102758 \h </w:instrText>
         </w:r>
         <w:r>
           <w:rPr>
@@ -3999,7 +4001,7 @@
           <w:lang w:eastAsia="ru-RU"/>
         </w:rPr>
       </w:pPr>
-      <w:hyperlink w:anchor="_Toc230096062" w:history="1">
+      <w:hyperlink w:anchor="_Toc230102759" w:history="1">
         <w:r>
           <w:rPr>
             <w:rStyle w:val="a9"/>
@@ -4041,7 +4043,7 @@
             <w:noProof/>
             <w:webHidden/>
           </w:rPr>
-          <w:instrText xml:space="preserve"> PAGEREF _Toc230096062 \h </w:instrText>
+          <w:instrText xml:space="preserve"> PAGEREF _Toc230102759 \h </w:instrText>
         </w:r>
         <w:r>
           <w:rPr>
@@ -4085,7 +4087,7 @@
           <w:lang w:eastAsia="ru-RU"/>
         </w:rPr>
       </w:pPr>
-      <w:hyperlink w:anchor="_Toc230096063" w:history="1">
+      <w:hyperlink w:anchor="_Toc230102760" w:history="1">
         <w:r>
           <w:rPr>
             <w:rStyle w:val="a9"/>
@@ -4127,7 +4129,7 @@
             <w:noProof/>
             <w:webHidden/>
           </w:rPr>
-          <w:instrText xml:space="preserve"> PAGEREF _Toc230096063 \h </w:instrText>
+          <w:instrText xml:space="preserve"> PAGEREF _Toc230102760 \h </w:instrText>
         </w:r>
         <w:r>
           <w:rPr>
@@ -4171,7 +4173,7 @@
           <w:lang w:eastAsia="ru-RU"/>
         </w:rPr>
       </w:pPr>
-      <w:hyperlink w:anchor="_Toc230096064" w:history="1">
+      <w:hyperlink w:anchor="_Toc230102761" w:history="1">
         <w:r>
           <w:rPr>
             <w:rStyle w:val="a9"/>
@@ -4213,7 +4215,7 @@
             <w:noProof/>
             <w:webHidden/>
           </w:rPr>
-          <w:instrText xml:space="preserve"> PAGEREF _Toc230096064 \h </w:instrText>
+          <w:instrText xml:space="preserve"> PAGEREF _Toc230102761 \h </w:instrText>
         </w:r>
         <w:r>
           <w:rPr>
@@ -4257,7 +4259,7 @@
           <w:lang w:eastAsia="ru-RU"/>
         </w:rPr>
       </w:pPr>
-      <w:hyperlink w:anchor="_Toc230096065" w:history="1">
+      <w:hyperlink w:anchor="_Toc230102762" w:history="1">
         <w:r>
           <w:rPr>
             <w:rStyle w:val="a9"/>
@@ -4299,7 +4301,7 @@
             <w:noProof/>
             <w:webHidden/>
           </w:rPr>
-          <w:instrText xml:space="preserve"> PAGEREF _Toc230096065 \h </w:instrText>
+          <w:instrText xml:space="preserve"> PAGEREF _Toc230102762 \h </w:instrText>
         </w:r>
         <w:r>
           <w:rPr>
@@ -4343,7 +4345,7 @@
           <w:lang w:eastAsia="ru-RU"/>
         </w:rPr>
       </w:pPr>
-      <w:hyperlink w:anchor="_Toc230096066" w:history="1">
+      <w:hyperlink w:anchor="_Toc230102763" w:history="1">
         <w:r>
           <w:rPr>
             <w:rStyle w:val="a9"/>
@@ -4391,7 +4393,7 @@
             <w:noProof/>
             <w:webHidden/>
           </w:rPr>
-          <w:instrText xml:space="preserve"> PAGEREF _Toc230096066 \h </w:instrText>
+          <w:instrText xml:space="preserve"> PAGEREF _Toc230102763 \h </w:instrText>
         </w:r>
         <w:r>
           <w:rPr>
@@ -4435,7 +4437,7 @@
           <w:lang w:eastAsia="ru-RU"/>
         </w:rPr>
       </w:pPr>
-      <w:hyperlink w:anchor="_Toc230096067" w:history="1">
+      <w:hyperlink w:anchor="_Toc230102764" w:history="1">
         <w:r>
           <w:rPr>
             <w:rStyle w:val="a9"/>
@@ -4460,25 +4462,7 @@
             <w:noProof/>
             <w:lang w:eastAsia="ru-RU"/>
           </w:rPr>
-          <w:t>Проектирование системы авториза</w:t>
-        </w:r>
-        <w:r>
-          <w:rPr>
-            <w:rStyle w:val="a9"/>
-            <w:rFonts w:eastAsia="Times New Roman"/>
-            <w:noProof/>
-            <w:lang w:eastAsia="ru-RU"/>
-          </w:rPr>
-          <w:t>ц</w:t>
-        </w:r>
-        <w:r>
-          <w:rPr>
-            <w:rStyle w:val="a9"/>
-            <w:rFonts w:eastAsia="Times New Roman"/>
-            <w:noProof/>
-            <w:lang w:eastAsia="ru-RU"/>
-          </w:rPr>
-          <w:t>ии / регистрации</w:t>
+          <w:t>Проектирование системы авторизации / регистрации</w:t>
         </w:r>
         <w:r>
           <w:rPr>
@@ -4499,7 +4483,7 @@
             <w:noProof/>
             <w:webHidden/>
           </w:rPr>
-          <w:instrText xml:space="preserve"> PAGEREF _Toc230096067 \h </w:instrText>
+          <w:instrText xml:space="preserve"> PAGEREF _Toc230102764 \h </w:instrText>
         </w:r>
         <w:r>
           <w:rPr>
@@ -4543,13 +4527,12 @@
           <w:lang w:eastAsia="ru-RU"/>
         </w:rPr>
       </w:pPr>
-      <w:hyperlink w:anchor="_Toc230096068" w:history="1">
+      <w:hyperlink w:anchor="_Toc230102765" w:history="1">
         <w:r>
           <w:rPr>
             <w:rStyle w:val="a9"/>
             <w:rFonts w:eastAsia="Times New Roman"/>
             <w:noProof/>
-            <w:highlight w:val="yellow"/>
             <w:lang w:eastAsia="ru-RU"/>
           </w:rPr>
           <w:t>6.</w:t>
@@ -4567,10 +4550,9 @@
             <w:rStyle w:val="a9"/>
             <w:rFonts w:eastAsia="Times New Roman"/>
             <w:noProof/>
-            <w:highlight w:val="yellow"/>
             <w:lang w:eastAsia="ru-RU"/>
           </w:rPr>
-          <w:t>Тестирование</w:t>
+          <w:t>Проектирование модуля «Интерфейс пользователя»</w:t>
         </w:r>
         <w:r>
           <w:rPr>
@@ -4591,7 +4573,7 @@
             <w:noProof/>
             <w:webHidden/>
           </w:rPr>
-          <w:instrText xml:space="preserve"> PAGEREF _Toc230096068 \h </w:instrText>
+          <w:instrText xml:space="preserve"> PAGEREF _Toc230102765 \h </w:instrText>
         </w:r>
         <w:r>
           <w:rPr>
@@ -4611,7 +4593,7 @@
             <w:noProof/>
             <w:webHidden/>
           </w:rPr>
-          <w:t>46</w:t>
+          <w:t>52</w:t>
         </w:r>
         <w:r>
           <w:rPr>
@@ -4635,7 +4617,7 @@
           <w:lang w:eastAsia="ru-RU"/>
         </w:rPr>
       </w:pPr>
-      <w:hyperlink w:anchor="_Toc230096069" w:history="1">
+      <w:hyperlink w:anchor="_Toc230102766" w:history="1">
         <w:r>
           <w:rPr>
             <w:rStyle w:val="a9"/>
@@ -4662,6 +4644,98 @@
             <w:highlight w:val="yellow"/>
             <w:lang w:eastAsia="ru-RU"/>
           </w:rPr>
+          <w:t>Тестирование</w:t>
+        </w:r>
+        <w:r>
+          <w:rPr>
+            <w:noProof/>
+            <w:webHidden/>
+          </w:rPr>
+          <w:tab/>
+        </w:r>
+        <w:r>
+          <w:rPr>
+            <w:noProof/>
+            <w:webHidden/>
+          </w:rPr>
+          <w:fldChar w:fldCharType="begin"/>
+        </w:r>
+        <w:r>
+          <w:rPr>
+            <w:noProof/>
+            <w:webHidden/>
+          </w:rPr>
+          <w:instrText xml:space="preserve"> PAGEREF _Toc230102766 \h </w:instrText>
+        </w:r>
+        <w:r>
+          <w:rPr>
+            <w:noProof/>
+            <w:webHidden/>
+          </w:rPr>
+        </w:r>
+        <w:r>
+          <w:rPr>
+            <w:noProof/>
+            <w:webHidden/>
+          </w:rPr>
+          <w:fldChar w:fldCharType="separate"/>
+        </w:r>
+        <w:r>
+          <w:rPr>
+            <w:noProof/>
+            <w:webHidden/>
+          </w:rPr>
+          <w:t>53</w:t>
+        </w:r>
+        <w:r>
+          <w:rPr>
+            <w:noProof/>
+            <w:webHidden/>
+          </w:rPr>
+          <w:fldChar w:fldCharType="end"/>
+        </w:r>
+      </w:hyperlink>
+    </w:p>
+    <w:p>
+      <w:pPr>
+        <w:pStyle w:val="11"/>
+        <w:tabs>
+          <w:tab w:val="left" w:pos="440"/>
+          <w:tab w:val="right" w:leader="dot" w:pos="9344"/>
+        </w:tabs>
+        <w:rPr>
+          <w:rFonts w:eastAsiaTheme="minorEastAsia"/>
+          <w:noProof/>
+          <w:lang w:eastAsia="ru-RU"/>
+        </w:rPr>
+      </w:pPr>
+      <w:hyperlink w:anchor="_Toc230102767" w:history="1">
+        <w:r>
+          <w:rPr>
+            <w:rStyle w:val="a9"/>
+            <w:rFonts w:eastAsia="Times New Roman"/>
+            <w:noProof/>
+            <w:highlight w:val="yellow"/>
+            <w:lang w:eastAsia="ru-RU"/>
+          </w:rPr>
+          <w:t>8.</w:t>
+        </w:r>
+        <w:r>
+          <w:rPr>
+            <w:rFonts w:eastAsiaTheme="minorEastAsia"/>
+            <w:noProof/>
+            <w:lang w:eastAsia="ru-RU"/>
+          </w:rPr>
+          <w:tab/>
+        </w:r>
+        <w:r>
+          <w:rPr>
+            <w:rStyle w:val="a9"/>
+            <w:rFonts w:eastAsia="Times New Roman"/>
+            <w:noProof/>
+            <w:highlight w:val="yellow"/>
+            <w:lang w:eastAsia="ru-RU"/>
+          </w:rPr>
           <w:t>Описание организации реализации проекта</w:t>
         </w:r>
         <w:r>
@@ -4683,7 +4757,7 @@
             <w:noProof/>
             <w:webHidden/>
           </w:rPr>
-          <w:instrText xml:space="preserve"> PAGEREF _Toc230096069 \h </w:instrText>
+          <w:instrText xml:space="preserve"> PAGEREF _Toc230102767 \h </w:instrText>
         </w:r>
         <w:r>
           <w:rPr>
@@ -4703,7 +4777,7 @@
             <w:noProof/>
             <w:webHidden/>
           </w:rPr>
-          <w:t>47</w:t>
+          <w:t>54</w:t>
         </w:r>
         <w:r>
           <w:rPr>
@@ -4726,7 +4800,7 @@
           <w:lang w:eastAsia="ru-RU"/>
         </w:rPr>
       </w:pPr>
-      <w:hyperlink w:anchor="_Toc230096070" w:history="1">
+      <w:hyperlink w:anchor="_Toc230102768" w:history="1">
         <w:r>
           <w:rPr>
             <w:rStyle w:val="a9"/>
@@ -4756,7 +4830,7 @@
             <w:noProof/>
             <w:webHidden/>
           </w:rPr>
-          <w:instrText xml:space="preserve"> PAGEREF _Toc230096070 \h </w:instrText>
+          <w:instrText xml:space="preserve"> PAGEREF _Toc230102768 \h </w:instrText>
         </w:r>
         <w:r>
           <w:rPr>
@@ -4776,7 +4850,7 @@
             <w:noProof/>
             <w:webHidden/>
           </w:rPr>
-          <w:t>48</w:t>
+          <w:t>55</w:t>
         </w:r>
         <w:r>
           <w:rPr>
@@ -4837,8 +4911,8 @@
           <w:lang w:eastAsia="ru-RU"/>
         </w:rPr>
       </w:pPr>
-      <w:bookmarkStart w:id="2" w:name="_Toc229829439"/>
-      <w:bookmarkStart w:id="3" w:name="_Toc230096030"/>
+      <w:bookmarkStart w:id="3" w:name="_Toc229829439"/>
+      <w:bookmarkStart w:id="4" w:name="_Toc230102727"/>
       <w:r>
         <w:rPr>
           <w:rFonts w:eastAsia="Times New Roman"/>
@@ -4847,8 +4921,8 @@
         <w:lastRenderedPageBreak/>
         <w:t>Введение</w:t>
       </w:r>
-      <w:bookmarkEnd w:id="2"/>
       <w:bookmarkEnd w:id="3"/>
+      <w:bookmarkEnd w:id="4"/>
     </w:p>
     <w:p>
       <w:pPr>
@@ -5749,8 +5823,8 @@
           <w:lang w:eastAsia="ru-RU"/>
         </w:rPr>
       </w:pPr>
-      <w:bookmarkStart w:id="4" w:name="_Toc229829440"/>
-      <w:bookmarkStart w:id="5" w:name="_Toc230096031"/>
+      <w:bookmarkStart w:id="5" w:name="_Toc229829440"/>
+      <w:bookmarkStart w:id="6" w:name="_Toc230102728"/>
       <w:r>
         <w:rPr>
           <w:rFonts w:eastAsia="Times New Roman"/>
@@ -5759,8 +5833,8 @@
         <w:lastRenderedPageBreak/>
         <w:t>Концепт проекта</w:t>
       </w:r>
-      <w:bookmarkEnd w:id="4"/>
       <w:bookmarkEnd w:id="5"/>
+      <w:bookmarkEnd w:id="6"/>
     </w:p>
     <w:p>
       <w:pPr>
@@ -5774,8 +5848,8 @@
           <w:lang w:eastAsia="ru-RU"/>
         </w:rPr>
       </w:pPr>
-      <w:bookmarkStart w:id="6" w:name="_Toc229829441"/>
-      <w:bookmarkStart w:id="7" w:name="_Toc230096032"/>
+      <w:bookmarkStart w:id="7" w:name="_Toc229829441"/>
+      <w:bookmarkStart w:id="8" w:name="_Toc230102729"/>
       <w:r>
         <w:rPr>
           <w:rFonts w:eastAsia="Times New Roman"/>
@@ -5783,8 +5857,8 @@
         </w:rPr>
         <w:t>Общее описание проекта</w:t>
       </w:r>
-      <w:bookmarkEnd w:id="6"/>
       <w:bookmarkEnd w:id="7"/>
+      <w:bookmarkEnd w:id="8"/>
     </w:p>
     <w:p>
       <w:pPr>
@@ -6473,8 +6547,8 @@
           <w:lang w:eastAsia="ru-RU"/>
         </w:rPr>
       </w:pPr>
-      <w:bookmarkStart w:id="8" w:name="_Toc229829442"/>
-      <w:bookmarkStart w:id="9" w:name="_Toc230096033"/>
+      <w:bookmarkStart w:id="9" w:name="_Toc229829442"/>
+      <w:bookmarkStart w:id="10" w:name="_Toc230102730"/>
       <w:r>
         <w:rPr>
           <w:rFonts w:eastAsia="Times New Roman"/>
@@ -6482,8 +6556,8 @@
         </w:rPr>
         <w:t>Техническое задание</w:t>
       </w:r>
-      <w:bookmarkEnd w:id="8"/>
       <w:bookmarkEnd w:id="9"/>
+      <w:bookmarkEnd w:id="10"/>
     </w:p>
     <w:p>
       <w:pPr>
@@ -19945,8 +20019,8 @@
           <w:lang w:eastAsia="ru-RU"/>
         </w:rPr>
       </w:pPr>
-      <w:bookmarkStart w:id="10" w:name="_Toc229829443"/>
-      <w:bookmarkStart w:id="11" w:name="_Toc230096034"/>
+      <w:bookmarkStart w:id="11" w:name="_Toc229829443"/>
+      <w:bookmarkStart w:id="12" w:name="_Toc230102731"/>
       <w:r>
         <w:rPr>
           <w:rFonts w:eastAsia="Times New Roman"/>
@@ -19956,8 +20030,8 @@
         <w:lastRenderedPageBreak/>
         <w:t>Описание основных модулей и распределение ролей</w:t>
       </w:r>
-      <w:bookmarkEnd w:id="10"/>
       <w:bookmarkEnd w:id="11"/>
+      <w:bookmarkEnd w:id="12"/>
     </w:p>
     <w:p>
       <w:pPr>
@@ -19994,8 +20068,8 @@
           <w:lang w:eastAsia="ru-RU"/>
         </w:rPr>
       </w:pPr>
-      <w:bookmarkStart w:id="12" w:name="_Toc229829444"/>
-      <w:bookmarkStart w:id="13" w:name="_Toc230096035"/>
+      <w:bookmarkStart w:id="13" w:name="_Toc229829444"/>
+      <w:bookmarkStart w:id="14" w:name="_Toc230102732"/>
       <w:r>
         <w:rPr>
           <w:rFonts w:eastAsia="Times New Roman"/>
@@ -20003,8 +20077,8 @@
         </w:rPr>
         <w:t>Модуль «Авторизация и регистрация»</w:t>
       </w:r>
-      <w:bookmarkEnd w:id="12"/>
       <w:bookmarkEnd w:id="13"/>
+      <w:bookmarkEnd w:id="14"/>
     </w:p>
     <w:p>
       <w:pPr>
@@ -20018,8 +20092,8 @@
           <w:lang w:eastAsia="ru-RU"/>
         </w:rPr>
       </w:pPr>
-      <w:bookmarkStart w:id="14" w:name="_Toc229829445"/>
-      <w:bookmarkStart w:id="15" w:name="_Toc230096036"/>
+      <w:bookmarkStart w:id="15" w:name="_Toc229829445"/>
+      <w:bookmarkStart w:id="16" w:name="_Toc230102733"/>
       <w:r>
         <w:rPr>
           <w:rFonts w:eastAsia="Times New Roman"/>
@@ -20027,8 +20101,8 @@
         </w:rPr>
         <w:t>Основное описание модуля</w:t>
       </w:r>
-      <w:bookmarkEnd w:id="14"/>
       <w:bookmarkEnd w:id="15"/>
+      <w:bookmarkEnd w:id="16"/>
     </w:p>
     <w:p>
       <w:pPr>
@@ -20414,8 +20488,8 @@
           <w:lang w:eastAsia="ru-RU"/>
         </w:rPr>
       </w:pPr>
-      <w:bookmarkStart w:id="16" w:name="_Toc229829446"/>
-      <w:bookmarkStart w:id="17" w:name="_Toc230096037"/>
+      <w:bookmarkStart w:id="17" w:name="_Toc229829446"/>
+      <w:bookmarkStart w:id="18" w:name="_Toc230102734"/>
       <w:r>
         <w:rPr>
           <w:rFonts w:eastAsia="Times New Roman"/>
@@ -20423,8 +20497,8 @@
         </w:rPr>
         <w:t>Распределение ролей членов команды</w:t>
       </w:r>
-      <w:bookmarkEnd w:id="16"/>
       <w:bookmarkEnd w:id="17"/>
+      <w:bookmarkEnd w:id="18"/>
     </w:p>
     <w:p>
       <w:pPr>
@@ -20593,8 +20667,8 @@
           <w:lang w:eastAsia="ru-RU"/>
         </w:rPr>
       </w:pPr>
-      <w:bookmarkStart w:id="18" w:name="_Toc229829447"/>
-      <w:bookmarkStart w:id="19" w:name="_Toc230096038"/>
+      <w:bookmarkStart w:id="19" w:name="_Toc229829447"/>
+      <w:bookmarkStart w:id="20" w:name="_Toc230102735"/>
       <w:r>
         <w:rPr>
           <w:rFonts w:eastAsia="Times New Roman"/>
@@ -20603,8 +20677,8 @@
         <w:lastRenderedPageBreak/>
         <w:t>Модуль «Интерфейс пользователя»</w:t>
       </w:r>
-      <w:bookmarkEnd w:id="18"/>
       <w:bookmarkEnd w:id="19"/>
+      <w:bookmarkEnd w:id="20"/>
     </w:p>
     <w:p>
       <w:pPr>
@@ -20618,8 +20692,8 @@
           <w:lang w:eastAsia="ru-RU"/>
         </w:rPr>
       </w:pPr>
-      <w:bookmarkStart w:id="20" w:name="_Toc229829448"/>
-      <w:bookmarkStart w:id="21" w:name="_Toc230096039"/>
+      <w:bookmarkStart w:id="21" w:name="_Toc229829448"/>
+      <w:bookmarkStart w:id="22" w:name="_Toc230102736"/>
       <w:r>
         <w:rPr>
           <w:rFonts w:eastAsia="Times New Roman"/>
@@ -20627,8 +20701,8 @@
         </w:rPr>
         <w:t>Основное описание модуля</w:t>
       </w:r>
-      <w:bookmarkEnd w:id="20"/>
       <w:bookmarkEnd w:id="21"/>
+      <w:bookmarkEnd w:id="22"/>
     </w:p>
     <w:p>
       <w:pPr>
@@ -21020,8 +21094,8 @@
           <w:lang w:eastAsia="ru-RU"/>
         </w:rPr>
       </w:pPr>
-      <w:bookmarkStart w:id="22" w:name="_Toc229829449"/>
-      <w:bookmarkStart w:id="23" w:name="_Toc230096040"/>
+      <w:bookmarkStart w:id="23" w:name="_Toc229829449"/>
+      <w:bookmarkStart w:id="24" w:name="_Toc230102737"/>
       <w:r>
         <w:rPr>
           <w:rFonts w:eastAsia="Times New Roman"/>
@@ -21029,8 +21103,8 @@
         </w:rPr>
         <w:t>Распределение ролей членов команды</w:t>
       </w:r>
-      <w:bookmarkEnd w:id="22"/>
       <w:bookmarkEnd w:id="23"/>
+      <w:bookmarkEnd w:id="24"/>
     </w:p>
     <w:p>
       <w:pPr>
@@ -21213,8 +21287,8 @@
           <w:lang w:eastAsia="ru-RU"/>
         </w:rPr>
       </w:pPr>
-      <w:bookmarkStart w:id="24" w:name="_Toc229829450"/>
-      <w:bookmarkStart w:id="25" w:name="_Toc230096041"/>
+      <w:bookmarkStart w:id="25" w:name="_Toc229829450"/>
+      <w:bookmarkStart w:id="26" w:name="_Toc230102738"/>
       <w:r>
         <w:rPr>
           <w:rFonts w:eastAsia="Times New Roman"/>
@@ -21223,8 +21297,8 @@
         <w:lastRenderedPageBreak/>
         <w:t>Модуль «Интерфейс администратора»</w:t>
       </w:r>
-      <w:bookmarkEnd w:id="24"/>
       <w:bookmarkEnd w:id="25"/>
+      <w:bookmarkEnd w:id="26"/>
     </w:p>
     <w:p>
       <w:pPr>
@@ -21238,8 +21312,8 @@
           <w:lang w:eastAsia="ru-RU"/>
         </w:rPr>
       </w:pPr>
-      <w:bookmarkStart w:id="26" w:name="_Toc229829451"/>
-      <w:bookmarkStart w:id="27" w:name="_Toc230096042"/>
+      <w:bookmarkStart w:id="27" w:name="_Toc229829451"/>
+      <w:bookmarkStart w:id="28" w:name="_Toc230102739"/>
       <w:r>
         <w:rPr>
           <w:rFonts w:eastAsia="Times New Roman"/>
@@ -21247,8 +21321,8 @@
         </w:rPr>
         <w:t>Основное описание модуля</w:t>
       </w:r>
-      <w:bookmarkEnd w:id="26"/>
       <w:bookmarkEnd w:id="27"/>
+      <w:bookmarkEnd w:id="28"/>
     </w:p>
     <w:p>
       <w:pPr>
@@ -21354,7 +21428,7 @@
           <w:lang w:eastAsia="ru-RU"/>
         </w:rPr>
       </w:pPr>
-      <w:bookmarkStart w:id="28" w:name="_Toc230096043"/>
+      <w:bookmarkStart w:id="29" w:name="_Toc230102740"/>
       <w:r>
         <w:rPr>
           <w:rFonts w:eastAsia="Times New Roman"/>
@@ -21362,7 +21436,7 @@
         </w:rPr>
         <w:t>Управление билетами и вопросами</w:t>
       </w:r>
-      <w:bookmarkEnd w:id="28"/>
+      <w:bookmarkEnd w:id="29"/>
     </w:p>
     <w:p>
       <w:pPr>
@@ -21454,7 +21528,7 @@
           <w:lang w:eastAsia="ru-RU"/>
         </w:rPr>
       </w:pPr>
-      <w:bookmarkStart w:id="29" w:name="_Toc230096044"/>
+      <w:bookmarkStart w:id="30" w:name="_Toc230102741"/>
       <w:r>
         <w:rPr>
           <w:rFonts w:eastAsia="Times New Roman"/>
@@ -21462,7 +21536,7 @@
         </w:rPr>
         <w:t>Импорт из CSV</w:t>
       </w:r>
-      <w:bookmarkEnd w:id="29"/>
+      <w:bookmarkEnd w:id="30"/>
     </w:p>
     <w:p>
       <w:pPr>
@@ -21745,7 +21819,7 @@
           <w:lang w:eastAsia="ru-RU"/>
         </w:rPr>
       </w:pPr>
-      <w:bookmarkStart w:id="30" w:name="_Toc230096045"/>
+      <w:bookmarkStart w:id="31" w:name="_Toc230102742"/>
       <w:r>
         <w:rPr>
           <w:rFonts w:eastAsia="Times New Roman"/>
@@ -21753,7 +21827,7 @@
         </w:rPr>
         <w:t>Управление пользователями (опционально)</w:t>
       </w:r>
-      <w:bookmarkEnd w:id="30"/>
+      <w:bookmarkEnd w:id="31"/>
     </w:p>
     <w:p>
       <w:pPr>
@@ -22053,8 +22127,8 @@
           <w:lang w:eastAsia="ru-RU"/>
         </w:rPr>
       </w:pPr>
-      <w:bookmarkStart w:id="31" w:name="_Toc229829452"/>
-      <w:bookmarkStart w:id="32" w:name="_Toc230096046"/>
+      <w:bookmarkStart w:id="32" w:name="_Toc229829452"/>
+      <w:bookmarkStart w:id="33" w:name="_Toc230102743"/>
       <w:r>
         <w:rPr>
           <w:rFonts w:eastAsia="Times New Roman"/>
@@ -22062,8 +22136,8 @@
         </w:rPr>
         <w:t>Распределение ролей членов команды</w:t>
       </w:r>
-      <w:bookmarkEnd w:id="31"/>
       <w:bookmarkEnd w:id="32"/>
+      <w:bookmarkEnd w:id="33"/>
     </w:p>
     <w:p>
       <w:pPr>
@@ -22246,8 +22320,8 @@
           <w:lang w:eastAsia="ru-RU"/>
         </w:rPr>
       </w:pPr>
-      <w:bookmarkStart w:id="33" w:name="_Toc229829453"/>
-      <w:bookmarkStart w:id="34" w:name="_Toc230096047"/>
+      <w:bookmarkStart w:id="34" w:name="_Toc229829453"/>
+      <w:bookmarkStart w:id="35" w:name="_Toc230102744"/>
       <w:r>
         <w:rPr>
           <w:rFonts w:eastAsia="Times New Roman"/>
@@ -22255,8 +22329,8 @@
         </w:rPr>
         <w:t>Модуль «Тестирование»</w:t>
       </w:r>
-      <w:bookmarkEnd w:id="33"/>
       <w:bookmarkEnd w:id="34"/>
+      <w:bookmarkEnd w:id="35"/>
     </w:p>
     <w:p>
       <w:pPr>
@@ -22270,7 +22344,7 @@
           <w:lang w:eastAsia="ru-RU"/>
         </w:rPr>
       </w:pPr>
-      <w:bookmarkStart w:id="35" w:name="_Toc230096048"/>
+      <w:bookmarkStart w:id="36" w:name="_Toc230102745"/>
       <w:r>
         <w:rPr>
           <w:rFonts w:eastAsia="Times New Roman"/>
@@ -22278,7 +22352,7 @@
         </w:rPr>
         <w:t>Основное описание модуля</w:t>
       </w:r>
-      <w:bookmarkEnd w:id="35"/>
+      <w:bookmarkEnd w:id="36"/>
     </w:p>
     <w:p>
       <w:pPr>
@@ -22370,8 +22444,8 @@
           <w:lang w:eastAsia="ru-RU"/>
         </w:rPr>
       </w:pPr>
-      <w:bookmarkStart w:id="36" w:name="_Toc229829454"/>
-      <w:bookmarkStart w:id="37" w:name="_Toc230096049"/>
+      <w:bookmarkStart w:id="37" w:name="_Toc229829454"/>
+      <w:bookmarkStart w:id="38" w:name="_Toc230102746"/>
       <w:r>
         <w:rPr>
           <w:rFonts w:eastAsia="Times New Roman"/>
@@ -22386,8 +22460,8 @@
         </w:rPr>
         <w:t>билета</w:t>
       </w:r>
-      <w:bookmarkEnd w:id="36"/>
       <w:bookmarkEnd w:id="37"/>
+      <w:bookmarkEnd w:id="38"/>
     </w:p>
     <w:p>
       <w:pPr>
@@ -22541,8 +22615,8 @@
           <w:lang w:eastAsia="ru-RU"/>
         </w:rPr>
       </w:pPr>
-      <w:bookmarkStart w:id="38" w:name="_Toc229829455"/>
-      <w:bookmarkStart w:id="39" w:name="_Toc230096050"/>
+      <w:bookmarkStart w:id="39" w:name="_Toc229829455"/>
+      <w:bookmarkStart w:id="40" w:name="_Toc230102747"/>
       <w:r>
         <w:rPr>
           <w:rFonts w:eastAsia="Times New Roman"/>
@@ -22550,8 +22624,8 @@
         </w:rPr>
         <w:t>Завершение теста и подсчёт результата</w:t>
       </w:r>
-      <w:bookmarkEnd w:id="38"/>
       <w:bookmarkEnd w:id="39"/>
+      <w:bookmarkEnd w:id="40"/>
     </w:p>
     <w:p>
       <w:pPr>
@@ -22739,8 +22813,8 @@
           <w:lang w:eastAsia="ru-RU"/>
         </w:rPr>
       </w:pPr>
-      <w:bookmarkStart w:id="40" w:name="_Toc229829456"/>
-      <w:bookmarkStart w:id="41" w:name="_Toc230096051"/>
+      <w:bookmarkStart w:id="41" w:name="_Toc229829456"/>
+      <w:bookmarkStart w:id="42" w:name="_Toc230102748"/>
       <w:r>
         <w:rPr>
           <w:rFonts w:eastAsia="Times New Roman"/>
@@ -22748,8 +22822,8 @@
         </w:rPr>
         <w:t>Детальный результат</w:t>
       </w:r>
-      <w:bookmarkEnd w:id="40"/>
       <w:bookmarkEnd w:id="41"/>
+      <w:bookmarkEnd w:id="42"/>
     </w:p>
     <w:p>
       <w:pPr>
@@ -22859,8 +22933,8 @@
           <w:lang w:eastAsia="ru-RU"/>
         </w:rPr>
       </w:pPr>
-      <w:bookmarkStart w:id="42" w:name="_Toc229829457"/>
-      <w:bookmarkStart w:id="43" w:name="_Toc230096052"/>
+      <w:bookmarkStart w:id="43" w:name="_Toc229829457"/>
+      <w:bookmarkStart w:id="44" w:name="_Toc230102749"/>
       <w:r>
         <w:rPr>
           <w:rFonts w:eastAsia="Times New Roman"/>
@@ -22868,8 +22942,8 @@
         </w:rPr>
         <w:t>Ограничения и защита</w:t>
       </w:r>
-      <w:bookmarkEnd w:id="42"/>
       <w:bookmarkEnd w:id="43"/>
+      <w:bookmarkEnd w:id="44"/>
     </w:p>
     <w:p>
       <w:pPr>
@@ -22935,7 +23009,7 @@
           <w:lang w:eastAsia="ru-RU"/>
         </w:rPr>
       </w:pPr>
-      <w:bookmarkStart w:id="44" w:name="_Toc230096053"/>
+      <w:bookmarkStart w:id="45" w:name="_Toc230102750"/>
       <w:r>
         <w:rPr>
           <w:rFonts w:eastAsia="Times New Roman"/>
@@ -22943,7 +23017,7 @@
         </w:rPr>
         <w:t>Распределение ролей членов команды</w:t>
       </w:r>
-      <w:bookmarkEnd w:id="44"/>
+      <w:bookmarkEnd w:id="45"/>
     </w:p>
     <w:p>
       <w:pPr>
@@ -23146,8 +23220,8 @@
           <w:lang w:eastAsia="ru-RU"/>
         </w:rPr>
       </w:pPr>
-      <w:bookmarkStart w:id="45" w:name="_Toc229829459"/>
-      <w:bookmarkStart w:id="46" w:name="_Toc230096054"/>
+      <w:bookmarkStart w:id="46" w:name="_Toc229829459"/>
+      <w:bookmarkStart w:id="47" w:name="_Toc230102751"/>
       <w:r>
         <w:rPr>
           <w:rFonts w:eastAsia="Times New Roman"/>
@@ -23156,8 +23230,8 @@
         <w:lastRenderedPageBreak/>
         <w:t>Создание плановой документации</w:t>
       </w:r>
-      <w:bookmarkEnd w:id="45"/>
       <w:bookmarkEnd w:id="46"/>
+      <w:bookmarkEnd w:id="47"/>
     </w:p>
     <w:p>
       <w:pPr>
@@ -23221,8 +23295,8 @@
           <w:lang w:eastAsia="ru-RU"/>
         </w:rPr>
       </w:pPr>
-      <w:bookmarkStart w:id="47" w:name="_Toc229829460"/>
-      <w:bookmarkStart w:id="48" w:name="_Toc230096055"/>
+      <w:bookmarkStart w:id="48" w:name="_Toc229829460"/>
+      <w:bookmarkStart w:id="49" w:name="_Toc230102752"/>
       <w:r>
         <w:rPr>
           <w:rFonts w:eastAsia="Times New Roman"/>
@@ -23230,8 +23304,8 @@
         </w:rPr>
         <w:t>Диаграмма Использования</w:t>
       </w:r>
-      <w:bookmarkEnd w:id="47"/>
       <w:bookmarkEnd w:id="48"/>
+      <w:bookmarkEnd w:id="49"/>
     </w:p>
     <w:p>
       <w:pPr>
@@ -24110,13 +24184,13 @@
           <w:numId w:val="10"/>
         </w:numPr>
       </w:pPr>
-      <w:bookmarkStart w:id="49" w:name="_Toc229829461"/>
-      <w:bookmarkStart w:id="50" w:name="_Toc230096056"/>
+      <w:bookmarkStart w:id="50" w:name="_Toc229829461"/>
+      <w:bookmarkStart w:id="51" w:name="_Toc230102753"/>
       <w:r>
         <w:t>Диаграмма классов</w:t>
       </w:r>
-      <w:bookmarkEnd w:id="49"/>
       <w:bookmarkEnd w:id="50"/>
+      <w:bookmarkEnd w:id="51"/>
     </w:p>
     <w:p>
       <w:pPr>
@@ -24155,13 +24229,13 @@
         </w:numPr>
         <w:ind w:left="1418"/>
       </w:pPr>
-      <w:bookmarkStart w:id="51" w:name="_Toc229829462"/>
-      <w:bookmarkStart w:id="52" w:name="_Toc230096057"/>
+      <w:bookmarkStart w:id="52" w:name="_Toc229829462"/>
+      <w:bookmarkStart w:id="53" w:name="_Toc230102754"/>
       <w:r>
         <w:t>Гость и ограниченный доступ</w:t>
       </w:r>
-      <w:bookmarkEnd w:id="51"/>
       <w:bookmarkEnd w:id="52"/>
+      <w:bookmarkEnd w:id="53"/>
     </w:p>
     <w:p>
       <w:pPr>
@@ -24209,13 +24283,13 @@
         </w:numPr>
         <w:ind w:left="1418"/>
       </w:pPr>
-      <w:bookmarkStart w:id="53" w:name="_Toc229829463"/>
-      <w:bookmarkStart w:id="54" w:name="_Toc230096058"/>
+      <w:bookmarkStart w:id="54" w:name="_Toc229829463"/>
+      <w:bookmarkStart w:id="55" w:name="_Toc230102755"/>
       <w:r>
         <w:t>Зарегистрированный пользователь: полный цикл тестирования</w:t>
       </w:r>
-      <w:bookmarkEnd w:id="53"/>
       <w:bookmarkEnd w:id="54"/>
+      <w:bookmarkEnd w:id="55"/>
     </w:p>
     <w:p>
       <w:pPr>
@@ -24614,13 +24688,13 @@
         </w:numPr>
         <w:ind w:left="1418"/>
       </w:pPr>
-      <w:bookmarkStart w:id="55" w:name="_Toc229829464"/>
-      <w:bookmarkStart w:id="56" w:name="_Toc230096059"/>
+      <w:bookmarkStart w:id="56" w:name="_Toc229829464"/>
+      <w:bookmarkStart w:id="57" w:name="_Toc230102756"/>
       <w:r>
         <w:t>Администратор: управление контентом</w:t>
       </w:r>
-      <w:bookmarkEnd w:id="55"/>
       <w:bookmarkEnd w:id="56"/>
+      <w:bookmarkEnd w:id="57"/>
     </w:p>
     <w:p>
       <w:pPr>
@@ -24855,13 +24929,13 @@
           <w:numId w:val="10"/>
         </w:numPr>
       </w:pPr>
-      <w:bookmarkStart w:id="57" w:name="_Toc229829465"/>
-      <w:bookmarkStart w:id="58" w:name="_Toc230096060"/>
+      <w:bookmarkStart w:id="58" w:name="_Toc229829465"/>
+      <w:bookmarkStart w:id="59" w:name="_Toc230102757"/>
       <w:r>
         <w:t>Связи между процессами</w:t>
       </w:r>
-      <w:bookmarkEnd w:id="57"/>
       <w:bookmarkEnd w:id="58"/>
+      <w:bookmarkEnd w:id="59"/>
     </w:p>
     <w:p>
       <w:pPr>
@@ -25100,13 +25174,13 @@
           <w:numId w:val="10"/>
         </w:numPr>
       </w:pPr>
-      <w:bookmarkStart w:id="59" w:name="_Toc229829466"/>
-      <w:bookmarkStart w:id="60" w:name="_Toc230096061"/>
+      <w:bookmarkStart w:id="60" w:name="_Toc229829466"/>
+      <w:bookmarkStart w:id="61" w:name="_Toc230102758"/>
       <w:r>
         <w:t>Диаграмма компонентов</w:t>
       </w:r>
-      <w:bookmarkEnd w:id="59"/>
       <w:bookmarkEnd w:id="60"/>
+      <w:bookmarkEnd w:id="61"/>
     </w:p>
     <w:p>
       <w:pPr>
@@ -25368,13 +25442,13 @@
           <w:numId w:val="10"/>
         </w:numPr>
       </w:pPr>
-      <w:bookmarkStart w:id="61" w:name="_Toc229829467"/>
-      <w:bookmarkStart w:id="62" w:name="_Toc230096062"/>
+      <w:bookmarkStart w:id="62" w:name="_Toc229829467"/>
+      <w:bookmarkStart w:id="63" w:name="_Toc230102759"/>
       <w:r>
         <w:t>Диаграмма развертывания</w:t>
       </w:r>
-      <w:bookmarkEnd w:id="61"/>
       <w:bookmarkEnd w:id="62"/>
+      <w:bookmarkEnd w:id="63"/>
     </w:p>
     <w:p>
       <w:pPr>
@@ -25413,13 +25487,13 @@
         </w:numPr>
         <w:ind w:left="1418"/>
       </w:pPr>
-      <w:bookmarkStart w:id="63" w:name="_Toc229829468"/>
-      <w:bookmarkStart w:id="64" w:name="_Toc230096063"/>
+      <w:bookmarkStart w:id="64" w:name="_Toc229829468"/>
+      <w:bookmarkStart w:id="65" w:name="_Toc230102760"/>
       <w:r>
         <w:t>Узлы и устройства</w:t>
       </w:r>
-      <w:bookmarkEnd w:id="63"/>
       <w:bookmarkEnd w:id="64"/>
+      <w:bookmarkEnd w:id="65"/>
     </w:p>
     <w:p>
       <w:pPr>
@@ -25628,16 +25702,16 @@
           <w:szCs w:val="24"/>
         </w:rPr>
       </w:pPr>
-      <w:bookmarkStart w:id="65" w:name="_Toc229829469"/>
-      <w:bookmarkStart w:id="66" w:name="_Toc230096064"/>
+      <w:bookmarkStart w:id="66" w:name="_Toc229829469"/>
+      <w:bookmarkStart w:id="67" w:name="_Toc230102761"/>
       <w:r>
         <w:rPr>
           <w:rStyle w:val="30"/>
         </w:rPr>
         <w:t>Сервисы, размещённые на серверном узле</w:t>
       </w:r>
-      <w:bookmarkEnd w:id="65"/>
       <w:bookmarkEnd w:id="66"/>
+      <w:bookmarkEnd w:id="67"/>
     </w:p>
     <w:p>
       <w:pPr>
@@ -25935,13 +26009,13 @@
           <w:numId w:val="10"/>
         </w:numPr>
       </w:pPr>
-      <w:bookmarkStart w:id="67" w:name="_Toc229829470"/>
-      <w:bookmarkStart w:id="68" w:name="_Toc230096065"/>
+      <w:bookmarkStart w:id="68" w:name="_Toc229829470"/>
+      <w:bookmarkStart w:id="69" w:name="_Toc230102762"/>
       <w:r>
         <w:t>Базы данных</w:t>
       </w:r>
-      <w:bookmarkEnd w:id="67"/>
       <w:bookmarkEnd w:id="68"/>
+      <w:bookmarkEnd w:id="69"/>
     </w:p>
     <w:p>
       <w:pPr>
@@ -26303,8 +26377,8 @@
           <w:lang w:eastAsia="ru-RU"/>
         </w:rPr>
       </w:pPr>
-      <w:bookmarkStart w:id="69" w:name="_Toc229829471"/>
-      <w:bookmarkStart w:id="70" w:name="_Toc230096066"/>
+      <w:bookmarkStart w:id="70" w:name="_Toc229829471"/>
+      <w:bookmarkStart w:id="71" w:name="_Toc230102763"/>
       <w:r>
         <w:rPr>
           <w:rFonts w:eastAsia="Times New Roman"/>
@@ -26322,8 +26396,8 @@
         </w:rPr>
         <w:t>.</w:t>
       </w:r>
-      <w:bookmarkEnd w:id="69"/>
       <w:bookmarkEnd w:id="70"/>
+      <w:bookmarkEnd w:id="71"/>
     </w:p>
     <w:p>
       <w:pPr>
@@ -26620,7 +26694,7 @@
           <w:lang w:eastAsia="ru-RU"/>
         </w:rPr>
       </w:pPr>
-      <w:bookmarkStart w:id="71" w:name="_Toc230096067"/>
+      <w:bookmarkStart w:id="72" w:name="_Toc230102764"/>
       <w:r>
         <w:rPr>
           <w:rFonts w:eastAsia="Times New Roman"/>
@@ -26629,7 +26703,7 @@
         <w:lastRenderedPageBreak/>
         <w:t>Проектирование системы авторизации / регистрации</w:t>
       </w:r>
-      <w:bookmarkEnd w:id="71"/>
+      <w:bookmarkEnd w:id="72"/>
     </w:p>
     <w:p>
       <w:pPr>
@@ -26652,6 +26726,172 @@
           <w:lang w:eastAsia="ru-RU"/>
         </w:rPr>
         <w:t>Для успешного создания модуля Авторизации и регистрации нашего сервиса была проанализирована деятельность в этом модуле и составлены 4 диаграммы для более эффективной разработки модуля.</w:t>
+      </w:r>
+    </w:p>
+    <w:p>
+      <w:pPr>
+        <w:spacing w:after="100" w:afterAutospacing="1" w:line="360" w:lineRule="auto"/>
+        <w:ind w:firstLine="709"/>
+        <w:contextualSpacing/>
+        <w:jc w:val="both"/>
+        <w:rPr>
+          <w:rFonts w:ascii="Times New Roman" w:eastAsia="Times New Roman" w:hAnsi="Times New Roman" w:cs="Times New Roman"/>
+          <w:sz w:val="28"/>
+          <w:szCs w:val="28"/>
+          <w:lang w:eastAsia="ru-RU"/>
+        </w:rPr>
+      </w:pPr>
+      <w:r>
+        <w:rPr>
+          <w:rFonts w:ascii="Times New Roman" w:eastAsia="Times New Roman" w:hAnsi="Times New Roman" w:cs="Times New Roman"/>
+          <w:sz w:val="28"/>
+          <w:szCs w:val="28"/>
+          <w:lang w:eastAsia="ru-RU"/>
+        </w:rPr>
+        <w:t>Описание для диаграммы деятельности:</w:t>
+      </w:r>
+    </w:p>
+    <w:p>
+      <w:pPr>
+        <w:spacing w:after="100" w:afterAutospacing="1" w:line="360" w:lineRule="auto"/>
+        <w:ind w:firstLine="709"/>
+        <w:contextualSpacing/>
+        <w:jc w:val="both"/>
+        <w:rPr>
+          <w:rFonts w:ascii="Times New Roman" w:eastAsia="Times New Roman" w:hAnsi="Times New Roman" w:cs="Times New Roman"/>
+          <w:sz w:val="28"/>
+          <w:szCs w:val="28"/>
+          <w:lang w:eastAsia="ru-RU"/>
+        </w:rPr>
+      </w:pPr>
+      <w:r>
+        <w:rPr>
+          <w:rFonts w:ascii="Times New Roman" w:eastAsia="Times New Roman" w:hAnsi="Times New Roman" w:cs="Times New Roman"/>
+          <w:sz w:val="28"/>
+          <w:szCs w:val="28"/>
+          <w:lang w:eastAsia="ru-RU"/>
+        </w:rPr>
+        <w:t>Как проходит процесс:</w:t>
+      </w:r>
+    </w:p>
+    <w:p>
+      <w:pPr>
+        <w:spacing w:after="100" w:afterAutospacing="1" w:line="360" w:lineRule="auto"/>
+        <w:ind w:firstLine="709"/>
+        <w:contextualSpacing/>
+        <w:jc w:val="both"/>
+        <w:rPr>
+          <w:rFonts w:ascii="Times New Roman" w:eastAsia="Times New Roman" w:hAnsi="Times New Roman" w:cs="Times New Roman"/>
+          <w:sz w:val="28"/>
+          <w:szCs w:val="28"/>
+          <w:lang w:eastAsia="ru-RU"/>
+        </w:rPr>
+      </w:pPr>
+      <w:r>
+        <w:rPr>
+          <w:rFonts w:ascii="Times New Roman" w:eastAsia="Times New Roman" w:hAnsi="Times New Roman" w:cs="Times New Roman"/>
+          <w:sz w:val="28"/>
+          <w:szCs w:val="28"/>
+          <w:lang w:eastAsia="ru-RU"/>
+        </w:rPr>
+        <w:t>Начальной точкой процесса является запуск пользователем приложения и переход на экран входа/регистрации. Пользователь делает выбор между двумя действиями:</w:t>
+      </w:r>
+      <w:r>
+        <w:rPr>
+          <w:rFonts w:ascii="Times New Roman" w:eastAsia="Times New Roman" w:hAnsi="Times New Roman" w:cs="Times New Roman"/>
+          <w:sz w:val="28"/>
+          <w:szCs w:val="28"/>
+          <w:lang w:eastAsia="ru-RU"/>
+        </w:rPr>
+        <w:t xml:space="preserve"> авторизацией или регистрацией.</w:t>
+      </w:r>
+    </w:p>
+    <w:p>
+      <w:pPr>
+        <w:spacing w:after="100" w:afterAutospacing="1" w:line="360" w:lineRule="auto"/>
+        <w:ind w:firstLine="709"/>
+        <w:contextualSpacing/>
+        <w:jc w:val="both"/>
+        <w:rPr>
+          <w:rFonts w:ascii="Times New Roman" w:eastAsia="Times New Roman" w:hAnsi="Times New Roman" w:cs="Times New Roman"/>
+          <w:sz w:val="28"/>
+          <w:szCs w:val="28"/>
+          <w:lang w:eastAsia="ru-RU"/>
+        </w:rPr>
+      </w:pPr>
+      <w:r>
+        <w:rPr>
+          <w:rFonts w:ascii="Times New Roman" w:eastAsia="Times New Roman" w:hAnsi="Times New Roman" w:cs="Times New Roman"/>
+          <w:sz w:val="28"/>
+          <w:szCs w:val="28"/>
+          <w:lang w:eastAsia="ru-RU"/>
+        </w:rPr>
+        <w:t>Если выбрана регистрация, пользователь вводит свои данные: имя, отчество, фамилию, дату рождения, логин, пароль и почту, после чего нажимает кнопку «Подтвердить». Устройство выполняет проверку соответствия пароля правилам (длина не менее 8 символов, наличие заглавных и строчных букв, цифр, специальных символов). В случае если пароль не соответствует правилам, устройство выводит сообщение об ошибке прохождения проверки, и пользователь возвращается к вводу данных. Если проверка пройдена успешно, устройство передаёт данные на сервер, и сервер вносит данные нового пользователя в базу данных. После успешного создания аккаунта устройство выводит сообщение об успешности регистрации, и пользователь пе</w:t>
+      </w:r>
+      <w:r>
+        <w:rPr>
+          <w:rFonts w:ascii="Times New Roman" w:eastAsia="Times New Roman" w:hAnsi="Times New Roman" w:cs="Times New Roman"/>
+          <w:sz w:val="28"/>
+          <w:szCs w:val="28"/>
+          <w:lang w:eastAsia="ru-RU"/>
+        </w:rPr>
+        <w:t>реходит к сценарию авторизации.</w:t>
+      </w:r>
+    </w:p>
+    <w:p>
+      <w:pPr>
+        <w:spacing w:after="100" w:afterAutospacing="1" w:line="360" w:lineRule="auto"/>
+        <w:ind w:firstLine="709"/>
+        <w:contextualSpacing/>
+        <w:jc w:val="both"/>
+        <w:rPr>
+          <w:rFonts w:ascii="Times New Roman" w:eastAsia="Times New Roman" w:hAnsi="Times New Roman" w:cs="Times New Roman"/>
+          <w:sz w:val="28"/>
+          <w:szCs w:val="28"/>
+          <w:lang w:eastAsia="ru-RU"/>
+        </w:rPr>
+      </w:pPr>
+      <w:r>
+        <w:rPr>
+          <w:rFonts w:ascii="Times New Roman" w:eastAsia="Times New Roman" w:hAnsi="Times New Roman" w:cs="Times New Roman"/>
+          <w:sz w:val="28"/>
+          <w:szCs w:val="28"/>
+          <w:lang w:eastAsia="ru-RU"/>
+        </w:rPr>
+        <w:t xml:space="preserve">Если выбрана авторизация, пользователь вводит логин и пароль, после чего нажимает кнопку «Подтвердить вход». Устройство передаёт введённые данные на сервер. Сервер выполняет проверку наличия аккаунта в базе данных и сверку введённых данных для входа. В случае если аккаунт не был найден в базе данных или данные для входа не совпали, сервер формирует ответ об ошибке, устройство выводит сообщение об ошибке, и пользователь возвращается к вводу логина и пароля. Если аккаунт найден в базе данных и данные для входа совпали, сервер подтверждает успешную авторизацию, и </w:t>
+      </w:r>
+      <w:r>
+        <w:rPr>
+          <w:rFonts w:ascii="Times New Roman" w:eastAsia="Times New Roman" w:hAnsi="Times New Roman" w:cs="Times New Roman"/>
+          <w:sz w:val="28"/>
+          <w:szCs w:val="28"/>
+          <w:lang w:eastAsia="ru-RU"/>
+        </w:rPr>
+        <w:lastRenderedPageBreak/>
+        <w:t>устройство выводит данные сервиса (личный кабинет, доступные тесты, статистику).</w:t>
+      </w:r>
+    </w:p>
+    <w:p>
+      <w:pPr>
+        <w:spacing w:after="100" w:afterAutospacing="1" w:line="360" w:lineRule="auto"/>
+        <w:ind w:firstLine="709"/>
+        <w:contextualSpacing/>
+        <w:jc w:val="both"/>
+        <w:rPr>
+          <w:rFonts w:ascii="Times New Roman" w:eastAsia="Times New Roman" w:hAnsi="Times New Roman" w:cs="Times New Roman"/>
+          <w:sz w:val="28"/>
+          <w:szCs w:val="28"/>
+          <w:lang w:eastAsia="ru-RU"/>
+        </w:rPr>
+      </w:pPr>
+      <w:r>
+        <w:rPr>
+          <w:rFonts w:ascii="Times New Roman" w:eastAsia="Times New Roman" w:hAnsi="Times New Roman" w:cs="Times New Roman"/>
+          <w:sz w:val="28"/>
+          <w:szCs w:val="28"/>
+          <w:lang w:eastAsia="ru-RU"/>
+        </w:rPr>
+        <w:t>Завершающей точкой диаграммы является окончание процесса авторизации/регистрации. При успешной авторизации пользователь получает доступ к основному функционалу системы. При возникновении ошибки пользователь остаётся на форме входа/регистрации и может повторить попытку ввода данных.</w:t>
       </w:r>
     </w:p>
     <w:p>
@@ -26747,6 +26987,195 @@
           <w:lang w:eastAsia="ru-RU"/>
         </w:rPr>
       </w:pPr>
+      <w:r>
+        <w:rPr>
+          <w:rFonts w:ascii="Times New Roman" w:eastAsia="Times New Roman" w:hAnsi="Times New Roman" w:cs="Times New Roman"/>
+          <w:sz w:val="28"/>
+          <w:szCs w:val="28"/>
+          <w:lang w:eastAsia="ru-RU"/>
+        </w:rPr>
+        <w:t>Описание диаграммы последовательности:</w:t>
+      </w:r>
+    </w:p>
+    <w:p>
+      <w:pPr>
+        <w:spacing w:after="100" w:afterAutospacing="1" w:line="360" w:lineRule="auto"/>
+        <w:ind w:firstLine="709"/>
+        <w:contextualSpacing/>
+        <w:jc w:val="both"/>
+        <w:rPr>
+          <w:rFonts w:ascii="Times New Roman" w:eastAsia="Times New Roman" w:hAnsi="Times New Roman" w:cs="Times New Roman"/>
+          <w:sz w:val="28"/>
+          <w:szCs w:val="28"/>
+          <w:lang w:eastAsia="ru-RU"/>
+        </w:rPr>
+      </w:pPr>
+      <w:r>
+        <w:rPr>
+          <w:rFonts w:ascii="Times New Roman" w:eastAsia="Times New Roman" w:hAnsi="Times New Roman" w:cs="Times New Roman"/>
+          <w:sz w:val="28"/>
+          <w:szCs w:val="28"/>
+          <w:lang w:eastAsia="ru-RU"/>
+        </w:rPr>
+        <w:t>Всего три дорожки:</w:t>
+      </w:r>
+    </w:p>
+    <w:p>
+      <w:pPr>
+        <w:spacing w:after="100" w:afterAutospacing="1" w:line="360" w:lineRule="auto"/>
+        <w:ind w:firstLine="709"/>
+        <w:contextualSpacing/>
+        <w:jc w:val="both"/>
+        <w:rPr>
+          <w:rFonts w:ascii="Times New Roman" w:eastAsia="Times New Roman" w:hAnsi="Times New Roman" w:cs="Times New Roman"/>
+          <w:sz w:val="28"/>
+          <w:szCs w:val="28"/>
+          <w:lang w:eastAsia="ru-RU"/>
+        </w:rPr>
+      </w:pPr>
+      <w:r>
+        <w:rPr>
+          <w:rFonts w:ascii="Times New Roman" w:eastAsia="Times New Roman" w:hAnsi="Times New Roman" w:cs="Times New Roman"/>
+          <w:sz w:val="28"/>
+          <w:szCs w:val="28"/>
+          <w:lang w:eastAsia="ru-RU"/>
+        </w:rPr>
+        <w:t>Пользователь – описывает действия пользователя при взаимодействии с интерфейсом системы. Пользователь вводит регистрационные данные, подтверждает регистрацию, а затем в</w:t>
+      </w:r>
+      <w:r>
+        <w:rPr>
+          <w:rFonts w:ascii="Times New Roman" w:eastAsia="Times New Roman" w:hAnsi="Times New Roman" w:cs="Times New Roman"/>
+          <w:sz w:val="28"/>
+          <w:szCs w:val="28"/>
+          <w:lang w:eastAsia="ru-RU"/>
+        </w:rPr>
+        <w:t>водит логин и пароль для входа.</w:t>
+      </w:r>
+    </w:p>
+    <w:p>
+      <w:pPr>
+        <w:spacing w:after="100" w:afterAutospacing="1" w:line="360" w:lineRule="auto"/>
+        <w:ind w:firstLine="709"/>
+        <w:contextualSpacing/>
+        <w:jc w:val="both"/>
+        <w:rPr>
+          <w:rFonts w:ascii="Times New Roman" w:eastAsia="Times New Roman" w:hAnsi="Times New Roman" w:cs="Times New Roman"/>
+          <w:sz w:val="28"/>
+          <w:szCs w:val="28"/>
+          <w:lang w:eastAsia="ru-RU"/>
+        </w:rPr>
+      </w:pPr>
+      <w:r>
+        <w:rPr>
+          <w:rFonts w:ascii="Times New Roman" w:eastAsia="Times New Roman" w:hAnsi="Times New Roman" w:cs="Times New Roman"/>
+          <w:sz w:val="28"/>
+          <w:szCs w:val="28"/>
+          <w:lang w:eastAsia="ru-RU"/>
+        </w:rPr>
+        <w:t>Интерфейс системы – отражает визуальную логику работы приложения. Интерфейс отображает формы ввода, выводит сообщения об ошибках или успешной регистрации, а также передаёт данн</w:t>
+      </w:r>
+      <w:r>
+        <w:rPr>
+          <w:rFonts w:ascii="Times New Roman" w:eastAsia="Times New Roman" w:hAnsi="Times New Roman" w:cs="Times New Roman"/>
+          <w:sz w:val="28"/>
+          <w:szCs w:val="28"/>
+          <w:lang w:eastAsia="ru-RU"/>
+        </w:rPr>
+        <w:t>ые на сервер и получает ответы.</w:t>
+      </w:r>
+    </w:p>
+    <w:p>
+      <w:pPr>
+        <w:spacing w:after="100" w:afterAutospacing="1" w:line="360" w:lineRule="auto"/>
+        <w:ind w:firstLine="709"/>
+        <w:contextualSpacing/>
+        <w:jc w:val="both"/>
+        <w:rPr>
+          <w:rFonts w:ascii="Times New Roman" w:eastAsia="Times New Roman" w:hAnsi="Times New Roman" w:cs="Times New Roman"/>
+          <w:sz w:val="28"/>
+          <w:szCs w:val="28"/>
+          <w:lang w:eastAsia="ru-RU"/>
+        </w:rPr>
+      </w:pPr>
+      <w:r>
+        <w:rPr>
+          <w:rFonts w:ascii="Times New Roman" w:eastAsia="Times New Roman" w:hAnsi="Times New Roman" w:cs="Times New Roman"/>
+          <w:sz w:val="28"/>
+          <w:szCs w:val="28"/>
+          <w:lang w:eastAsia="ru-RU"/>
+        </w:rPr>
+        <w:t xml:space="preserve">Сервер БД – используется для хранения учётных записей пользователей и выполняет внутреннюю логику системы: проверку существования </w:t>
+      </w:r>
+      <w:r>
+        <w:rPr>
+          <w:rFonts w:ascii="Times New Roman" w:eastAsia="Times New Roman" w:hAnsi="Times New Roman" w:cs="Times New Roman"/>
+          <w:sz w:val="28"/>
+          <w:szCs w:val="28"/>
+          <w:lang w:eastAsia="ru-RU"/>
+        </w:rPr>
+        <w:lastRenderedPageBreak/>
+        <w:t>пользователя, проверку корректности данных, проверку наличия аккаунта при входе.</w:t>
+      </w:r>
+    </w:p>
+    <w:p>
+      <w:pPr>
+        <w:spacing w:after="100" w:afterAutospacing="1" w:line="360" w:lineRule="auto"/>
+        <w:ind w:firstLine="709"/>
+        <w:contextualSpacing/>
+        <w:jc w:val="both"/>
+        <w:rPr>
+          <w:rFonts w:ascii="Times New Roman" w:eastAsia="Times New Roman" w:hAnsi="Times New Roman" w:cs="Times New Roman"/>
+          <w:sz w:val="28"/>
+          <w:szCs w:val="28"/>
+          <w:lang w:eastAsia="ru-RU"/>
+        </w:rPr>
+      </w:pPr>
+      <w:r>
+        <w:rPr>
+          <w:rFonts w:ascii="Times New Roman" w:eastAsia="Times New Roman" w:hAnsi="Times New Roman" w:cs="Times New Roman"/>
+          <w:sz w:val="28"/>
+          <w:szCs w:val="28"/>
+          <w:lang w:eastAsia="ru-RU"/>
+        </w:rPr>
+        <w:t>Описание:</w:t>
+      </w:r>
+    </w:p>
+    <w:p>
+      <w:pPr>
+        <w:spacing w:after="100" w:afterAutospacing="1" w:line="360" w:lineRule="auto"/>
+        <w:ind w:firstLine="709"/>
+        <w:contextualSpacing/>
+        <w:jc w:val="both"/>
+        <w:rPr>
+          <w:rFonts w:ascii="Times New Roman" w:eastAsia="Times New Roman" w:hAnsi="Times New Roman" w:cs="Times New Roman"/>
+          <w:sz w:val="28"/>
+          <w:szCs w:val="28"/>
+          <w:lang w:eastAsia="ru-RU"/>
+        </w:rPr>
+      </w:pPr>
+      <w:r>
+        <w:rPr>
+          <w:rFonts w:ascii="Times New Roman" w:eastAsia="Times New Roman" w:hAnsi="Times New Roman" w:cs="Times New Roman"/>
+          <w:sz w:val="28"/>
+          <w:szCs w:val="28"/>
+          <w:lang w:eastAsia="ru-RU"/>
+        </w:rPr>
+        <w:t>Пользователь выбирает режим регистрации и вводит свои данные: фамилию, имя, отчество, дату рождения, почту, логин и пароль. После заполнения всех полей пользователь нажимает кнопку «Подтвердить регистрацию». Интерфейс системы передаёт введённые данные на Сервер БД. Сервер БД выполняет проверку существования пользователя и проверку корректности введённых данных. Если пользователь уже существует или данные для регистрации не верны, сервер возвращает ошибку, и интерфейс выводит сообщение об ошибке. Если проверка прошла успешно, сервер регистрирует нового пользователя. Интерфейс выводит сообщение об успешной регистрации, после чего автоматически отображает окно авторизации. Пользователь вводит логин и пароль и нажимает «Подтвердить вход». Интерфейс передаёт данные на Сервер БД для проверки существования аккаунта. Если аккаунт не существует, сервер возвращает ошибку входа, и интерфейс выводит соответствующее сообщение. Если аккаунт найден и данные для входа совпали, сервер подтверждает успешный вход, и интерфейс отображает данные сервиса (личный кабинет, доступные тесты, статистику). Завершающей точкой диаграммы является отображение данных сервиса пользователю при успешной авторизации либо вывод сообщения об ошибке при неудаче.</w:t>
+      </w:r>
+    </w:p>
+    <w:p>
+      <w:pPr>
+        <w:spacing w:after="100" w:afterAutospacing="1" w:line="360" w:lineRule="auto"/>
+        <w:ind w:firstLine="709"/>
+        <w:contextualSpacing/>
+        <w:jc w:val="both"/>
+        <w:rPr>
+          <w:rFonts w:ascii="Times New Roman" w:eastAsia="Times New Roman" w:hAnsi="Times New Roman" w:cs="Times New Roman"/>
+          <w:sz w:val="28"/>
+          <w:szCs w:val="28"/>
+          <w:lang w:eastAsia="ru-RU"/>
+        </w:rPr>
+      </w:pPr>
     </w:p>
     <w:p>
       <w:pPr>
@@ -26764,6 +27193,7 @@
       <w:r>
         <w:rPr>
           <w:rFonts w:ascii="Times New Roman" w:eastAsia="Times New Roman" w:hAnsi="Times New Roman" w:cs="Times New Roman"/>
+          <w:noProof/>
           <w:sz w:val="28"/>
           <w:szCs w:val="28"/>
           <w:lang w:eastAsia="ru-RU"/>
@@ -26848,6 +27278,273 @@
         <w:spacing w:after="100" w:afterAutospacing="1" w:line="360" w:lineRule="auto"/>
         <w:ind w:firstLine="709"/>
         <w:contextualSpacing/>
+        <w:jc w:val="both"/>
+        <w:rPr>
+          <w:rFonts w:ascii="Times New Roman" w:eastAsia="Times New Roman" w:hAnsi="Times New Roman" w:cs="Times New Roman"/>
+          <w:sz w:val="28"/>
+          <w:szCs w:val="28"/>
+          <w:lang w:eastAsia="ru-RU"/>
+        </w:rPr>
+      </w:pPr>
+    </w:p>
+    <w:p>
+      <w:pPr>
+        <w:spacing w:after="100" w:afterAutospacing="1" w:line="360" w:lineRule="auto"/>
+        <w:ind w:firstLine="709"/>
+        <w:contextualSpacing/>
+        <w:jc w:val="both"/>
+        <w:rPr>
+          <w:rFonts w:ascii="Times New Roman" w:eastAsia="Times New Roman" w:hAnsi="Times New Roman" w:cs="Times New Roman"/>
+          <w:sz w:val="28"/>
+          <w:szCs w:val="28"/>
+          <w:lang w:eastAsia="ru-RU"/>
+        </w:rPr>
+      </w:pPr>
+      <w:r>
+        <w:rPr>
+          <w:rFonts w:ascii="Times New Roman" w:eastAsia="Times New Roman" w:hAnsi="Times New Roman" w:cs="Times New Roman"/>
+          <w:sz w:val="28"/>
+          <w:szCs w:val="28"/>
+          <w:lang w:eastAsia="ru-RU"/>
+        </w:rPr>
+        <w:lastRenderedPageBreak/>
+        <w:t>Описание для диаграммы коммуникации:</w:t>
+      </w:r>
+    </w:p>
+    <w:p>
+      <w:pPr>
+        <w:spacing w:after="100" w:afterAutospacing="1" w:line="360" w:lineRule="auto"/>
+        <w:ind w:firstLine="709"/>
+        <w:contextualSpacing/>
+        <w:jc w:val="both"/>
+        <w:rPr>
+          <w:rFonts w:ascii="Times New Roman" w:eastAsia="Times New Roman" w:hAnsi="Times New Roman" w:cs="Times New Roman"/>
+          <w:sz w:val="28"/>
+          <w:szCs w:val="28"/>
+          <w:lang w:eastAsia="ru-RU"/>
+        </w:rPr>
+      </w:pPr>
+      <w:r>
+        <w:rPr>
+          <w:rFonts w:ascii="Times New Roman" w:eastAsia="Times New Roman" w:hAnsi="Times New Roman" w:cs="Times New Roman"/>
+          <w:sz w:val="28"/>
+          <w:szCs w:val="28"/>
+          <w:lang w:eastAsia="ru-RU"/>
+        </w:rPr>
+        <w:t>Пользователь – внешний актёр, который инициирует все действия. В автоматизации его роль заключается в выборе режима (авторизация или регистрация), вводе учётных д</w:t>
+      </w:r>
+      <w:r>
+        <w:rPr>
+          <w:rFonts w:ascii="Times New Roman" w:eastAsia="Times New Roman" w:hAnsi="Times New Roman" w:cs="Times New Roman"/>
+          <w:sz w:val="28"/>
+          <w:szCs w:val="28"/>
+          <w:lang w:eastAsia="ru-RU"/>
+        </w:rPr>
+        <w:t>анных и подтверждении действий.</w:t>
+      </w:r>
+    </w:p>
+    <w:p>
+      <w:pPr>
+        <w:spacing w:after="100" w:afterAutospacing="1" w:line="360" w:lineRule="auto"/>
+        <w:ind w:firstLine="709"/>
+        <w:contextualSpacing/>
+        <w:jc w:val="both"/>
+        <w:rPr>
+          <w:rFonts w:ascii="Times New Roman" w:eastAsia="Times New Roman" w:hAnsi="Times New Roman" w:cs="Times New Roman"/>
+          <w:sz w:val="28"/>
+          <w:szCs w:val="28"/>
+          <w:lang w:eastAsia="ru-RU"/>
+        </w:rPr>
+      </w:pPr>
+      <w:r>
+        <w:rPr>
+          <w:rFonts w:ascii="Times New Roman" w:eastAsia="Times New Roman" w:hAnsi="Times New Roman" w:cs="Times New Roman"/>
+          <w:sz w:val="28"/>
+          <w:szCs w:val="28"/>
+          <w:lang w:eastAsia="ru-RU"/>
+        </w:rPr>
+        <w:t>Интерфейс сервиса – клиентская часть визуального отображения форм ввода (регистрации и авторизации), сообщений об ошибках и данных сервиса. Важно, что интерфейс сам не проверяет данные и не принимает решения — он только посредник между пользователем и серв</w:t>
+      </w:r>
+      <w:r>
+        <w:rPr>
+          <w:rFonts w:ascii="Times New Roman" w:eastAsia="Times New Roman" w:hAnsi="Times New Roman" w:cs="Times New Roman"/>
+          <w:sz w:val="28"/>
+          <w:szCs w:val="28"/>
+          <w:lang w:eastAsia="ru-RU"/>
+        </w:rPr>
+        <w:t>ерной логикой.</w:t>
+      </w:r>
+    </w:p>
+    <w:p>
+      <w:pPr>
+        <w:spacing w:after="100" w:afterAutospacing="1" w:line="360" w:lineRule="auto"/>
+        <w:ind w:firstLine="709"/>
+        <w:contextualSpacing/>
+        <w:jc w:val="both"/>
+        <w:rPr>
+          <w:rFonts w:ascii="Times New Roman" w:eastAsia="Times New Roman" w:hAnsi="Times New Roman" w:cs="Times New Roman"/>
+          <w:sz w:val="28"/>
+          <w:szCs w:val="28"/>
+          <w:lang w:eastAsia="ru-RU"/>
+        </w:rPr>
+      </w:pPr>
+      <w:r>
+        <w:rPr>
+          <w:rFonts w:ascii="Times New Roman" w:eastAsia="Times New Roman" w:hAnsi="Times New Roman" w:cs="Times New Roman"/>
+          <w:sz w:val="28"/>
+          <w:szCs w:val="28"/>
+          <w:lang w:eastAsia="ru-RU"/>
+        </w:rPr>
+        <w:t>Сервис регистрации/авторизации – это главный управляющий компонент на серверной стороне. Именно он реализует всю бизнес-логику проверки учётных данных. Сервис проверяет существование пользователя при регистрации, корректность введённых данных, а при авторизации сверяет логин и пароль с данными в базе.</w:t>
+      </w:r>
+    </w:p>
+    <w:p>
+      <w:pPr>
+        <w:spacing w:after="100" w:afterAutospacing="1" w:line="360" w:lineRule="auto"/>
+        <w:ind w:firstLine="709"/>
+        <w:contextualSpacing/>
+        <w:jc w:val="both"/>
+        <w:rPr>
+          <w:rFonts w:ascii="Times New Roman" w:eastAsia="Times New Roman" w:hAnsi="Times New Roman" w:cs="Times New Roman"/>
+          <w:sz w:val="28"/>
+          <w:szCs w:val="28"/>
+          <w:lang w:eastAsia="ru-RU"/>
+        </w:rPr>
+      </w:pPr>
+      <w:r>
+        <w:rPr>
+          <w:rFonts w:ascii="Times New Roman" w:eastAsia="Times New Roman" w:hAnsi="Times New Roman" w:cs="Times New Roman"/>
+          <w:sz w:val="28"/>
+          <w:szCs w:val="28"/>
+          <w:lang w:eastAsia="ru-RU"/>
+        </w:rPr>
+        <w:t>База данных контента – это хранилище всех учётных записей пользователей. База данных — пассивный участник. Она ничего не инициирует сама, а только возвращает данные по запросу сервиса регистра</w:t>
+      </w:r>
+      <w:r>
+        <w:rPr>
+          <w:rFonts w:ascii="Times New Roman" w:eastAsia="Times New Roman" w:hAnsi="Times New Roman" w:cs="Times New Roman"/>
+          <w:sz w:val="28"/>
+          <w:szCs w:val="28"/>
+          <w:lang w:eastAsia="ru-RU"/>
+        </w:rPr>
+        <w:t>ции/авторизации.</w:t>
+      </w:r>
+    </w:p>
+    <w:p>
+      <w:pPr>
+        <w:spacing w:after="100" w:afterAutospacing="1" w:line="360" w:lineRule="auto"/>
+        <w:ind w:firstLine="709"/>
+        <w:contextualSpacing/>
+        <w:jc w:val="both"/>
+        <w:rPr>
+          <w:rFonts w:ascii="Times New Roman" w:eastAsia="Times New Roman" w:hAnsi="Times New Roman" w:cs="Times New Roman"/>
+          <w:sz w:val="28"/>
+          <w:szCs w:val="28"/>
+          <w:lang w:eastAsia="ru-RU"/>
+        </w:rPr>
+      </w:pPr>
+      <w:r>
+        <w:rPr>
+          <w:rFonts w:ascii="Times New Roman" w:eastAsia="Times New Roman" w:hAnsi="Times New Roman" w:cs="Times New Roman"/>
+          <w:sz w:val="28"/>
+          <w:szCs w:val="28"/>
+          <w:lang w:eastAsia="ru-RU"/>
+        </w:rPr>
+        <w:t>Описание:</w:t>
+      </w:r>
+    </w:p>
+    <w:p>
+      <w:pPr>
+        <w:spacing w:after="100" w:afterAutospacing="1" w:line="360" w:lineRule="auto"/>
+        <w:ind w:firstLine="709"/>
+        <w:contextualSpacing/>
+        <w:jc w:val="both"/>
+        <w:rPr>
+          <w:rFonts w:ascii="Times New Roman" w:eastAsia="Times New Roman" w:hAnsi="Times New Roman" w:cs="Times New Roman"/>
+          <w:sz w:val="28"/>
+          <w:szCs w:val="28"/>
+          <w:lang w:eastAsia="ru-RU"/>
+        </w:rPr>
+      </w:pPr>
+      <w:r>
+        <w:rPr>
+          <w:rFonts w:ascii="Times New Roman" w:eastAsia="Times New Roman" w:hAnsi="Times New Roman" w:cs="Times New Roman"/>
+          <w:sz w:val="28"/>
+          <w:szCs w:val="28"/>
+          <w:lang w:eastAsia="ru-RU"/>
+        </w:rPr>
+        <w:t>Шаг 1 – Регистрация. На этапе регистрации пользователь вводит свои данные: фамилию, имя, отчество, дату рождения, почту, логин и пароль, после чего отправляет их в Интерфейс сервиса (сообщение 1.1). Интерфейс сервиса передаёт запрос на проверку существования пользователя в Сервис регистрации/авторизации (1.2). Сервис регистрации/авторизации обращается к Базе данных контента для проверки совпадений данных (1.3). База данных возвращает результат проверки (1.4). Если пользователь уже существует или данные некорректны, сервис возвращает ошибку. Если проверка прошла успешно, Сервис регистрации/авторизации предоставляет разрешение на вход (1.5) и передаёт</w:t>
+      </w:r>
+      <w:r>
+        <w:rPr>
+          <w:rFonts w:ascii="Times New Roman" w:eastAsia="Times New Roman" w:hAnsi="Times New Roman" w:cs="Times New Roman"/>
+          <w:sz w:val="28"/>
+          <w:szCs w:val="28"/>
+          <w:lang w:eastAsia="ru-RU"/>
+        </w:rPr>
+        <w:t xml:space="preserve"> управление к шагу авторизации.</w:t>
+      </w:r>
+    </w:p>
+    <w:p>
+      <w:pPr>
+        <w:spacing w:after="100" w:afterAutospacing="1" w:line="360" w:lineRule="auto"/>
+        <w:ind w:firstLine="709"/>
+        <w:contextualSpacing/>
+        <w:jc w:val="both"/>
+        <w:rPr>
+          <w:rFonts w:ascii="Times New Roman" w:eastAsia="Times New Roman" w:hAnsi="Times New Roman" w:cs="Times New Roman"/>
+          <w:sz w:val="28"/>
+          <w:szCs w:val="28"/>
+          <w:lang w:eastAsia="ru-RU"/>
+        </w:rPr>
+      </w:pPr>
+      <w:r>
+        <w:rPr>
+          <w:rFonts w:ascii="Times New Roman" w:eastAsia="Times New Roman" w:hAnsi="Times New Roman" w:cs="Times New Roman"/>
+          <w:sz w:val="28"/>
+          <w:szCs w:val="28"/>
+          <w:lang w:eastAsia="ru-RU"/>
+        </w:rPr>
+        <w:t xml:space="preserve">Шаг 2 – Авторизация. Пользователь вводит логин и пароль, отправляя запрос на авторизацию в Интерфейс сервиса (2.1). Интерфейс сервиса передаёт </w:t>
+      </w:r>
+      <w:r>
+        <w:rPr>
+          <w:rFonts w:ascii="Times New Roman" w:eastAsia="Times New Roman" w:hAnsi="Times New Roman" w:cs="Times New Roman"/>
+          <w:sz w:val="28"/>
+          <w:szCs w:val="28"/>
+          <w:lang w:eastAsia="ru-RU"/>
+        </w:rPr>
+        <w:lastRenderedPageBreak/>
+        <w:t>запрос на авторизацию в Сервис регистрации/авторизации (2.2). Сервис регистрации/авторизации запрашивает у Базы данных контента проверку наличия аккаунта с указанными логином и паролем (2.3). База данных возвращает результат совпадений (аккаунт найден или не найден) (2.4). Сервис регистрации/авторизации возвращает в Интерфейс с</w:t>
+      </w:r>
+      <w:r>
+        <w:rPr>
+          <w:rFonts w:ascii="Times New Roman" w:eastAsia="Times New Roman" w:hAnsi="Times New Roman" w:cs="Times New Roman"/>
+          <w:sz w:val="28"/>
+          <w:szCs w:val="28"/>
+          <w:lang w:eastAsia="ru-RU"/>
+        </w:rPr>
+        <w:t>ервиса результат проверки (2.5), а интерфейс, в свою очередь, отображает данные сервиса (2.6)</w:t>
+      </w:r>
+    </w:p>
+    <w:p>
+      <w:pPr>
+        <w:spacing w:after="100" w:afterAutospacing="1" w:line="360" w:lineRule="auto"/>
+        <w:ind w:firstLine="709"/>
+        <w:contextualSpacing/>
+        <w:jc w:val="both"/>
+        <w:rPr>
+          <w:rFonts w:ascii="Times New Roman" w:eastAsia="Times New Roman" w:hAnsi="Times New Roman" w:cs="Times New Roman"/>
+          <w:sz w:val="28"/>
+          <w:szCs w:val="28"/>
+          <w:lang w:eastAsia="ru-RU"/>
+        </w:rPr>
+      </w:pPr>
+    </w:p>
+    <w:p>
+      <w:pPr>
+        <w:spacing w:after="100" w:afterAutospacing="1" w:line="360" w:lineRule="auto"/>
+        <w:contextualSpacing/>
         <w:jc w:val="center"/>
         <w:rPr>
           <w:rFonts w:ascii="Times New Roman" w:eastAsia="Times New Roman" w:hAnsi="Times New Roman" w:cs="Times New Roman"/>
@@ -26859,11 +27556,11 @@
       <w:r>
         <w:rPr>
           <w:rFonts w:ascii="Times New Roman" w:eastAsia="Times New Roman" w:hAnsi="Times New Roman" w:cs="Times New Roman"/>
-          <w:sz w:val="28"/>
-          <w:szCs w:val="28"/>
-          <w:lang w:eastAsia="ru-RU"/>
-        </w:rPr>
-        <w:lastRenderedPageBreak/>
+          <w:noProof/>
+          <w:sz w:val="28"/>
+          <w:szCs w:val="28"/>
+          <w:lang w:eastAsia="ru-RU"/>
+        </w:rPr>
         <w:drawing>
           <wp:inline distT="0" distB="0" distL="0" distR="0" wp14:anchorId="79A311F8" wp14:editId="2E35CDAF">
             <wp:extent cx="5939790" cy="1684020"/>
@@ -26943,6 +27640,482 @@
         <w:spacing w:after="100" w:afterAutospacing="1" w:line="360" w:lineRule="auto"/>
         <w:ind w:firstLine="709"/>
         <w:contextualSpacing/>
+        <w:jc w:val="both"/>
+        <w:rPr>
+          <w:rFonts w:ascii="Times New Roman" w:eastAsia="Times New Roman" w:hAnsi="Times New Roman" w:cs="Times New Roman"/>
+          <w:sz w:val="28"/>
+          <w:szCs w:val="28"/>
+          <w:lang w:eastAsia="ru-RU"/>
+        </w:rPr>
+      </w:pPr>
+      <w:r>
+        <w:rPr>
+          <w:rFonts w:ascii="Times New Roman" w:eastAsia="Times New Roman" w:hAnsi="Times New Roman" w:cs="Times New Roman"/>
+          <w:sz w:val="28"/>
+          <w:szCs w:val="28"/>
+          <w:lang w:eastAsia="ru-RU"/>
+        </w:rPr>
+        <w:t>Описание диаграммы состояний:</w:t>
+      </w:r>
+    </w:p>
+    <w:p>
+      <w:pPr>
+        <w:spacing w:after="100" w:afterAutospacing="1" w:line="360" w:lineRule="auto"/>
+        <w:ind w:firstLine="709"/>
+        <w:contextualSpacing/>
+        <w:jc w:val="both"/>
+        <w:rPr>
+          <w:rFonts w:ascii="Times New Roman" w:eastAsia="Times New Roman" w:hAnsi="Times New Roman" w:cs="Times New Roman"/>
+          <w:sz w:val="28"/>
+          <w:szCs w:val="28"/>
+          <w:lang w:eastAsia="ru-RU"/>
+        </w:rPr>
+      </w:pPr>
+      <w:r>
+        <w:rPr>
+          <w:rFonts w:ascii="Times New Roman" w:eastAsia="Times New Roman" w:hAnsi="Times New Roman" w:cs="Times New Roman"/>
+          <w:sz w:val="28"/>
+          <w:szCs w:val="28"/>
+          <w:lang w:eastAsia="ru-RU"/>
+        </w:rPr>
+        <w:t>Начальная точка – означает, что пользователь не авторизован в системе и хочет</w:t>
+      </w:r>
+      <w:r>
+        <w:rPr>
+          <w:rFonts w:ascii="Times New Roman" w:eastAsia="Times New Roman" w:hAnsi="Times New Roman" w:cs="Times New Roman"/>
+          <w:sz w:val="28"/>
+          <w:szCs w:val="28"/>
+          <w:lang w:eastAsia="ru-RU"/>
+        </w:rPr>
+        <w:t xml:space="preserve"> получить доступ к функционалу.</w:t>
+      </w:r>
+    </w:p>
+    <w:p>
+      <w:pPr>
+        <w:spacing w:after="100" w:afterAutospacing="1" w:line="360" w:lineRule="auto"/>
+        <w:ind w:firstLine="709"/>
+        <w:contextualSpacing/>
+        <w:jc w:val="both"/>
+        <w:rPr>
+          <w:rFonts w:ascii="Times New Roman" w:eastAsia="Times New Roman" w:hAnsi="Times New Roman" w:cs="Times New Roman"/>
+          <w:sz w:val="28"/>
+          <w:szCs w:val="28"/>
+          <w:lang w:eastAsia="ru-RU"/>
+        </w:rPr>
+      </w:pPr>
+      <w:r>
+        <w:rPr>
+          <w:rFonts w:ascii="Times New Roman" w:eastAsia="Times New Roman" w:hAnsi="Times New Roman" w:cs="Times New Roman"/>
+          <w:sz w:val="28"/>
+          <w:szCs w:val="28"/>
+          <w:lang w:eastAsia="ru-RU"/>
+        </w:rPr>
+        <w:t>Пользователь переходит в состояние «Регистрация» (</w:t>
+      </w:r>
+      <w:proofErr w:type="spellStart"/>
+      <w:r>
+        <w:rPr>
+          <w:rFonts w:ascii="Times New Roman" w:eastAsia="Times New Roman" w:hAnsi="Times New Roman" w:cs="Times New Roman"/>
+          <w:sz w:val="28"/>
+          <w:szCs w:val="28"/>
+          <w:lang w:eastAsia="ru-RU"/>
+        </w:rPr>
+        <w:t>entry</w:t>
+      </w:r>
+      <w:proofErr w:type="spellEnd"/>
+      <w:r>
+        <w:rPr>
+          <w:rFonts w:ascii="Times New Roman" w:eastAsia="Times New Roman" w:hAnsi="Times New Roman" w:cs="Times New Roman"/>
+          <w:sz w:val="28"/>
+          <w:szCs w:val="28"/>
+          <w:lang w:eastAsia="ru-RU"/>
+        </w:rPr>
+        <w:t>/ввод данных для регистрации). В этом состоянии пользователь вводит свои данные: фамилию, имя, отчество, дату рождения, почту, логин и пароль. После ввода дан</w:t>
+      </w:r>
+      <w:r>
+        <w:rPr>
+          <w:rFonts w:ascii="Times New Roman" w:eastAsia="Times New Roman" w:hAnsi="Times New Roman" w:cs="Times New Roman"/>
+          <w:sz w:val="28"/>
+          <w:szCs w:val="28"/>
+          <w:lang w:eastAsia="ru-RU"/>
+        </w:rPr>
+        <w:t>ных система выполняет проверку.</w:t>
+      </w:r>
+    </w:p>
+    <w:p>
+      <w:pPr>
+        <w:spacing w:after="100" w:afterAutospacing="1" w:line="360" w:lineRule="auto"/>
+        <w:ind w:firstLine="709"/>
+        <w:contextualSpacing/>
+        <w:jc w:val="both"/>
+        <w:rPr>
+          <w:rFonts w:ascii="Times New Roman" w:eastAsia="Times New Roman" w:hAnsi="Times New Roman" w:cs="Times New Roman"/>
+          <w:sz w:val="28"/>
+          <w:szCs w:val="28"/>
+          <w:lang w:eastAsia="ru-RU"/>
+        </w:rPr>
+      </w:pPr>
+      <w:r>
+        <w:rPr>
+          <w:rFonts w:ascii="Times New Roman" w:eastAsia="Times New Roman" w:hAnsi="Times New Roman" w:cs="Times New Roman"/>
+          <w:sz w:val="28"/>
+          <w:szCs w:val="28"/>
+          <w:lang w:eastAsia="ru-RU"/>
+        </w:rPr>
+        <w:t>Ветвление</w:t>
+      </w:r>
+      <w:r>
+        <w:rPr>
+          <w:rFonts w:ascii="Times New Roman" w:eastAsia="Times New Roman" w:hAnsi="Times New Roman" w:cs="Times New Roman"/>
+          <w:sz w:val="28"/>
+          <w:szCs w:val="28"/>
+          <w:lang w:eastAsia="ru-RU"/>
+        </w:rPr>
+        <w:t xml:space="preserve"> (Проверка данных регистрации):</w:t>
+      </w:r>
+    </w:p>
+    <w:p>
+      <w:pPr>
+        <w:spacing w:after="100" w:afterAutospacing="1" w:line="360" w:lineRule="auto"/>
+        <w:ind w:firstLine="709"/>
+        <w:contextualSpacing/>
+        <w:jc w:val="both"/>
+        <w:rPr>
+          <w:rFonts w:ascii="Times New Roman" w:eastAsia="Times New Roman" w:hAnsi="Times New Roman" w:cs="Times New Roman"/>
+          <w:sz w:val="28"/>
+          <w:szCs w:val="28"/>
+          <w:lang w:eastAsia="ru-RU"/>
+        </w:rPr>
+      </w:pPr>
+      <w:r>
+        <w:rPr>
+          <w:rFonts w:ascii="Times New Roman" w:eastAsia="Times New Roman" w:hAnsi="Times New Roman" w:cs="Times New Roman"/>
+          <w:sz w:val="28"/>
+          <w:szCs w:val="28"/>
+          <w:lang w:eastAsia="ru-RU"/>
+        </w:rPr>
+        <w:t>Если аккаунт уже существует или данные не корректны – происходит переход в состояние «Отклонение» (</w:t>
+      </w:r>
+      <w:proofErr w:type="spellStart"/>
+      <w:r>
+        <w:rPr>
+          <w:rFonts w:ascii="Times New Roman" w:eastAsia="Times New Roman" w:hAnsi="Times New Roman" w:cs="Times New Roman"/>
+          <w:sz w:val="28"/>
+          <w:szCs w:val="28"/>
+          <w:lang w:eastAsia="ru-RU"/>
+        </w:rPr>
+        <w:t>entry</w:t>
+      </w:r>
+      <w:proofErr w:type="spellEnd"/>
+      <w:r>
+        <w:rPr>
+          <w:rFonts w:ascii="Times New Roman" w:eastAsia="Times New Roman" w:hAnsi="Times New Roman" w:cs="Times New Roman"/>
+          <w:sz w:val="28"/>
+          <w:szCs w:val="28"/>
+          <w:lang w:eastAsia="ru-RU"/>
+        </w:rPr>
+        <w:t>/вывод сообщения об ошибке). В этом состоянии система выводит пользователю сообщение об ошибке, после чего пользователь возвращается к состоянию «Регистраци</w:t>
+      </w:r>
+      <w:r>
+        <w:rPr>
+          <w:rFonts w:ascii="Times New Roman" w:eastAsia="Times New Roman" w:hAnsi="Times New Roman" w:cs="Times New Roman"/>
+          <w:sz w:val="28"/>
+          <w:szCs w:val="28"/>
+          <w:lang w:eastAsia="ru-RU"/>
+        </w:rPr>
+        <w:t>я» для повторного ввода данных.</w:t>
+      </w:r>
+    </w:p>
+    <w:p>
+      <w:pPr>
+        <w:spacing w:after="100" w:afterAutospacing="1" w:line="360" w:lineRule="auto"/>
+        <w:ind w:firstLine="709"/>
+        <w:contextualSpacing/>
+        <w:jc w:val="both"/>
+        <w:rPr>
+          <w:rFonts w:ascii="Times New Roman" w:eastAsia="Times New Roman" w:hAnsi="Times New Roman" w:cs="Times New Roman"/>
+          <w:sz w:val="28"/>
+          <w:szCs w:val="28"/>
+          <w:lang w:eastAsia="ru-RU"/>
+        </w:rPr>
+      </w:pPr>
+      <w:r>
+        <w:rPr>
+          <w:rFonts w:ascii="Times New Roman" w:eastAsia="Times New Roman" w:hAnsi="Times New Roman" w:cs="Times New Roman"/>
+          <w:sz w:val="28"/>
+          <w:szCs w:val="28"/>
+          <w:lang w:eastAsia="ru-RU"/>
+        </w:rPr>
+        <w:lastRenderedPageBreak/>
+        <w:t>Если данные корректны и аккаунта не существовало – происходит создание аккаунта, и пользователь перех</w:t>
+      </w:r>
+      <w:r>
+        <w:rPr>
+          <w:rFonts w:ascii="Times New Roman" w:eastAsia="Times New Roman" w:hAnsi="Times New Roman" w:cs="Times New Roman"/>
+          <w:sz w:val="28"/>
+          <w:szCs w:val="28"/>
+          <w:lang w:eastAsia="ru-RU"/>
+        </w:rPr>
+        <w:t>одит в состояние «Авторизация».</w:t>
+      </w:r>
+    </w:p>
+    <w:p>
+      <w:pPr>
+        <w:spacing w:after="100" w:afterAutospacing="1" w:line="360" w:lineRule="auto"/>
+        <w:ind w:firstLine="709"/>
+        <w:contextualSpacing/>
+        <w:jc w:val="both"/>
+        <w:rPr>
+          <w:rFonts w:ascii="Times New Roman" w:eastAsia="Times New Roman" w:hAnsi="Times New Roman" w:cs="Times New Roman"/>
+          <w:sz w:val="28"/>
+          <w:szCs w:val="28"/>
+          <w:lang w:eastAsia="ru-RU"/>
+        </w:rPr>
+      </w:pPr>
+      <w:r>
+        <w:rPr>
+          <w:rFonts w:ascii="Times New Roman" w:eastAsia="Times New Roman" w:hAnsi="Times New Roman" w:cs="Times New Roman"/>
+          <w:sz w:val="28"/>
+          <w:szCs w:val="28"/>
+          <w:lang w:eastAsia="ru-RU"/>
+        </w:rPr>
+        <w:t>В состоянии «Авторизация» (</w:t>
+      </w:r>
+      <w:proofErr w:type="spellStart"/>
+      <w:r>
+        <w:rPr>
+          <w:rFonts w:ascii="Times New Roman" w:eastAsia="Times New Roman" w:hAnsi="Times New Roman" w:cs="Times New Roman"/>
+          <w:sz w:val="28"/>
+          <w:szCs w:val="28"/>
+          <w:lang w:eastAsia="ru-RU"/>
+        </w:rPr>
+        <w:t>entry</w:t>
+      </w:r>
+      <w:proofErr w:type="spellEnd"/>
+      <w:r>
+        <w:rPr>
+          <w:rFonts w:ascii="Times New Roman" w:eastAsia="Times New Roman" w:hAnsi="Times New Roman" w:cs="Times New Roman"/>
+          <w:sz w:val="28"/>
+          <w:szCs w:val="28"/>
+          <w:lang w:eastAsia="ru-RU"/>
+        </w:rPr>
+        <w:t>/ввод логина и пароля) пользователь вводит свои учётные данные для входа в систему. Система выпол</w:t>
+      </w:r>
+      <w:r>
+        <w:rPr>
+          <w:rFonts w:ascii="Times New Roman" w:eastAsia="Times New Roman" w:hAnsi="Times New Roman" w:cs="Times New Roman"/>
+          <w:sz w:val="28"/>
+          <w:szCs w:val="28"/>
+          <w:lang w:eastAsia="ru-RU"/>
+        </w:rPr>
+        <w:t>няет проверку введённых данных.</w:t>
+      </w:r>
+    </w:p>
+    <w:p>
+      <w:pPr>
+        <w:spacing w:after="100" w:afterAutospacing="1" w:line="360" w:lineRule="auto"/>
+        <w:ind w:firstLine="709"/>
+        <w:contextualSpacing/>
+        <w:jc w:val="both"/>
+        <w:rPr>
+          <w:rFonts w:ascii="Times New Roman" w:eastAsia="Times New Roman" w:hAnsi="Times New Roman" w:cs="Times New Roman"/>
+          <w:sz w:val="28"/>
+          <w:szCs w:val="28"/>
+          <w:lang w:eastAsia="ru-RU"/>
+        </w:rPr>
+      </w:pPr>
+      <w:r>
+        <w:rPr>
+          <w:rFonts w:ascii="Times New Roman" w:eastAsia="Times New Roman" w:hAnsi="Times New Roman" w:cs="Times New Roman"/>
+          <w:sz w:val="28"/>
+          <w:szCs w:val="28"/>
+          <w:lang w:eastAsia="ru-RU"/>
+        </w:rPr>
+        <w:t>Ветвление</w:t>
+      </w:r>
+      <w:r>
+        <w:rPr>
+          <w:rFonts w:ascii="Times New Roman" w:eastAsia="Times New Roman" w:hAnsi="Times New Roman" w:cs="Times New Roman"/>
+          <w:sz w:val="28"/>
+          <w:szCs w:val="28"/>
+          <w:lang w:eastAsia="ru-RU"/>
+        </w:rPr>
+        <w:t xml:space="preserve"> (Проверка данных авторизации):</w:t>
+      </w:r>
+    </w:p>
+    <w:p>
+      <w:pPr>
+        <w:spacing w:after="100" w:afterAutospacing="1" w:line="360" w:lineRule="auto"/>
+        <w:ind w:firstLine="709"/>
+        <w:contextualSpacing/>
+        <w:jc w:val="both"/>
+        <w:rPr>
+          <w:rFonts w:ascii="Times New Roman" w:eastAsia="Times New Roman" w:hAnsi="Times New Roman" w:cs="Times New Roman"/>
+          <w:sz w:val="28"/>
+          <w:szCs w:val="28"/>
+          <w:lang w:eastAsia="ru-RU"/>
+        </w:rPr>
+      </w:pPr>
+      <w:r>
+        <w:rPr>
+          <w:rFonts w:ascii="Times New Roman" w:eastAsia="Times New Roman" w:hAnsi="Times New Roman" w:cs="Times New Roman"/>
+          <w:sz w:val="28"/>
+          <w:szCs w:val="28"/>
+          <w:lang w:eastAsia="ru-RU"/>
+        </w:rPr>
+        <w:t>Если данные введены не корректно – проверка не пройдена, и пользователь возвращается в состояние «Авторизация» для по</w:t>
+      </w:r>
+      <w:r>
+        <w:rPr>
+          <w:rFonts w:ascii="Times New Roman" w:eastAsia="Times New Roman" w:hAnsi="Times New Roman" w:cs="Times New Roman"/>
+          <w:sz w:val="28"/>
+          <w:szCs w:val="28"/>
+          <w:lang w:eastAsia="ru-RU"/>
+        </w:rPr>
+        <w:t>вторного ввода логина и пароля.</w:t>
+      </w:r>
+    </w:p>
+    <w:p>
+      <w:pPr>
+        <w:spacing w:after="100" w:afterAutospacing="1" w:line="360" w:lineRule="auto"/>
+        <w:ind w:firstLine="709"/>
+        <w:contextualSpacing/>
+        <w:jc w:val="both"/>
+        <w:rPr>
+          <w:rFonts w:ascii="Times New Roman" w:eastAsia="Times New Roman" w:hAnsi="Times New Roman" w:cs="Times New Roman"/>
+          <w:sz w:val="28"/>
+          <w:szCs w:val="28"/>
+          <w:lang w:eastAsia="ru-RU"/>
+        </w:rPr>
+      </w:pPr>
+      <w:r>
+        <w:rPr>
+          <w:rFonts w:ascii="Times New Roman" w:eastAsia="Times New Roman" w:hAnsi="Times New Roman" w:cs="Times New Roman"/>
+          <w:sz w:val="28"/>
+          <w:szCs w:val="28"/>
+          <w:lang w:eastAsia="ru-RU"/>
+        </w:rPr>
+        <w:t>Если данные введены корректно – пользователь переходит</w:t>
+      </w:r>
+      <w:r>
+        <w:rPr>
+          <w:rFonts w:ascii="Times New Roman" w:eastAsia="Times New Roman" w:hAnsi="Times New Roman" w:cs="Times New Roman"/>
+          <w:sz w:val="28"/>
+          <w:szCs w:val="28"/>
+          <w:lang w:eastAsia="ru-RU"/>
+        </w:rPr>
+        <w:t xml:space="preserve"> в состояние «Доступ разрешён».</w:t>
+      </w:r>
+    </w:p>
+    <w:p>
+      <w:pPr>
+        <w:spacing w:after="100" w:afterAutospacing="1" w:line="360" w:lineRule="auto"/>
+        <w:ind w:firstLine="709"/>
+        <w:contextualSpacing/>
+        <w:jc w:val="both"/>
+        <w:rPr>
+          <w:rFonts w:ascii="Times New Roman" w:eastAsia="Times New Roman" w:hAnsi="Times New Roman" w:cs="Times New Roman"/>
+          <w:sz w:val="28"/>
+          <w:szCs w:val="28"/>
+          <w:lang w:eastAsia="ru-RU"/>
+        </w:rPr>
+      </w:pPr>
+      <w:r>
+        <w:rPr>
+          <w:rFonts w:ascii="Times New Roman" w:eastAsia="Times New Roman" w:hAnsi="Times New Roman" w:cs="Times New Roman"/>
+          <w:sz w:val="28"/>
+          <w:szCs w:val="28"/>
+          <w:lang w:eastAsia="ru-RU"/>
+        </w:rPr>
+        <w:t>В состоянии «Доступ разрешён» (</w:t>
+      </w:r>
+      <w:proofErr w:type="spellStart"/>
+      <w:r>
+        <w:rPr>
+          <w:rFonts w:ascii="Times New Roman" w:eastAsia="Times New Roman" w:hAnsi="Times New Roman" w:cs="Times New Roman"/>
+          <w:sz w:val="28"/>
+          <w:szCs w:val="28"/>
+          <w:lang w:eastAsia="ru-RU"/>
+        </w:rPr>
+        <w:t>entry</w:t>
+      </w:r>
+      <w:proofErr w:type="spellEnd"/>
+      <w:r>
+        <w:rPr>
+          <w:rFonts w:ascii="Times New Roman" w:eastAsia="Times New Roman" w:hAnsi="Times New Roman" w:cs="Times New Roman"/>
+          <w:sz w:val="28"/>
+          <w:szCs w:val="28"/>
+          <w:lang w:eastAsia="ru-RU"/>
+        </w:rPr>
+        <w:t xml:space="preserve">/вывод сообщения об успешности, </w:t>
+      </w:r>
+      <w:proofErr w:type="spellStart"/>
+      <w:r>
+        <w:rPr>
+          <w:rFonts w:ascii="Times New Roman" w:eastAsia="Times New Roman" w:hAnsi="Times New Roman" w:cs="Times New Roman"/>
+          <w:sz w:val="28"/>
+          <w:szCs w:val="28"/>
+          <w:lang w:eastAsia="ru-RU"/>
+        </w:rPr>
+        <w:t>do</w:t>
+      </w:r>
+      <w:proofErr w:type="spellEnd"/>
+      <w:r>
+        <w:rPr>
+          <w:rFonts w:ascii="Times New Roman" w:eastAsia="Times New Roman" w:hAnsi="Times New Roman" w:cs="Times New Roman"/>
+          <w:sz w:val="28"/>
+          <w:szCs w:val="28"/>
+          <w:lang w:eastAsia="ru-RU"/>
+        </w:rPr>
+        <w:t>/предоставить данные сервиса) система выводит пользователю сообщение об успешной авторизации и предоставляет доступ к данным сервиса (личный кабинет</w:t>
+      </w:r>
+      <w:r>
+        <w:rPr>
+          <w:rFonts w:ascii="Times New Roman" w:eastAsia="Times New Roman" w:hAnsi="Times New Roman" w:cs="Times New Roman"/>
+          <w:sz w:val="28"/>
+          <w:szCs w:val="28"/>
+          <w:lang w:eastAsia="ru-RU"/>
+        </w:rPr>
+        <w:t>, доступные тесты, статистика).</w:t>
+      </w:r>
+    </w:p>
+    <w:p>
+      <w:pPr>
+        <w:spacing w:after="100" w:afterAutospacing="1" w:line="360" w:lineRule="auto"/>
+        <w:ind w:firstLine="709"/>
+        <w:contextualSpacing/>
+        <w:jc w:val="both"/>
+        <w:rPr>
+          <w:rFonts w:ascii="Times New Roman" w:eastAsia="Times New Roman" w:hAnsi="Times New Roman" w:cs="Times New Roman"/>
+          <w:sz w:val="28"/>
+          <w:szCs w:val="28"/>
+          <w:lang w:eastAsia="ru-RU"/>
+        </w:rPr>
+      </w:pPr>
+      <w:r>
+        <w:rPr>
+          <w:rFonts w:ascii="Times New Roman" w:eastAsia="Times New Roman" w:hAnsi="Times New Roman" w:cs="Times New Roman"/>
+          <w:sz w:val="28"/>
+          <w:szCs w:val="28"/>
+          <w:lang w:eastAsia="ru-RU"/>
+        </w:rPr>
+        <w:t>Конечная точка – пользователь успешно авторизован и получил доступ к основному функционалу системы. При выходе из системы пользователь возвращается в началь</w:t>
+      </w:r>
+      <w:r>
+        <w:rPr>
+          <w:rFonts w:ascii="Times New Roman" w:eastAsia="Times New Roman" w:hAnsi="Times New Roman" w:cs="Times New Roman"/>
+          <w:sz w:val="28"/>
+          <w:szCs w:val="28"/>
+          <w:lang w:eastAsia="ru-RU"/>
+        </w:rPr>
+        <w:t>ное состояние (не авторизован).</w:t>
+      </w:r>
+    </w:p>
+    <w:p>
+      <w:pPr>
+        <w:spacing w:after="100" w:afterAutospacing="1" w:line="360" w:lineRule="auto"/>
+        <w:ind w:firstLine="709"/>
+        <w:contextualSpacing/>
         <w:jc w:val="center"/>
         <w:rPr>
           <w:rFonts w:ascii="Times New Roman" w:eastAsia="Times New Roman" w:hAnsi="Times New Roman" w:cs="Times New Roman"/>
@@ -26954,6 +28127,7 @@
       <w:r>
         <w:rPr>
           <w:rFonts w:ascii="Times New Roman" w:eastAsia="Times New Roman" w:hAnsi="Times New Roman" w:cs="Times New Roman"/>
+          <w:noProof/>
           <w:sz w:val="28"/>
           <w:szCs w:val="28"/>
           <w:lang w:eastAsia="ru-RU"/>
@@ -26961,8 +28135,8 @@
         <w:lastRenderedPageBreak/>
         <w:drawing>
           <wp:inline distT="0" distB="0" distL="0" distR="0" wp14:anchorId="593C881C" wp14:editId="231AB93F">
-            <wp:extent cx="5939790" cy="6831330"/>
-            <wp:effectExtent l="0" t="0" r="3810" b="7620"/>
+            <wp:extent cx="4738254" cy="5449448"/>
+            <wp:effectExtent l="0" t="0" r="5715" b="0"/>
             <wp:docPr id="9" name="Рисунок 9"/>
             <wp:cNvGraphicFramePr>
               <a:graphicFrameLocks xmlns:a="http://schemas.openxmlformats.org/drawingml/2006/main" noChangeAspect="1"/>
@@ -26983,7 +28157,7 @@
                   <pic:spPr>
                     <a:xfrm>
                       <a:off x="0" y="0"/>
-                      <a:ext cx="5939790" cy="6831330"/>
+                      <a:ext cx="4750652" cy="5463707"/>
                     </a:xfrm>
                     <a:prstGeom prst="rect">
                       <a:avLst/>
@@ -26995,8 +28169,6 @@
           </wp:inline>
         </w:drawing>
       </w:r>
-      <w:bookmarkStart w:id="72" w:name="_GoBack"/>
-      <w:bookmarkEnd w:id="72"/>
     </w:p>
     <w:p>
       <w:pPr>
@@ -27020,20 +28192,6 @@
         </w:rPr>
         <w:t>Рисунок 9 – Диаграмма состояний модуля «Авторизация/регистрация».</w:t>
       </w:r>
-    </w:p>
-    <w:p>
-      <w:pPr>
-        <w:spacing w:after="100" w:afterAutospacing="1" w:line="360" w:lineRule="auto"/>
-        <w:ind w:firstLine="709"/>
-        <w:contextualSpacing/>
-        <w:jc w:val="both"/>
-        <w:rPr>
-          <w:rFonts w:ascii="Times New Roman" w:eastAsia="Times New Roman" w:hAnsi="Times New Roman" w:cs="Times New Roman"/>
-          <w:sz w:val="28"/>
-          <w:szCs w:val="28"/>
-          <w:lang w:eastAsia="ru-RU"/>
-        </w:rPr>
-      </w:pPr>
     </w:p>
     <w:p>
       <w:pPr>
@@ -27127,7 +28285,6 @@
           <w:szCs w:val="28"/>
           <w:lang w:eastAsia="ru-RU"/>
         </w:rPr>
-        <w:lastRenderedPageBreak/>
         <w:t xml:space="preserve">Почта должна соответствовать всем правилам написания, а именно: содержание </w:t>
       </w:r>
       <w:r>
@@ -27200,6 +28357,7 @@
           <w:szCs w:val="28"/>
           <w:lang w:eastAsia="ru-RU"/>
         </w:rPr>
+        <w:lastRenderedPageBreak/>
         <w:t>В случае отказа в регистрации/авторизации должно выводиться сообщение с пояснением причины или ошибки сервиса.</w:t>
       </w:r>
     </w:p>
@@ -27246,20 +28404,6 @@
     </w:p>
     <w:p>
       <w:pPr>
-        <w:spacing w:after="100" w:afterAutospacing="1" w:line="360" w:lineRule="auto"/>
-        <w:ind w:firstLine="709"/>
-        <w:contextualSpacing/>
-        <w:jc w:val="both"/>
-        <w:rPr>
-          <w:rFonts w:ascii="Times New Roman" w:eastAsia="Times New Roman" w:hAnsi="Times New Roman" w:cs="Times New Roman"/>
-          <w:sz w:val="28"/>
-          <w:szCs w:val="28"/>
-          <w:lang w:eastAsia="ru-RU"/>
-        </w:rPr>
-      </w:pPr>
-    </w:p>
-    <w:p>
-      <w:pPr>
         <w:spacing w:after="160" w:line="259" w:lineRule="auto"/>
         <w:rPr>
           <w:rFonts w:ascii="Times New Roman" w:eastAsia="Times New Roman" w:hAnsi="Times New Roman" w:cs="Times New Roman"/>
@@ -27287,47 +28431,122 @@
         </w:numPr>
         <w:rPr>
           <w:rFonts w:eastAsia="Times New Roman"/>
-          <w:highlight w:val="yellow"/>
-          <w:lang w:eastAsia="ru-RU"/>
-        </w:rPr>
-      </w:pPr>
-      <w:bookmarkStart w:id="73" w:name="_Toc229829472"/>
-      <w:bookmarkStart w:id="74" w:name="_Toc230096068"/>
+          <w:lang w:eastAsia="ru-RU"/>
+        </w:rPr>
+      </w:pPr>
+      <w:bookmarkStart w:id="73" w:name="_Toc230102765"/>
       <w:r>
         <w:rPr>
           <w:rFonts w:eastAsia="Times New Roman"/>
-          <w:highlight w:val="yellow"/>
           <w:lang w:eastAsia="ru-RU"/>
         </w:rPr>
         <w:lastRenderedPageBreak/>
-        <w:t>Тестирование</w:t>
+        <w:t>Проектирование модуля «Интерфейс пользователя»</w:t>
       </w:r>
       <w:bookmarkEnd w:id="73"/>
-      <w:bookmarkEnd w:id="74"/>
-    </w:p>
-    <w:p>
-      <w:pPr>
-        <w:spacing w:after="100" w:afterAutospacing="1" w:line="360" w:lineRule="auto"/>
-        <w:ind w:firstLine="709"/>
-        <w:contextualSpacing/>
-        <w:jc w:val="both"/>
-        <w:rPr>
-          <w:rFonts w:ascii="Times New Roman" w:eastAsia="Times New Roman" w:hAnsi="Times New Roman" w:cs="Times New Roman"/>
-          <w:sz w:val="28"/>
-          <w:szCs w:val="28"/>
-          <w:lang w:eastAsia="ru-RU"/>
-        </w:rPr>
-      </w:pPr>
-      <w:r>
-        <w:rPr>
-          <w:rFonts w:ascii="Times New Roman" w:eastAsia="Times New Roman" w:hAnsi="Times New Roman" w:cs="Times New Roman"/>
-          <w:sz w:val="28"/>
-          <w:szCs w:val="28"/>
-          <w:highlight w:val="yellow"/>
-          <w:lang w:eastAsia="ru-RU"/>
-        </w:rPr>
-        <w:t>Описание что делали с тестами индивидуально и тестовая документация</w:t>
-      </w:r>
+    </w:p>
+    <w:p>
+      <w:pPr>
+        <w:spacing w:after="100" w:afterAutospacing="1" w:line="360" w:lineRule="auto"/>
+        <w:ind w:firstLine="709"/>
+        <w:contextualSpacing/>
+        <w:jc w:val="both"/>
+        <w:rPr>
+          <w:rFonts w:ascii="Times New Roman" w:eastAsia="Times New Roman" w:hAnsi="Times New Roman" w:cs="Times New Roman"/>
+          <w:sz w:val="28"/>
+          <w:szCs w:val="28"/>
+          <w:lang w:eastAsia="ru-RU"/>
+        </w:rPr>
+      </w:pPr>
+      <w:r>
+        <w:rPr>
+          <w:rFonts w:ascii="Times New Roman" w:eastAsia="Times New Roman" w:hAnsi="Times New Roman" w:cs="Times New Roman"/>
+          <w:sz w:val="28"/>
+          <w:szCs w:val="28"/>
+          <w:lang w:eastAsia="ru-RU"/>
+        </w:rPr>
+        <w:t xml:space="preserve">Для успешной реализации этого модуля был разработан макет интерфейса с помощью инструментов сервиса </w:t>
+      </w:r>
+      <w:proofErr w:type="spellStart"/>
+      <w:r>
+        <w:rPr>
+          <w:rFonts w:ascii="Times New Roman" w:eastAsia="Times New Roman" w:hAnsi="Times New Roman" w:cs="Times New Roman"/>
+          <w:sz w:val="28"/>
+          <w:szCs w:val="28"/>
+          <w:lang w:val="en-US" w:eastAsia="ru-RU"/>
+        </w:rPr>
+        <w:t>Figma</w:t>
+      </w:r>
+      <w:proofErr w:type="spellEnd"/>
+      <w:r>
+        <w:rPr>
+          <w:rFonts w:ascii="Times New Roman" w:eastAsia="Times New Roman" w:hAnsi="Times New Roman" w:cs="Times New Roman"/>
+          <w:sz w:val="28"/>
+          <w:szCs w:val="28"/>
+          <w:lang w:eastAsia="ru-RU"/>
+        </w:rPr>
+        <w:t>.</w:t>
+      </w:r>
+      <w:r>
+        <w:rPr>
+          <w:rFonts w:ascii="Times New Roman" w:eastAsia="Times New Roman" w:hAnsi="Times New Roman" w:cs="Times New Roman"/>
+          <w:sz w:val="28"/>
+          <w:szCs w:val="28"/>
+          <w:lang w:val="en-US" w:eastAsia="ru-RU"/>
+        </w:rPr>
+        <w:t>com</w:t>
+      </w:r>
+      <w:r>
+        <w:rPr>
+          <w:rFonts w:ascii="Times New Roman" w:eastAsia="Times New Roman" w:hAnsi="Times New Roman" w:cs="Times New Roman"/>
+          <w:sz w:val="28"/>
+          <w:szCs w:val="28"/>
+          <w:lang w:eastAsia="ru-RU"/>
+        </w:rPr>
+        <w:t>.</w:t>
+      </w:r>
+    </w:p>
+    <w:p>
+      <w:pPr>
+        <w:spacing w:after="100" w:afterAutospacing="1" w:line="360" w:lineRule="auto"/>
+        <w:ind w:firstLine="709"/>
+        <w:contextualSpacing/>
+        <w:jc w:val="both"/>
+        <w:rPr>
+          <w:rFonts w:ascii="Times New Roman" w:eastAsia="Times New Roman" w:hAnsi="Times New Roman" w:cs="Times New Roman"/>
+          <w:sz w:val="28"/>
+          <w:szCs w:val="28"/>
+          <w:lang w:eastAsia="ru-RU"/>
+        </w:rPr>
+      </w:pPr>
+    </w:p>
+    <w:p>
+      <w:pPr>
+        <w:spacing w:after="100" w:afterAutospacing="1" w:line="360" w:lineRule="auto"/>
+        <w:ind w:firstLine="709"/>
+        <w:contextualSpacing/>
+        <w:jc w:val="both"/>
+        <w:rPr>
+          <w:rFonts w:ascii="Times New Roman" w:eastAsia="Times New Roman" w:hAnsi="Times New Roman" w:cs="Times New Roman"/>
+          <w:sz w:val="28"/>
+          <w:szCs w:val="28"/>
+          <w:lang w:eastAsia="ru-RU"/>
+        </w:rPr>
+      </w:pPr>
+    </w:p>
+    <w:p>
+      <w:pPr>
+        <w:spacing w:after="100" w:afterAutospacing="1" w:line="360" w:lineRule="auto"/>
+        <w:ind w:firstLine="709"/>
+        <w:contextualSpacing/>
+        <w:jc w:val="both"/>
+        <w:rPr>
+          <w:rFonts w:ascii="Times New Roman" w:eastAsia="Times New Roman" w:hAnsi="Times New Roman" w:cs="Times New Roman"/>
+          <w:sz w:val="28"/>
+          <w:szCs w:val="28"/>
+          <w:lang w:eastAsia="ru-RU"/>
+        </w:rPr>
+      </w:pPr>
     </w:p>
     <w:p>
       <w:pPr>
@@ -27418,8 +28637,8 @@
           <w:lang w:eastAsia="ru-RU"/>
         </w:rPr>
       </w:pPr>
-      <w:bookmarkStart w:id="75" w:name="_Toc229829473"/>
-      <w:bookmarkStart w:id="76" w:name="_Toc230096069"/>
+      <w:bookmarkStart w:id="74" w:name="_Toc229829472"/>
+      <w:bookmarkStart w:id="75" w:name="_Toc230102766"/>
       <w:r>
         <w:rPr>
           <w:rFonts w:eastAsia="Times New Roman"/>
@@ -27427,10 +28646,10 @@
           <w:lang w:eastAsia="ru-RU"/>
         </w:rPr>
         <w:lastRenderedPageBreak/>
-        <w:t>Описание организации реализации проекта</w:t>
-      </w:r>
+        <w:t>Тестирование</w:t>
+      </w:r>
+      <w:bookmarkEnd w:id="74"/>
       <w:bookmarkEnd w:id="75"/>
-      <w:bookmarkEnd w:id="76"/>
     </w:p>
     <w:p>
       <w:pPr>
@@ -27453,20 +28672,22 @@
           <w:highlight w:val="yellow"/>
           <w:lang w:eastAsia="ru-RU"/>
         </w:rPr>
-        <w:t xml:space="preserve">Про </w:t>
-      </w:r>
-      <w:proofErr w:type="spellStart"/>
-      <w:r>
-        <w:rPr>
-          <w:rFonts w:ascii="Times New Roman" w:eastAsia="Times New Roman" w:hAnsi="Times New Roman" w:cs="Times New Roman"/>
-          <w:sz w:val="28"/>
-          <w:szCs w:val="28"/>
-          <w:highlight w:val="yellow"/>
-          <w:lang w:eastAsia="ru-RU"/>
-        </w:rPr>
-        <w:t>канбан</w:t>
-      </w:r>
-      <w:proofErr w:type="spellEnd"/>
+        <w:t>Описание что делали с тестами индивидуально и тестовая документация</w:t>
+      </w:r>
+    </w:p>
+    <w:p>
+      <w:pPr>
+        <w:spacing w:after="100" w:afterAutospacing="1" w:line="360" w:lineRule="auto"/>
+        <w:ind w:firstLine="709"/>
+        <w:contextualSpacing/>
+        <w:jc w:val="both"/>
+        <w:rPr>
+          <w:rFonts w:ascii="Times New Roman" w:eastAsia="Times New Roman" w:hAnsi="Times New Roman" w:cs="Times New Roman"/>
+          <w:sz w:val="28"/>
+          <w:szCs w:val="28"/>
+          <w:lang w:eastAsia="ru-RU"/>
+        </w:rPr>
+      </w:pPr>
     </w:p>
     <w:p>
       <w:pPr>
@@ -27533,14 +28754,18 @@
     <w:p>
       <w:pPr>
         <w:pStyle w:val="1"/>
+        <w:numPr>
+          <w:ilvl w:val="0"/>
+          <w:numId w:val="4"/>
+        </w:numPr>
         <w:rPr>
           <w:rFonts w:eastAsia="Times New Roman"/>
           <w:highlight w:val="yellow"/>
           <w:lang w:eastAsia="ru-RU"/>
         </w:rPr>
       </w:pPr>
-      <w:bookmarkStart w:id="77" w:name="_Toc229829474"/>
-      <w:bookmarkStart w:id="78" w:name="_Toc230096070"/>
+      <w:bookmarkStart w:id="76" w:name="_Toc229829473"/>
+      <w:bookmarkStart w:id="77" w:name="_Toc230102767"/>
       <w:r>
         <w:rPr>
           <w:rFonts w:eastAsia="Times New Roman"/>
@@ -27548,10 +28773,131 @@
           <w:lang w:eastAsia="ru-RU"/>
         </w:rPr>
         <w:lastRenderedPageBreak/>
+        <w:t>Описание организации реализации проекта</w:t>
+      </w:r>
+      <w:bookmarkEnd w:id="76"/>
+      <w:bookmarkEnd w:id="77"/>
+    </w:p>
+    <w:p>
+      <w:pPr>
+        <w:spacing w:after="100" w:afterAutospacing="1" w:line="360" w:lineRule="auto"/>
+        <w:ind w:firstLine="709"/>
+        <w:contextualSpacing/>
+        <w:jc w:val="both"/>
+        <w:rPr>
+          <w:rFonts w:ascii="Times New Roman" w:eastAsia="Times New Roman" w:hAnsi="Times New Roman" w:cs="Times New Roman"/>
+          <w:sz w:val="28"/>
+          <w:szCs w:val="28"/>
+          <w:lang w:eastAsia="ru-RU"/>
+        </w:rPr>
+      </w:pPr>
+      <w:r>
+        <w:rPr>
+          <w:rFonts w:ascii="Times New Roman" w:eastAsia="Times New Roman" w:hAnsi="Times New Roman" w:cs="Times New Roman"/>
+          <w:sz w:val="28"/>
+          <w:szCs w:val="28"/>
+          <w:highlight w:val="yellow"/>
+          <w:lang w:eastAsia="ru-RU"/>
+        </w:rPr>
+        <w:t xml:space="preserve">Про </w:t>
+      </w:r>
+      <w:proofErr w:type="spellStart"/>
+      <w:r>
+        <w:rPr>
+          <w:rFonts w:ascii="Times New Roman" w:eastAsia="Times New Roman" w:hAnsi="Times New Roman" w:cs="Times New Roman"/>
+          <w:sz w:val="28"/>
+          <w:szCs w:val="28"/>
+          <w:highlight w:val="yellow"/>
+          <w:lang w:eastAsia="ru-RU"/>
+        </w:rPr>
+        <w:t>канбан</w:t>
+      </w:r>
+      <w:proofErr w:type="spellEnd"/>
+    </w:p>
+    <w:p>
+      <w:pPr>
+        <w:spacing w:after="100" w:afterAutospacing="1" w:line="360" w:lineRule="auto"/>
+        <w:ind w:firstLine="709"/>
+        <w:contextualSpacing/>
+        <w:jc w:val="both"/>
+        <w:rPr>
+          <w:rFonts w:ascii="Times New Roman" w:eastAsia="Times New Roman" w:hAnsi="Times New Roman" w:cs="Times New Roman"/>
+          <w:sz w:val="28"/>
+          <w:szCs w:val="28"/>
+          <w:lang w:eastAsia="ru-RU"/>
+        </w:rPr>
+      </w:pPr>
+    </w:p>
+    <w:p>
+      <w:pPr>
+        <w:spacing w:after="100" w:afterAutospacing="1" w:line="360" w:lineRule="auto"/>
+        <w:ind w:firstLine="709"/>
+        <w:contextualSpacing/>
+        <w:jc w:val="both"/>
+        <w:rPr>
+          <w:rFonts w:ascii="Times New Roman" w:eastAsia="Times New Roman" w:hAnsi="Times New Roman" w:cs="Times New Roman"/>
+          <w:sz w:val="28"/>
+          <w:szCs w:val="28"/>
+          <w:lang w:eastAsia="ru-RU"/>
+        </w:rPr>
+      </w:pPr>
+    </w:p>
+    <w:p>
+      <w:pPr>
+        <w:spacing w:after="100" w:afterAutospacing="1" w:line="360" w:lineRule="auto"/>
+        <w:ind w:firstLine="709"/>
+        <w:contextualSpacing/>
+        <w:jc w:val="both"/>
+        <w:rPr>
+          <w:rFonts w:ascii="Times New Roman" w:eastAsia="Times New Roman" w:hAnsi="Times New Roman" w:cs="Times New Roman"/>
+          <w:sz w:val="28"/>
+          <w:szCs w:val="28"/>
+          <w:lang w:eastAsia="ru-RU"/>
+        </w:rPr>
+      </w:pPr>
+    </w:p>
+    <w:p>
+      <w:pPr>
+        <w:spacing w:after="160" w:line="259" w:lineRule="auto"/>
+        <w:rPr>
+          <w:rFonts w:ascii="Times New Roman" w:eastAsia="Times New Roman" w:hAnsi="Times New Roman" w:cs="Times New Roman"/>
+          <w:sz w:val="28"/>
+          <w:szCs w:val="28"/>
+          <w:lang w:eastAsia="ru-RU"/>
+        </w:rPr>
+      </w:pPr>
+      <w:r>
+        <w:rPr>
+          <w:rFonts w:ascii="Times New Roman" w:eastAsia="Times New Roman" w:hAnsi="Times New Roman" w:cs="Times New Roman"/>
+          <w:sz w:val="28"/>
+          <w:szCs w:val="28"/>
+          <w:lang w:eastAsia="ru-RU"/>
+        </w:rPr>
+        <w:br w:type="page"/>
+      </w:r>
+    </w:p>
+    <w:p>
+      <w:pPr>
+        <w:pStyle w:val="1"/>
+        <w:rPr>
+          <w:rFonts w:eastAsia="Times New Roman"/>
+          <w:highlight w:val="yellow"/>
+          <w:lang w:eastAsia="ru-RU"/>
+        </w:rPr>
+      </w:pPr>
+      <w:bookmarkStart w:id="78" w:name="_Toc229829474"/>
+      <w:bookmarkStart w:id="79" w:name="_Toc230102768"/>
+      <w:r>
+        <w:rPr>
+          <w:rFonts w:eastAsia="Times New Roman"/>
+          <w:highlight w:val="yellow"/>
+          <w:lang w:eastAsia="ru-RU"/>
+        </w:rPr>
+        <w:lastRenderedPageBreak/>
         <w:t>Заключение</w:t>
       </w:r>
-      <w:bookmarkEnd w:id="77"/>
       <w:bookmarkEnd w:id="78"/>
+      <w:bookmarkEnd w:id="79"/>
     </w:p>
     <w:p>
       <w:pPr>
@@ -27791,7 +29137,7 @@
           <w:rPr>
             <w:noProof/>
           </w:rPr>
-          <w:t>48</w:t>
+          <w:t>21</w:t>
         </w:r>
         <w:r>
           <w:fldChar w:fldCharType="end"/>
@@ -29888,6 +31234,119 @@
     </w:lvl>
   </w:abstractNum>
   <w:abstractNum w:abstractNumId="19" w15:restartNumberingAfterBreak="0">
+    <w:nsid w:val="5F743F78"/>
+    <w:multiLevelType w:val="hybridMultilevel"/>
+    <w:tmpl w:val="818A2D78"/>
+    <w:lvl w:ilvl="0" w:tplc="7F6028E6">
+      <w:start w:val="1"/>
+      <w:numFmt w:val="bullet"/>
+      <w:lvlText w:val=""/>
+      <w:lvlJc w:val="left"/>
+      <w:pPr>
+        <w:ind w:left="1429" w:hanging="360"/>
+      </w:pPr>
+      <w:rPr>
+        <w:rFonts w:ascii="Symbol" w:hAnsi="Symbol" w:hint="default"/>
+      </w:rPr>
+    </w:lvl>
+    <w:lvl w:ilvl="1" w:tplc="04190003" w:tentative="1">
+      <w:start w:val="1"/>
+      <w:numFmt w:val="bullet"/>
+      <w:lvlText w:val="o"/>
+      <w:lvlJc w:val="left"/>
+      <w:pPr>
+        <w:ind w:left="2149" w:hanging="360"/>
+      </w:pPr>
+      <w:rPr>
+        <w:rFonts w:ascii="Courier New" w:hAnsi="Courier New" w:cs="Courier New" w:hint="default"/>
+      </w:rPr>
+    </w:lvl>
+    <w:lvl w:ilvl="2" w:tplc="04190005" w:tentative="1">
+      <w:start w:val="1"/>
+      <w:numFmt w:val="bullet"/>
+      <w:lvlText w:val=""/>
+      <w:lvlJc w:val="left"/>
+      <w:pPr>
+        <w:ind w:left="2869" w:hanging="360"/>
+      </w:pPr>
+      <w:rPr>
+        <w:rFonts w:ascii="Wingdings" w:hAnsi="Wingdings" w:hint="default"/>
+      </w:rPr>
+    </w:lvl>
+    <w:lvl w:ilvl="3" w:tplc="04190001" w:tentative="1">
+      <w:start w:val="1"/>
+      <w:numFmt w:val="bullet"/>
+      <w:lvlText w:val=""/>
+      <w:lvlJc w:val="left"/>
+      <w:pPr>
+        <w:ind w:left="3589" w:hanging="360"/>
+      </w:pPr>
+      <w:rPr>
+        <w:rFonts w:ascii="Symbol" w:hAnsi="Symbol" w:hint="default"/>
+      </w:rPr>
+    </w:lvl>
+    <w:lvl w:ilvl="4" w:tplc="04190003" w:tentative="1">
+      <w:start w:val="1"/>
+      <w:numFmt w:val="bullet"/>
+      <w:lvlText w:val="o"/>
+      <w:lvlJc w:val="left"/>
+      <w:pPr>
+        <w:ind w:left="4309" w:hanging="360"/>
+      </w:pPr>
+      <w:rPr>
+        <w:rFonts w:ascii="Courier New" w:hAnsi="Courier New" w:cs="Courier New" w:hint="default"/>
+      </w:rPr>
+    </w:lvl>
+    <w:lvl w:ilvl="5" w:tplc="04190005" w:tentative="1">
+      <w:start w:val="1"/>
+      <w:numFmt w:val="bullet"/>
+      <w:lvlText w:val=""/>
+      <w:lvlJc w:val="left"/>
+      <w:pPr>
+        <w:ind w:left="5029" w:hanging="360"/>
+      </w:pPr>
+      <w:rPr>
+        <w:rFonts w:ascii="Wingdings" w:hAnsi="Wingdings" w:hint="default"/>
+      </w:rPr>
+    </w:lvl>
+    <w:lvl w:ilvl="6" w:tplc="04190001" w:tentative="1">
+      <w:start w:val="1"/>
+      <w:numFmt w:val="bullet"/>
+      <w:lvlText w:val=""/>
+      <w:lvlJc w:val="left"/>
+      <w:pPr>
+        <w:ind w:left="5749" w:hanging="360"/>
+      </w:pPr>
+      <w:rPr>
+        <w:rFonts w:ascii="Symbol" w:hAnsi="Symbol" w:hint="default"/>
+      </w:rPr>
+    </w:lvl>
+    <w:lvl w:ilvl="7" w:tplc="04190003" w:tentative="1">
+      <w:start w:val="1"/>
+      <w:numFmt w:val="bullet"/>
+      <w:lvlText w:val="o"/>
+      <w:lvlJc w:val="left"/>
+      <w:pPr>
+        <w:ind w:left="6469" w:hanging="360"/>
+      </w:pPr>
+      <w:rPr>
+        <w:rFonts w:ascii="Courier New" w:hAnsi="Courier New" w:cs="Courier New" w:hint="default"/>
+      </w:rPr>
+    </w:lvl>
+    <w:lvl w:ilvl="8" w:tplc="04190005" w:tentative="1">
+      <w:start w:val="1"/>
+      <w:numFmt w:val="bullet"/>
+      <w:lvlText w:val=""/>
+      <w:lvlJc w:val="left"/>
+      <w:pPr>
+        <w:ind w:left="7189" w:hanging="360"/>
+      </w:pPr>
+      <w:rPr>
+        <w:rFonts w:ascii="Wingdings" w:hAnsi="Wingdings" w:hint="default"/>
+      </w:rPr>
+    </w:lvl>
+  </w:abstractNum>
+  <w:abstractNum w:abstractNumId="20" w15:restartNumberingAfterBreak="0">
     <w:nsid w:val="60C53F88"/>
     <w:multiLevelType w:val="multilevel"/>
     <w:tmpl w:val="78D402FA"/>
@@ -30008,7 +31467,7 @@
       </w:rPr>
     </w:lvl>
   </w:abstractNum>
-  <w:abstractNum w:abstractNumId="20" w15:restartNumberingAfterBreak="0">
+  <w:abstractNum w:abstractNumId="21" w15:restartNumberingAfterBreak="0">
     <w:nsid w:val="67C658B0"/>
     <w:multiLevelType w:val="hybridMultilevel"/>
     <w:tmpl w:val="1BE6BB12"/>
@@ -30120,7 +31579,7 @@
       </w:rPr>
     </w:lvl>
   </w:abstractNum>
-  <w:abstractNum w:abstractNumId="21" w15:restartNumberingAfterBreak="0">
+  <w:abstractNum w:abstractNumId="22" w15:restartNumberingAfterBreak="0">
     <w:nsid w:val="67DB7E98"/>
     <w:multiLevelType w:val="hybridMultilevel"/>
     <w:tmpl w:val="D42882F2"/>
@@ -30233,7 +31692,7 @@
       </w:rPr>
     </w:lvl>
   </w:abstractNum>
-  <w:abstractNum w:abstractNumId="22" w15:restartNumberingAfterBreak="0">
+  <w:abstractNum w:abstractNumId="23" w15:restartNumberingAfterBreak="0">
     <w:nsid w:val="6955234E"/>
     <w:multiLevelType w:val="hybridMultilevel"/>
     <w:tmpl w:val="58E85584"/>
@@ -30346,7 +31805,7 @@
       </w:rPr>
     </w:lvl>
   </w:abstractNum>
-  <w:abstractNum w:abstractNumId="23" w15:restartNumberingAfterBreak="0">
+  <w:abstractNum w:abstractNumId="24" w15:restartNumberingAfterBreak="0">
     <w:nsid w:val="738F0F93"/>
     <w:multiLevelType w:val="hybridMultilevel"/>
     <w:tmpl w:val="5C4E99A2"/>
@@ -30459,7 +31918,7 @@
       </w:rPr>
     </w:lvl>
   </w:abstractNum>
-  <w:abstractNum w:abstractNumId="24" w15:restartNumberingAfterBreak="0">
+  <w:abstractNum w:abstractNumId="25" w15:restartNumberingAfterBreak="0">
     <w:nsid w:val="7492456F"/>
     <w:multiLevelType w:val="hybridMultilevel"/>
     <w:tmpl w:val="DA30138E"/>
@@ -30582,10 +32041,10 @@
     <w:abstractNumId w:val="6"/>
   </w:num>
   <w:num w:numId="4">
-    <w:abstractNumId w:val="19"/>
+    <w:abstractNumId w:val="20"/>
   </w:num>
   <w:num w:numId="5">
-    <w:abstractNumId w:val="20"/>
+    <w:abstractNumId w:val="21"/>
   </w:num>
   <w:num w:numId="6">
     <w:abstractNumId w:val="18"/>
@@ -30606,7 +32065,7 @@
     <w:abstractNumId w:val="5"/>
   </w:num>
   <w:num w:numId="12">
-    <w:abstractNumId w:val="22"/>
+    <w:abstractNumId w:val="23"/>
   </w:num>
   <w:num w:numId="13">
     <w:abstractNumId w:val="15"/>
@@ -30618,7 +32077,7 @@
     <w:abstractNumId w:val="10"/>
   </w:num>
   <w:num w:numId="16">
-    <w:abstractNumId w:val="23"/>
+    <w:abstractNumId w:val="24"/>
   </w:num>
   <w:num w:numId="17">
     <w:abstractNumId w:val="1"/>
@@ -30633,10 +32092,10 @@
     <w:abstractNumId w:val="17"/>
   </w:num>
   <w:num w:numId="21">
-    <w:abstractNumId w:val="24"/>
+    <w:abstractNumId w:val="25"/>
   </w:num>
   <w:num w:numId="22">
-    <w:abstractNumId w:val="21"/>
+    <w:abstractNumId w:val="22"/>
   </w:num>
   <w:num w:numId="23">
     <w:abstractNumId w:val="9"/>
@@ -30646,6 +32105,9 @@
   </w:num>
   <w:num w:numId="25">
     <w:abstractNumId w:val="7"/>
+  </w:num>
+  <w:num w:numId="26">
+    <w:abstractNumId w:val="19"/>
   </w:num>
   <w:numIdMacAtCleanup w:val="24"/>
 </w:numbering>
@@ -31667,7 +33129,7 @@
 </file>
 
 <file path=customXml/itemProps1.xml><?xml version="1.0" encoding="utf-8"?>
-<ds:datastoreItem xmlns:ds="http://schemas.openxmlformats.org/officeDocument/2006/customXml" ds:itemID="{1E0C2814-FCFB-44B9-874B-902073A7D56F}">
+<ds:datastoreItem xmlns:ds="http://schemas.openxmlformats.org/officeDocument/2006/customXml" ds:itemID="{C1ACDCA6-7056-46A4-B72E-60B16966446B}">
   <ds:schemaRefs>
     <ds:schemaRef ds:uri="http://schemas.openxmlformats.org/officeDocument/2006/bibliography"/>
   </ds:schemaRefs>

</xml_diff>

<commit_message>
add drscription for block of Kanban
</commit_message>
<xml_diff>
--- a/документация/Отчет Солдаткина.docx
+++ b/документация/Отчет Солдаткина.docx
@@ -1160,7 +1160,7 @@
         </w:rPr>
         <w:fldChar w:fldCharType="separate"/>
       </w:r>
-      <w:hyperlink w:anchor="_Toc230102727" w:history="1">
+      <w:hyperlink w:anchor="_Toc230104618" w:history="1">
         <w:r>
           <w:rPr>
             <w:rStyle w:val="a9"/>
@@ -1189,7 +1189,7 @@
             <w:noProof/>
             <w:webHidden/>
           </w:rPr>
-          <w:instrText xml:space="preserve"> PAGEREF _Toc230102727 \h </w:instrText>
+          <w:instrText xml:space="preserve"> PAGEREF _Toc230104618 \h </w:instrText>
         </w:r>
         <w:r>
           <w:rPr>
@@ -1233,7 +1233,7 @@
           <w:lang w:eastAsia="ru-RU"/>
         </w:rPr>
       </w:pPr>
-      <w:hyperlink w:anchor="_Toc230102728" w:history="1">
+      <w:hyperlink w:anchor="_Toc230104619" w:history="1">
         <w:r>
           <w:rPr>
             <w:rStyle w:val="a9"/>
@@ -1279,7 +1279,7 @@
             <w:noProof/>
             <w:webHidden/>
           </w:rPr>
-          <w:instrText xml:space="preserve"> PAGEREF _Toc230102728 \h </w:instrText>
+          <w:instrText xml:space="preserve"> PAGEREF _Toc230104619 \h </w:instrText>
         </w:r>
         <w:r>
           <w:rPr>
@@ -1323,7 +1323,7 @@
           <w:lang w:eastAsia="ru-RU"/>
         </w:rPr>
       </w:pPr>
-      <w:hyperlink w:anchor="_Toc230102729" w:history="1">
+      <w:hyperlink w:anchor="_Toc230104620" w:history="1">
         <w:r>
           <w:rPr>
             <w:rStyle w:val="a9"/>
@@ -1369,7 +1369,7 @@
             <w:noProof/>
             <w:webHidden/>
           </w:rPr>
-          <w:instrText xml:space="preserve"> PAGEREF _Toc230102729 \h </w:instrText>
+          <w:instrText xml:space="preserve"> PAGEREF _Toc230104620 \h </w:instrText>
         </w:r>
         <w:r>
           <w:rPr>
@@ -1413,7 +1413,7 @@
           <w:lang w:eastAsia="ru-RU"/>
         </w:rPr>
       </w:pPr>
-      <w:hyperlink w:anchor="_Toc230102730" w:history="1">
+      <w:hyperlink w:anchor="_Toc230104621" w:history="1">
         <w:r>
           <w:rPr>
             <w:rStyle w:val="a9"/>
@@ -1459,7 +1459,7 @@
             <w:noProof/>
             <w:webHidden/>
           </w:rPr>
-          <w:instrText xml:space="preserve"> PAGEREF _Toc230102730 \h </w:instrText>
+          <w:instrText xml:space="preserve"> PAGEREF _Toc230104621 \h </w:instrText>
         </w:r>
         <w:r>
           <w:rPr>
@@ -1503,7 +1503,7 @@
           <w:lang w:eastAsia="ru-RU"/>
         </w:rPr>
       </w:pPr>
-      <w:hyperlink w:anchor="_Toc230102731" w:history="1">
+      <w:hyperlink w:anchor="_Toc230104622" w:history="1">
         <w:r>
           <w:rPr>
             <w:rStyle w:val="a9"/>
@@ -1551,7 +1551,7 @@
             <w:noProof/>
             <w:webHidden/>
           </w:rPr>
-          <w:instrText xml:space="preserve"> PAGEREF _Toc230102731 \h </w:instrText>
+          <w:instrText xml:space="preserve"> PAGEREF _Toc230104622 \h </w:instrText>
         </w:r>
         <w:r>
           <w:rPr>
@@ -1595,7 +1595,7 @@
           <w:lang w:eastAsia="ru-RU"/>
         </w:rPr>
       </w:pPr>
-      <w:hyperlink w:anchor="_Toc230102732" w:history="1">
+      <w:hyperlink w:anchor="_Toc230104623" w:history="1">
         <w:r>
           <w:rPr>
             <w:rStyle w:val="a9"/>
@@ -1641,7 +1641,7 @@
             <w:noProof/>
             <w:webHidden/>
           </w:rPr>
-          <w:instrText xml:space="preserve"> PAGEREF _Toc230102732 \h </w:instrText>
+          <w:instrText xml:space="preserve"> PAGEREF _Toc230104623 \h </w:instrText>
         </w:r>
         <w:r>
           <w:rPr>
@@ -1685,7 +1685,7 @@
           <w:lang w:eastAsia="ru-RU"/>
         </w:rPr>
       </w:pPr>
-      <w:hyperlink w:anchor="_Toc230102733" w:history="1">
+      <w:hyperlink w:anchor="_Toc230104624" w:history="1">
         <w:r>
           <w:rPr>
             <w:rStyle w:val="a9"/>
@@ -1731,7 +1731,7 @@
             <w:noProof/>
             <w:webHidden/>
           </w:rPr>
-          <w:instrText xml:space="preserve"> PAGEREF _Toc230102733 \h </w:instrText>
+          <w:instrText xml:space="preserve"> PAGEREF _Toc230104624 \h </w:instrText>
         </w:r>
         <w:r>
           <w:rPr>
@@ -1775,7 +1775,7 @@
           <w:lang w:eastAsia="ru-RU"/>
         </w:rPr>
       </w:pPr>
-      <w:hyperlink w:anchor="_Toc230102734" w:history="1">
+      <w:hyperlink w:anchor="_Toc230104625" w:history="1">
         <w:r>
           <w:rPr>
             <w:rStyle w:val="a9"/>
@@ -1821,7 +1821,7 @@
             <w:noProof/>
             <w:webHidden/>
           </w:rPr>
-          <w:instrText xml:space="preserve"> PAGEREF _Toc230102734 \h </w:instrText>
+          <w:instrText xml:space="preserve"> PAGEREF _Toc230104625 \h </w:instrText>
         </w:r>
         <w:r>
           <w:rPr>
@@ -1865,7 +1865,7 @@
           <w:lang w:eastAsia="ru-RU"/>
         </w:rPr>
       </w:pPr>
-      <w:hyperlink w:anchor="_Toc230102735" w:history="1">
+      <w:hyperlink w:anchor="_Toc230104626" w:history="1">
         <w:r>
           <w:rPr>
             <w:rStyle w:val="a9"/>
@@ -1911,7 +1911,7 @@
             <w:noProof/>
             <w:webHidden/>
           </w:rPr>
-          <w:instrText xml:space="preserve"> PAGEREF _Toc230102735 \h </w:instrText>
+          <w:instrText xml:space="preserve"> PAGEREF _Toc230104626 \h </w:instrText>
         </w:r>
         <w:r>
           <w:rPr>
@@ -1955,7 +1955,7 @@
           <w:lang w:eastAsia="ru-RU"/>
         </w:rPr>
       </w:pPr>
-      <w:hyperlink w:anchor="_Toc230102736" w:history="1">
+      <w:hyperlink w:anchor="_Toc230104627" w:history="1">
         <w:r>
           <w:rPr>
             <w:rStyle w:val="a9"/>
@@ -2001,7 +2001,7 @@
             <w:noProof/>
             <w:webHidden/>
           </w:rPr>
-          <w:instrText xml:space="preserve"> PAGEREF _Toc230102736 \h </w:instrText>
+          <w:instrText xml:space="preserve"> PAGEREF _Toc230104627 \h </w:instrText>
         </w:r>
         <w:r>
           <w:rPr>
@@ -2045,7 +2045,7 @@
           <w:lang w:eastAsia="ru-RU"/>
         </w:rPr>
       </w:pPr>
-      <w:hyperlink w:anchor="_Toc230102737" w:history="1">
+      <w:hyperlink w:anchor="_Toc230104628" w:history="1">
         <w:r>
           <w:rPr>
             <w:rStyle w:val="a9"/>
@@ -2091,7 +2091,7 @@
             <w:noProof/>
             <w:webHidden/>
           </w:rPr>
-          <w:instrText xml:space="preserve"> PAGEREF _Toc230102737 \h </w:instrText>
+          <w:instrText xml:space="preserve"> PAGEREF _Toc230104628 \h </w:instrText>
         </w:r>
         <w:r>
           <w:rPr>
@@ -2135,7 +2135,7 @@
           <w:lang w:eastAsia="ru-RU"/>
         </w:rPr>
       </w:pPr>
-      <w:hyperlink w:anchor="_Toc230102738" w:history="1">
+      <w:hyperlink w:anchor="_Toc230104629" w:history="1">
         <w:r>
           <w:rPr>
             <w:rStyle w:val="a9"/>
@@ -2181,7 +2181,7 @@
             <w:noProof/>
             <w:webHidden/>
           </w:rPr>
-          <w:instrText xml:space="preserve"> PAGEREF _Toc230102738 \h </w:instrText>
+          <w:instrText xml:space="preserve"> PAGEREF _Toc230104629 \h </w:instrText>
         </w:r>
         <w:r>
           <w:rPr>
@@ -2225,7 +2225,7 @@
           <w:lang w:eastAsia="ru-RU"/>
         </w:rPr>
       </w:pPr>
-      <w:hyperlink w:anchor="_Toc230102739" w:history="1">
+      <w:hyperlink w:anchor="_Toc230104630" w:history="1">
         <w:r>
           <w:rPr>
             <w:rStyle w:val="a9"/>
@@ -2271,7 +2271,7 @@
             <w:noProof/>
             <w:webHidden/>
           </w:rPr>
-          <w:instrText xml:space="preserve"> PAGEREF _Toc230102739 \h </w:instrText>
+          <w:instrText xml:space="preserve"> PAGEREF _Toc230104630 \h </w:instrText>
         </w:r>
         <w:r>
           <w:rPr>
@@ -2315,7 +2315,7 @@
           <w:lang w:eastAsia="ru-RU"/>
         </w:rPr>
       </w:pPr>
-      <w:hyperlink w:anchor="_Toc230102740" w:history="1">
+      <w:hyperlink w:anchor="_Toc230104631" w:history="1">
         <w:r>
           <w:rPr>
             <w:rStyle w:val="a9"/>
@@ -2361,7 +2361,7 @@
             <w:noProof/>
             <w:webHidden/>
           </w:rPr>
-          <w:instrText xml:space="preserve"> PAGEREF _Toc230102740 \h </w:instrText>
+          <w:instrText xml:space="preserve"> PAGEREF _Toc230104631 \h </w:instrText>
         </w:r>
         <w:r>
           <w:rPr>
@@ -2405,7 +2405,7 @@
           <w:lang w:eastAsia="ru-RU"/>
         </w:rPr>
       </w:pPr>
-      <w:hyperlink w:anchor="_Toc230102741" w:history="1">
+      <w:hyperlink w:anchor="_Toc230104632" w:history="1">
         <w:r>
           <w:rPr>
             <w:rStyle w:val="a9"/>
@@ -2451,7 +2451,7 @@
             <w:noProof/>
             <w:webHidden/>
           </w:rPr>
-          <w:instrText xml:space="preserve"> PAGEREF _Toc230102741 \h </w:instrText>
+          <w:instrText xml:space="preserve"> PAGEREF _Toc230104632 \h </w:instrText>
         </w:r>
         <w:r>
           <w:rPr>
@@ -2495,7 +2495,7 @@
           <w:lang w:eastAsia="ru-RU"/>
         </w:rPr>
       </w:pPr>
-      <w:hyperlink w:anchor="_Toc230102742" w:history="1">
+      <w:hyperlink w:anchor="_Toc230104633" w:history="1">
         <w:r>
           <w:rPr>
             <w:rStyle w:val="a9"/>
@@ -2541,7 +2541,7 @@
             <w:noProof/>
             <w:webHidden/>
           </w:rPr>
-          <w:instrText xml:space="preserve"> PAGEREF _Toc230102742 \h </w:instrText>
+          <w:instrText xml:space="preserve"> PAGEREF _Toc230104633 \h </w:instrText>
         </w:r>
         <w:r>
           <w:rPr>
@@ -2585,7 +2585,7 @@
           <w:lang w:eastAsia="ru-RU"/>
         </w:rPr>
       </w:pPr>
-      <w:hyperlink w:anchor="_Toc230102743" w:history="1">
+      <w:hyperlink w:anchor="_Toc230104634" w:history="1">
         <w:r>
           <w:rPr>
             <w:rStyle w:val="a9"/>
@@ -2631,7 +2631,7 @@
             <w:noProof/>
             <w:webHidden/>
           </w:rPr>
-          <w:instrText xml:space="preserve"> PAGEREF _Toc230102743 \h </w:instrText>
+          <w:instrText xml:space="preserve"> PAGEREF _Toc230104634 \h </w:instrText>
         </w:r>
         <w:r>
           <w:rPr>
@@ -2675,7 +2675,7 @@
           <w:lang w:eastAsia="ru-RU"/>
         </w:rPr>
       </w:pPr>
-      <w:hyperlink w:anchor="_Toc230102744" w:history="1">
+      <w:hyperlink w:anchor="_Toc230104635" w:history="1">
         <w:r>
           <w:rPr>
             <w:rStyle w:val="a9"/>
@@ -2721,7 +2721,7 @@
             <w:noProof/>
             <w:webHidden/>
           </w:rPr>
-          <w:instrText xml:space="preserve"> PAGEREF _Toc230102744 \h </w:instrText>
+          <w:instrText xml:space="preserve"> PAGEREF _Toc230104635 \h </w:instrText>
         </w:r>
         <w:r>
           <w:rPr>
@@ -2765,7 +2765,7 @@
           <w:lang w:eastAsia="ru-RU"/>
         </w:rPr>
       </w:pPr>
-      <w:hyperlink w:anchor="_Toc230102745" w:history="1">
+      <w:hyperlink w:anchor="_Toc230104636" w:history="1">
         <w:r>
           <w:rPr>
             <w:rStyle w:val="a9"/>
@@ -2811,7 +2811,7 @@
             <w:noProof/>
             <w:webHidden/>
           </w:rPr>
-          <w:instrText xml:space="preserve"> PAGEREF _Toc230102745 \h </w:instrText>
+          <w:instrText xml:space="preserve"> PAGEREF _Toc230104636 \h </w:instrText>
         </w:r>
         <w:r>
           <w:rPr>
@@ -2855,7 +2855,7 @@
           <w:lang w:eastAsia="ru-RU"/>
         </w:rPr>
       </w:pPr>
-      <w:hyperlink w:anchor="_Toc230102746" w:history="1">
+      <w:hyperlink w:anchor="_Toc230104637" w:history="1">
         <w:r>
           <w:rPr>
             <w:rStyle w:val="a9"/>
@@ -2901,7 +2901,7 @@
             <w:noProof/>
             <w:webHidden/>
           </w:rPr>
-          <w:instrText xml:space="preserve"> PAGEREF _Toc230102746 \h </w:instrText>
+          <w:instrText xml:space="preserve"> PAGEREF _Toc230104637 \h </w:instrText>
         </w:r>
         <w:r>
           <w:rPr>
@@ -2945,7 +2945,7 @@
           <w:lang w:eastAsia="ru-RU"/>
         </w:rPr>
       </w:pPr>
-      <w:hyperlink w:anchor="_Toc230102747" w:history="1">
+      <w:hyperlink w:anchor="_Toc230104638" w:history="1">
         <w:r>
           <w:rPr>
             <w:rStyle w:val="a9"/>
@@ -2991,7 +2991,7 @@
             <w:noProof/>
             <w:webHidden/>
           </w:rPr>
-          <w:instrText xml:space="preserve"> PAGEREF _Toc230102747 \h </w:instrText>
+          <w:instrText xml:space="preserve"> PAGEREF _Toc230104638 \h </w:instrText>
         </w:r>
         <w:r>
           <w:rPr>
@@ -3035,7 +3035,7 @@
           <w:lang w:eastAsia="ru-RU"/>
         </w:rPr>
       </w:pPr>
-      <w:hyperlink w:anchor="_Toc230102748" w:history="1">
+      <w:hyperlink w:anchor="_Toc230104639" w:history="1">
         <w:r>
           <w:rPr>
             <w:rStyle w:val="a9"/>
@@ -3081,7 +3081,7 @@
             <w:noProof/>
             <w:webHidden/>
           </w:rPr>
-          <w:instrText xml:space="preserve"> PAGEREF _Toc230102748 \h </w:instrText>
+          <w:instrText xml:space="preserve"> PAGEREF _Toc230104639 \h </w:instrText>
         </w:r>
         <w:r>
           <w:rPr>
@@ -3125,7 +3125,7 @@
           <w:lang w:eastAsia="ru-RU"/>
         </w:rPr>
       </w:pPr>
-      <w:hyperlink w:anchor="_Toc230102749" w:history="1">
+      <w:hyperlink w:anchor="_Toc230104640" w:history="1">
         <w:r>
           <w:rPr>
             <w:rStyle w:val="a9"/>
@@ -3171,7 +3171,7 @@
             <w:noProof/>
             <w:webHidden/>
           </w:rPr>
-          <w:instrText xml:space="preserve"> PAGEREF _Toc230102749 \h </w:instrText>
+          <w:instrText xml:space="preserve"> PAGEREF _Toc230104640 \h </w:instrText>
         </w:r>
         <w:r>
           <w:rPr>
@@ -3215,7 +3215,7 @@
           <w:lang w:eastAsia="ru-RU"/>
         </w:rPr>
       </w:pPr>
-      <w:hyperlink w:anchor="_Toc230102750" w:history="1">
+      <w:hyperlink w:anchor="_Toc230104641" w:history="1">
         <w:r>
           <w:rPr>
             <w:rStyle w:val="a9"/>
@@ -3261,7 +3261,7 @@
             <w:noProof/>
             <w:webHidden/>
           </w:rPr>
-          <w:instrText xml:space="preserve"> PAGEREF _Toc230102750 \h </w:instrText>
+          <w:instrText xml:space="preserve"> PAGEREF _Toc230104641 \h </w:instrText>
         </w:r>
         <w:r>
           <w:rPr>
@@ -3305,7 +3305,7 @@
           <w:lang w:eastAsia="ru-RU"/>
         </w:rPr>
       </w:pPr>
-      <w:hyperlink w:anchor="_Toc230102751" w:history="1">
+      <w:hyperlink w:anchor="_Toc230104642" w:history="1">
         <w:r>
           <w:rPr>
             <w:rStyle w:val="a9"/>
@@ -3351,7 +3351,7 @@
             <w:noProof/>
             <w:webHidden/>
           </w:rPr>
-          <w:instrText xml:space="preserve"> PAGEREF _Toc230102751 \h </w:instrText>
+          <w:instrText xml:space="preserve"> PAGEREF _Toc230104642 \h </w:instrText>
         </w:r>
         <w:r>
           <w:rPr>
@@ -3395,7 +3395,7 @@
           <w:lang w:eastAsia="ru-RU"/>
         </w:rPr>
       </w:pPr>
-      <w:hyperlink w:anchor="_Toc230102752" w:history="1">
+      <w:hyperlink w:anchor="_Toc230104643" w:history="1">
         <w:r>
           <w:rPr>
             <w:rStyle w:val="a9"/>
@@ -3441,7 +3441,7 @@
             <w:noProof/>
             <w:webHidden/>
           </w:rPr>
-          <w:instrText xml:space="preserve"> PAGEREF _Toc230102752 \h </w:instrText>
+          <w:instrText xml:space="preserve"> PAGEREF _Toc230104643 \h </w:instrText>
         </w:r>
         <w:r>
           <w:rPr>
@@ -3485,7 +3485,7 @@
           <w:lang w:eastAsia="ru-RU"/>
         </w:rPr>
       </w:pPr>
-      <w:hyperlink w:anchor="_Toc230102753" w:history="1">
+      <w:hyperlink w:anchor="_Toc230104644" w:history="1">
         <w:r>
           <w:rPr>
             <w:rStyle w:val="a9"/>
@@ -3527,7 +3527,7 @@
             <w:noProof/>
             <w:webHidden/>
           </w:rPr>
-          <w:instrText xml:space="preserve"> PAGEREF _Toc230102753 \h </w:instrText>
+          <w:instrText xml:space="preserve"> PAGEREF _Toc230104644 \h </w:instrText>
         </w:r>
         <w:r>
           <w:rPr>
@@ -3571,7 +3571,7 @@
           <w:lang w:eastAsia="ru-RU"/>
         </w:rPr>
       </w:pPr>
-      <w:hyperlink w:anchor="_Toc230102754" w:history="1">
+      <w:hyperlink w:anchor="_Toc230104645" w:history="1">
         <w:r>
           <w:rPr>
             <w:rStyle w:val="a9"/>
@@ -3613,7 +3613,7 @@
             <w:noProof/>
             <w:webHidden/>
           </w:rPr>
-          <w:instrText xml:space="preserve"> PAGEREF _Toc230102754 \h </w:instrText>
+          <w:instrText xml:space="preserve"> PAGEREF _Toc230104645 \h </w:instrText>
         </w:r>
         <w:r>
           <w:rPr>
@@ -3657,7 +3657,7 @@
           <w:lang w:eastAsia="ru-RU"/>
         </w:rPr>
       </w:pPr>
-      <w:hyperlink w:anchor="_Toc230102755" w:history="1">
+      <w:hyperlink w:anchor="_Toc230104646" w:history="1">
         <w:r>
           <w:rPr>
             <w:rStyle w:val="a9"/>
@@ -3699,7 +3699,7 @@
             <w:noProof/>
             <w:webHidden/>
           </w:rPr>
-          <w:instrText xml:space="preserve"> PAGEREF _Toc230102755 \h </w:instrText>
+          <w:instrText xml:space="preserve"> PAGEREF _Toc230104646 \h </w:instrText>
         </w:r>
         <w:r>
           <w:rPr>
@@ -3743,7 +3743,7 @@
           <w:lang w:eastAsia="ru-RU"/>
         </w:rPr>
       </w:pPr>
-      <w:hyperlink w:anchor="_Toc230102756" w:history="1">
+      <w:hyperlink w:anchor="_Toc230104647" w:history="1">
         <w:r>
           <w:rPr>
             <w:rStyle w:val="a9"/>
@@ -3785,7 +3785,7 @@
             <w:noProof/>
             <w:webHidden/>
           </w:rPr>
-          <w:instrText xml:space="preserve"> PAGEREF _Toc230102756 \h </w:instrText>
+          <w:instrText xml:space="preserve"> PAGEREF _Toc230104647 \h </w:instrText>
         </w:r>
         <w:r>
           <w:rPr>
@@ -3829,7 +3829,7 @@
           <w:lang w:eastAsia="ru-RU"/>
         </w:rPr>
       </w:pPr>
-      <w:hyperlink w:anchor="_Toc230102757" w:history="1">
+      <w:hyperlink w:anchor="_Toc230104648" w:history="1">
         <w:r>
           <w:rPr>
             <w:rStyle w:val="a9"/>
@@ -3871,7 +3871,7 @@
             <w:noProof/>
             <w:webHidden/>
           </w:rPr>
-          <w:instrText xml:space="preserve"> PAGEREF _Toc230102757 \h </w:instrText>
+          <w:instrText xml:space="preserve"> PAGEREF _Toc230104648 \h </w:instrText>
         </w:r>
         <w:r>
           <w:rPr>
@@ -3915,7 +3915,7 @@
           <w:lang w:eastAsia="ru-RU"/>
         </w:rPr>
       </w:pPr>
-      <w:hyperlink w:anchor="_Toc230102758" w:history="1">
+      <w:hyperlink w:anchor="_Toc230104649" w:history="1">
         <w:r>
           <w:rPr>
             <w:rStyle w:val="a9"/>
@@ -3957,7 +3957,7 @@
             <w:noProof/>
             <w:webHidden/>
           </w:rPr>
-          <w:instrText xml:space="preserve"> PAGEREF _Toc230102758 \h </w:instrText>
+          <w:instrText xml:space="preserve"> PAGEREF _Toc230104649 \h </w:instrText>
         </w:r>
         <w:r>
           <w:rPr>
@@ -4001,7 +4001,7 @@
           <w:lang w:eastAsia="ru-RU"/>
         </w:rPr>
       </w:pPr>
-      <w:hyperlink w:anchor="_Toc230102759" w:history="1">
+      <w:hyperlink w:anchor="_Toc230104650" w:history="1">
         <w:r>
           <w:rPr>
             <w:rStyle w:val="a9"/>
@@ -4043,7 +4043,7 @@
             <w:noProof/>
             <w:webHidden/>
           </w:rPr>
-          <w:instrText xml:space="preserve"> PAGEREF _Toc230102759 \h </w:instrText>
+          <w:instrText xml:space="preserve"> PAGEREF _Toc230104650 \h </w:instrText>
         </w:r>
         <w:r>
           <w:rPr>
@@ -4087,7 +4087,7 @@
           <w:lang w:eastAsia="ru-RU"/>
         </w:rPr>
       </w:pPr>
-      <w:hyperlink w:anchor="_Toc230102760" w:history="1">
+      <w:hyperlink w:anchor="_Toc230104651" w:history="1">
         <w:r>
           <w:rPr>
             <w:rStyle w:val="a9"/>
@@ -4129,7 +4129,7 @@
             <w:noProof/>
             <w:webHidden/>
           </w:rPr>
-          <w:instrText xml:space="preserve"> PAGEREF _Toc230102760 \h </w:instrText>
+          <w:instrText xml:space="preserve"> PAGEREF _Toc230104651 \h </w:instrText>
         </w:r>
         <w:r>
           <w:rPr>
@@ -4173,7 +4173,7 @@
           <w:lang w:eastAsia="ru-RU"/>
         </w:rPr>
       </w:pPr>
-      <w:hyperlink w:anchor="_Toc230102761" w:history="1">
+      <w:hyperlink w:anchor="_Toc230104652" w:history="1">
         <w:r>
           <w:rPr>
             <w:rStyle w:val="a9"/>
@@ -4215,7 +4215,7 @@
             <w:noProof/>
             <w:webHidden/>
           </w:rPr>
-          <w:instrText xml:space="preserve"> PAGEREF _Toc230102761 \h </w:instrText>
+          <w:instrText xml:space="preserve"> PAGEREF _Toc230104652 \h </w:instrText>
         </w:r>
         <w:r>
           <w:rPr>
@@ -4259,7 +4259,7 @@
           <w:lang w:eastAsia="ru-RU"/>
         </w:rPr>
       </w:pPr>
-      <w:hyperlink w:anchor="_Toc230102762" w:history="1">
+      <w:hyperlink w:anchor="_Toc230104653" w:history="1">
         <w:r>
           <w:rPr>
             <w:rStyle w:val="a9"/>
@@ -4301,7 +4301,7 @@
             <w:noProof/>
             <w:webHidden/>
           </w:rPr>
-          <w:instrText xml:space="preserve"> PAGEREF _Toc230102762 \h </w:instrText>
+          <w:instrText xml:space="preserve"> PAGEREF _Toc230104653 \h </w:instrText>
         </w:r>
         <w:r>
           <w:rPr>
@@ -4345,7 +4345,7 @@
           <w:lang w:eastAsia="ru-RU"/>
         </w:rPr>
       </w:pPr>
-      <w:hyperlink w:anchor="_Toc230102763" w:history="1">
+      <w:hyperlink w:anchor="_Toc230104654" w:history="1">
         <w:r>
           <w:rPr>
             <w:rStyle w:val="a9"/>
@@ -4393,7 +4393,7 @@
             <w:noProof/>
             <w:webHidden/>
           </w:rPr>
-          <w:instrText xml:space="preserve"> PAGEREF _Toc230102763 \h </w:instrText>
+          <w:instrText xml:space="preserve"> PAGEREF _Toc230104654 \h </w:instrText>
         </w:r>
         <w:r>
           <w:rPr>
@@ -4437,7 +4437,7 @@
           <w:lang w:eastAsia="ru-RU"/>
         </w:rPr>
       </w:pPr>
-      <w:hyperlink w:anchor="_Toc230102764" w:history="1">
+      <w:hyperlink w:anchor="_Toc230104655" w:history="1">
         <w:r>
           <w:rPr>
             <w:rStyle w:val="a9"/>
@@ -4483,7 +4483,7 @@
             <w:noProof/>
             <w:webHidden/>
           </w:rPr>
-          <w:instrText xml:space="preserve"> PAGEREF _Toc230102764 \h </w:instrText>
+          <w:instrText xml:space="preserve"> PAGEREF _Toc230104655 \h </w:instrText>
         </w:r>
         <w:r>
           <w:rPr>
@@ -4527,7 +4527,7 @@
           <w:lang w:eastAsia="ru-RU"/>
         </w:rPr>
       </w:pPr>
-      <w:hyperlink w:anchor="_Toc230102765" w:history="1">
+      <w:hyperlink w:anchor="_Toc230104656" w:history="1">
         <w:r>
           <w:rPr>
             <w:rStyle w:val="a9"/>
@@ -4573,7 +4573,7 @@
             <w:noProof/>
             <w:webHidden/>
           </w:rPr>
-          <w:instrText xml:space="preserve"> PAGEREF _Toc230102765 \h </w:instrText>
+          <w:instrText xml:space="preserve"> PAGEREF _Toc230104656 \h </w:instrText>
         </w:r>
         <w:r>
           <w:rPr>
@@ -4617,7 +4617,7 @@
           <w:lang w:eastAsia="ru-RU"/>
         </w:rPr>
       </w:pPr>
-      <w:hyperlink w:anchor="_Toc230102766" w:history="1">
+      <w:hyperlink w:anchor="_Toc230104657" w:history="1">
         <w:r>
           <w:rPr>
             <w:rStyle w:val="a9"/>
@@ -4665,7 +4665,7 @@
             <w:noProof/>
             <w:webHidden/>
           </w:rPr>
-          <w:instrText xml:space="preserve"> PAGEREF _Toc230102766 \h </w:instrText>
+          <w:instrText xml:space="preserve"> PAGEREF _Toc230104657 \h </w:instrText>
         </w:r>
         <w:r>
           <w:rPr>
@@ -4709,7 +4709,7 @@
           <w:lang w:eastAsia="ru-RU"/>
         </w:rPr>
       </w:pPr>
-      <w:hyperlink w:anchor="_Toc230102767" w:history="1">
+      <w:hyperlink w:anchor="_Toc230104658" w:history="1">
         <w:r>
           <w:rPr>
             <w:rStyle w:val="a9"/>
@@ -4757,7 +4757,7 @@
             <w:noProof/>
             <w:webHidden/>
           </w:rPr>
-          <w:instrText xml:space="preserve"> PAGEREF _Toc230102767 \h </w:instrText>
+          <w:instrText xml:space="preserve"> PAGEREF _Toc230104658 \h </w:instrText>
         </w:r>
         <w:r>
           <w:rPr>
@@ -4800,7 +4800,7 @@
           <w:lang w:eastAsia="ru-RU"/>
         </w:rPr>
       </w:pPr>
-      <w:hyperlink w:anchor="_Toc230102768" w:history="1">
+      <w:hyperlink w:anchor="_Toc230104659" w:history="1">
         <w:r>
           <w:rPr>
             <w:rStyle w:val="a9"/>
@@ -4830,7 +4830,7 @@
             <w:noProof/>
             <w:webHidden/>
           </w:rPr>
-          <w:instrText xml:space="preserve"> PAGEREF _Toc230102768 \h </w:instrText>
+          <w:instrText xml:space="preserve"> PAGEREF _Toc230104659 \h </w:instrText>
         </w:r>
         <w:r>
           <w:rPr>
@@ -4850,7 +4850,7 @@
             <w:noProof/>
             <w:webHidden/>
           </w:rPr>
-          <w:t>55</w:t>
+          <w:t>57</w:t>
         </w:r>
         <w:r>
           <w:rPr>
@@ -4912,7 +4912,7 @@
         </w:rPr>
       </w:pPr>
       <w:bookmarkStart w:id="3" w:name="_Toc229829439"/>
-      <w:bookmarkStart w:id="4" w:name="_Toc230102727"/>
+      <w:bookmarkStart w:id="4" w:name="_Toc230104618"/>
       <w:r>
         <w:rPr>
           <w:rFonts w:eastAsia="Times New Roman"/>
@@ -5824,7 +5824,7 @@
         </w:rPr>
       </w:pPr>
       <w:bookmarkStart w:id="5" w:name="_Toc229829440"/>
-      <w:bookmarkStart w:id="6" w:name="_Toc230102728"/>
+      <w:bookmarkStart w:id="6" w:name="_Toc230104619"/>
       <w:r>
         <w:rPr>
           <w:rFonts w:eastAsia="Times New Roman"/>
@@ -5849,7 +5849,7 @@
         </w:rPr>
       </w:pPr>
       <w:bookmarkStart w:id="7" w:name="_Toc229829441"/>
-      <w:bookmarkStart w:id="8" w:name="_Toc230102729"/>
+      <w:bookmarkStart w:id="8" w:name="_Toc230104620"/>
       <w:r>
         <w:rPr>
           <w:rFonts w:eastAsia="Times New Roman"/>
@@ -6548,7 +6548,7 @@
         </w:rPr>
       </w:pPr>
       <w:bookmarkStart w:id="9" w:name="_Toc229829442"/>
-      <w:bookmarkStart w:id="10" w:name="_Toc230102730"/>
+      <w:bookmarkStart w:id="10" w:name="_Toc230104621"/>
       <w:r>
         <w:rPr>
           <w:rFonts w:eastAsia="Times New Roman"/>
@@ -20020,7 +20020,7 @@
         </w:rPr>
       </w:pPr>
       <w:bookmarkStart w:id="11" w:name="_Toc229829443"/>
-      <w:bookmarkStart w:id="12" w:name="_Toc230102731"/>
+      <w:bookmarkStart w:id="12" w:name="_Toc230104622"/>
       <w:r>
         <w:rPr>
           <w:rFonts w:eastAsia="Times New Roman"/>
@@ -20069,7 +20069,7 @@
         </w:rPr>
       </w:pPr>
       <w:bookmarkStart w:id="13" w:name="_Toc229829444"/>
-      <w:bookmarkStart w:id="14" w:name="_Toc230102732"/>
+      <w:bookmarkStart w:id="14" w:name="_Toc230104623"/>
       <w:r>
         <w:rPr>
           <w:rFonts w:eastAsia="Times New Roman"/>
@@ -20093,7 +20093,7 @@
         </w:rPr>
       </w:pPr>
       <w:bookmarkStart w:id="15" w:name="_Toc229829445"/>
-      <w:bookmarkStart w:id="16" w:name="_Toc230102733"/>
+      <w:bookmarkStart w:id="16" w:name="_Toc230104624"/>
       <w:r>
         <w:rPr>
           <w:rFonts w:eastAsia="Times New Roman"/>
@@ -20489,7 +20489,7 @@
         </w:rPr>
       </w:pPr>
       <w:bookmarkStart w:id="17" w:name="_Toc229829446"/>
-      <w:bookmarkStart w:id="18" w:name="_Toc230102734"/>
+      <w:bookmarkStart w:id="18" w:name="_Toc230104625"/>
       <w:r>
         <w:rPr>
           <w:rFonts w:eastAsia="Times New Roman"/>
@@ -20668,7 +20668,7 @@
         </w:rPr>
       </w:pPr>
       <w:bookmarkStart w:id="19" w:name="_Toc229829447"/>
-      <w:bookmarkStart w:id="20" w:name="_Toc230102735"/>
+      <w:bookmarkStart w:id="20" w:name="_Toc230104626"/>
       <w:r>
         <w:rPr>
           <w:rFonts w:eastAsia="Times New Roman"/>
@@ -20693,7 +20693,7 @@
         </w:rPr>
       </w:pPr>
       <w:bookmarkStart w:id="21" w:name="_Toc229829448"/>
-      <w:bookmarkStart w:id="22" w:name="_Toc230102736"/>
+      <w:bookmarkStart w:id="22" w:name="_Toc230104627"/>
       <w:r>
         <w:rPr>
           <w:rFonts w:eastAsia="Times New Roman"/>
@@ -21095,7 +21095,7 @@
         </w:rPr>
       </w:pPr>
       <w:bookmarkStart w:id="23" w:name="_Toc229829449"/>
-      <w:bookmarkStart w:id="24" w:name="_Toc230102737"/>
+      <w:bookmarkStart w:id="24" w:name="_Toc230104628"/>
       <w:r>
         <w:rPr>
           <w:rFonts w:eastAsia="Times New Roman"/>
@@ -21288,7 +21288,7 @@
         </w:rPr>
       </w:pPr>
       <w:bookmarkStart w:id="25" w:name="_Toc229829450"/>
-      <w:bookmarkStart w:id="26" w:name="_Toc230102738"/>
+      <w:bookmarkStart w:id="26" w:name="_Toc230104629"/>
       <w:r>
         <w:rPr>
           <w:rFonts w:eastAsia="Times New Roman"/>
@@ -21313,7 +21313,7 @@
         </w:rPr>
       </w:pPr>
       <w:bookmarkStart w:id="27" w:name="_Toc229829451"/>
-      <w:bookmarkStart w:id="28" w:name="_Toc230102739"/>
+      <w:bookmarkStart w:id="28" w:name="_Toc230104630"/>
       <w:r>
         <w:rPr>
           <w:rFonts w:eastAsia="Times New Roman"/>
@@ -21428,7 +21428,7 @@
           <w:lang w:eastAsia="ru-RU"/>
         </w:rPr>
       </w:pPr>
-      <w:bookmarkStart w:id="29" w:name="_Toc230102740"/>
+      <w:bookmarkStart w:id="29" w:name="_Toc230104631"/>
       <w:r>
         <w:rPr>
           <w:rFonts w:eastAsia="Times New Roman"/>
@@ -21528,7 +21528,7 @@
           <w:lang w:eastAsia="ru-RU"/>
         </w:rPr>
       </w:pPr>
-      <w:bookmarkStart w:id="30" w:name="_Toc230102741"/>
+      <w:bookmarkStart w:id="30" w:name="_Toc230104632"/>
       <w:r>
         <w:rPr>
           <w:rFonts w:eastAsia="Times New Roman"/>
@@ -21819,7 +21819,7 @@
           <w:lang w:eastAsia="ru-RU"/>
         </w:rPr>
       </w:pPr>
-      <w:bookmarkStart w:id="31" w:name="_Toc230102742"/>
+      <w:bookmarkStart w:id="31" w:name="_Toc230104633"/>
       <w:r>
         <w:rPr>
           <w:rFonts w:eastAsia="Times New Roman"/>
@@ -22128,7 +22128,7 @@
         </w:rPr>
       </w:pPr>
       <w:bookmarkStart w:id="32" w:name="_Toc229829452"/>
-      <w:bookmarkStart w:id="33" w:name="_Toc230102743"/>
+      <w:bookmarkStart w:id="33" w:name="_Toc230104634"/>
       <w:r>
         <w:rPr>
           <w:rFonts w:eastAsia="Times New Roman"/>
@@ -22321,7 +22321,7 @@
         </w:rPr>
       </w:pPr>
       <w:bookmarkStart w:id="34" w:name="_Toc229829453"/>
-      <w:bookmarkStart w:id="35" w:name="_Toc230102744"/>
+      <w:bookmarkStart w:id="35" w:name="_Toc230104635"/>
       <w:r>
         <w:rPr>
           <w:rFonts w:eastAsia="Times New Roman"/>
@@ -22344,7 +22344,7 @@
           <w:lang w:eastAsia="ru-RU"/>
         </w:rPr>
       </w:pPr>
-      <w:bookmarkStart w:id="36" w:name="_Toc230102745"/>
+      <w:bookmarkStart w:id="36" w:name="_Toc230104636"/>
       <w:r>
         <w:rPr>
           <w:rFonts w:eastAsia="Times New Roman"/>
@@ -22445,7 +22445,7 @@
         </w:rPr>
       </w:pPr>
       <w:bookmarkStart w:id="37" w:name="_Toc229829454"/>
-      <w:bookmarkStart w:id="38" w:name="_Toc230102746"/>
+      <w:bookmarkStart w:id="38" w:name="_Toc230104637"/>
       <w:r>
         <w:rPr>
           <w:rFonts w:eastAsia="Times New Roman"/>
@@ -22616,7 +22616,7 @@
         </w:rPr>
       </w:pPr>
       <w:bookmarkStart w:id="39" w:name="_Toc229829455"/>
-      <w:bookmarkStart w:id="40" w:name="_Toc230102747"/>
+      <w:bookmarkStart w:id="40" w:name="_Toc230104638"/>
       <w:r>
         <w:rPr>
           <w:rFonts w:eastAsia="Times New Roman"/>
@@ -22814,7 +22814,7 @@
         </w:rPr>
       </w:pPr>
       <w:bookmarkStart w:id="41" w:name="_Toc229829456"/>
-      <w:bookmarkStart w:id="42" w:name="_Toc230102748"/>
+      <w:bookmarkStart w:id="42" w:name="_Toc230104639"/>
       <w:r>
         <w:rPr>
           <w:rFonts w:eastAsia="Times New Roman"/>
@@ -22934,7 +22934,7 @@
         </w:rPr>
       </w:pPr>
       <w:bookmarkStart w:id="43" w:name="_Toc229829457"/>
-      <w:bookmarkStart w:id="44" w:name="_Toc230102749"/>
+      <w:bookmarkStart w:id="44" w:name="_Toc230104640"/>
       <w:r>
         <w:rPr>
           <w:rFonts w:eastAsia="Times New Roman"/>
@@ -23009,7 +23009,7 @@
           <w:lang w:eastAsia="ru-RU"/>
         </w:rPr>
       </w:pPr>
-      <w:bookmarkStart w:id="45" w:name="_Toc230102750"/>
+      <w:bookmarkStart w:id="45" w:name="_Toc230104641"/>
       <w:r>
         <w:rPr>
           <w:rFonts w:eastAsia="Times New Roman"/>
@@ -23221,7 +23221,7 @@
         </w:rPr>
       </w:pPr>
       <w:bookmarkStart w:id="46" w:name="_Toc229829459"/>
-      <w:bookmarkStart w:id="47" w:name="_Toc230102751"/>
+      <w:bookmarkStart w:id="47" w:name="_Toc230104642"/>
       <w:r>
         <w:rPr>
           <w:rFonts w:eastAsia="Times New Roman"/>
@@ -23296,7 +23296,7 @@
         </w:rPr>
       </w:pPr>
       <w:bookmarkStart w:id="48" w:name="_Toc229829460"/>
-      <w:bookmarkStart w:id="49" w:name="_Toc230102752"/>
+      <w:bookmarkStart w:id="49" w:name="_Toc230104643"/>
       <w:r>
         <w:rPr>
           <w:rFonts w:eastAsia="Times New Roman"/>
@@ -24185,7 +24185,7 @@
         </w:numPr>
       </w:pPr>
       <w:bookmarkStart w:id="50" w:name="_Toc229829461"/>
-      <w:bookmarkStart w:id="51" w:name="_Toc230102753"/>
+      <w:bookmarkStart w:id="51" w:name="_Toc230104644"/>
       <w:r>
         <w:t>Диаграмма классов</w:t>
       </w:r>
@@ -24230,7 +24230,7 @@
         <w:ind w:left="1418"/>
       </w:pPr>
       <w:bookmarkStart w:id="52" w:name="_Toc229829462"/>
-      <w:bookmarkStart w:id="53" w:name="_Toc230102754"/>
+      <w:bookmarkStart w:id="53" w:name="_Toc230104645"/>
       <w:r>
         <w:t>Гость и ограниченный доступ</w:t>
       </w:r>
@@ -24284,7 +24284,7 @@
         <w:ind w:left="1418"/>
       </w:pPr>
       <w:bookmarkStart w:id="54" w:name="_Toc229829463"/>
-      <w:bookmarkStart w:id="55" w:name="_Toc230102755"/>
+      <w:bookmarkStart w:id="55" w:name="_Toc230104646"/>
       <w:r>
         <w:t>Зарегистрированный пользователь: полный цикл тестирования</w:t>
       </w:r>
@@ -24689,7 +24689,7 @@
         <w:ind w:left="1418"/>
       </w:pPr>
       <w:bookmarkStart w:id="56" w:name="_Toc229829464"/>
-      <w:bookmarkStart w:id="57" w:name="_Toc230102756"/>
+      <w:bookmarkStart w:id="57" w:name="_Toc230104647"/>
       <w:r>
         <w:t>Администратор: управление контентом</w:t>
       </w:r>
@@ -24930,7 +24930,7 @@
         </w:numPr>
       </w:pPr>
       <w:bookmarkStart w:id="58" w:name="_Toc229829465"/>
-      <w:bookmarkStart w:id="59" w:name="_Toc230102757"/>
+      <w:bookmarkStart w:id="59" w:name="_Toc230104648"/>
       <w:r>
         <w:t>Связи между процессами</w:t>
       </w:r>
@@ -25175,7 +25175,7 @@
         </w:numPr>
       </w:pPr>
       <w:bookmarkStart w:id="60" w:name="_Toc229829466"/>
-      <w:bookmarkStart w:id="61" w:name="_Toc230102758"/>
+      <w:bookmarkStart w:id="61" w:name="_Toc230104649"/>
       <w:r>
         <w:t>Диаграмма компонентов</w:t>
       </w:r>
@@ -25443,7 +25443,7 @@
         </w:numPr>
       </w:pPr>
       <w:bookmarkStart w:id="62" w:name="_Toc229829467"/>
-      <w:bookmarkStart w:id="63" w:name="_Toc230102759"/>
+      <w:bookmarkStart w:id="63" w:name="_Toc230104650"/>
       <w:r>
         <w:t>Диаграмма развертывания</w:t>
       </w:r>
@@ -25488,7 +25488,7 @@
         <w:ind w:left="1418"/>
       </w:pPr>
       <w:bookmarkStart w:id="64" w:name="_Toc229829468"/>
-      <w:bookmarkStart w:id="65" w:name="_Toc230102760"/>
+      <w:bookmarkStart w:id="65" w:name="_Toc230104651"/>
       <w:r>
         <w:t>Узлы и устройства</w:t>
       </w:r>
@@ -25703,7 +25703,7 @@
         </w:rPr>
       </w:pPr>
       <w:bookmarkStart w:id="66" w:name="_Toc229829469"/>
-      <w:bookmarkStart w:id="67" w:name="_Toc230102761"/>
+      <w:bookmarkStart w:id="67" w:name="_Toc230104652"/>
       <w:r>
         <w:rPr>
           <w:rStyle w:val="30"/>
@@ -26010,7 +26010,7 @@
         </w:numPr>
       </w:pPr>
       <w:bookmarkStart w:id="68" w:name="_Toc229829470"/>
-      <w:bookmarkStart w:id="69" w:name="_Toc230102762"/>
+      <w:bookmarkStart w:id="69" w:name="_Toc230104653"/>
       <w:r>
         <w:t>Базы данных</w:t>
       </w:r>
@@ -26378,7 +26378,7 @@
         </w:rPr>
       </w:pPr>
       <w:bookmarkStart w:id="70" w:name="_Toc229829471"/>
-      <w:bookmarkStart w:id="71" w:name="_Toc230102763"/>
+      <w:bookmarkStart w:id="71" w:name="_Toc230104654"/>
       <w:r>
         <w:rPr>
           <w:rFonts w:eastAsia="Times New Roman"/>
@@ -26694,7 +26694,7 @@
           <w:lang w:eastAsia="ru-RU"/>
         </w:rPr>
       </w:pPr>
-      <w:bookmarkStart w:id="72" w:name="_Toc230102764"/>
+      <w:bookmarkStart w:id="72" w:name="_Toc230104655"/>
       <w:r>
         <w:rPr>
           <w:rFonts w:eastAsia="Times New Roman"/>
@@ -28434,7 +28434,7 @@
           <w:lang w:eastAsia="ru-RU"/>
         </w:rPr>
       </w:pPr>
-      <w:bookmarkStart w:id="73" w:name="_Toc230102765"/>
+      <w:bookmarkStart w:id="73" w:name="_Toc230104656"/>
       <w:r>
         <w:rPr>
           <w:rFonts w:eastAsia="Times New Roman"/>
@@ -28638,7 +28638,7 @@
         </w:rPr>
       </w:pPr>
       <w:bookmarkStart w:id="74" w:name="_Toc229829472"/>
-      <w:bookmarkStart w:id="75" w:name="_Toc230102766"/>
+      <w:bookmarkStart w:id="75" w:name="_Toc230104657"/>
       <w:r>
         <w:rPr>
           <w:rFonts w:eastAsia="Times New Roman"/>
@@ -28765,7 +28765,7 @@
         </w:rPr>
       </w:pPr>
       <w:bookmarkStart w:id="76" w:name="_Toc229829473"/>
-      <w:bookmarkStart w:id="77" w:name="_Toc230102767"/>
+      <w:bookmarkStart w:id="77" w:name="_Toc230104658"/>
       <w:r>
         <w:rPr>
           <w:rFonts w:eastAsia="Times New Roman"/>
@@ -28796,23 +28796,920 @@
           <w:rFonts w:ascii="Times New Roman" w:eastAsia="Times New Roman" w:hAnsi="Times New Roman" w:cs="Times New Roman"/>
           <w:sz w:val="28"/>
           <w:szCs w:val="28"/>
-          <w:highlight w:val="yellow"/>
-          <w:lang w:eastAsia="ru-RU"/>
-        </w:rPr>
-        <w:t xml:space="preserve">Про </w:t>
-      </w:r>
+          <w:lang w:eastAsia="ru-RU"/>
+        </w:rPr>
+        <w:t>Для успешного проектирования продукта, на протяжении всего цикла проектирования, реализации и тестирования были использованы следующие вспомогательные инструменты:</w:t>
+      </w:r>
+    </w:p>
+    <w:p>
+      <w:pPr>
+        <w:pStyle w:val="aa"/>
+        <w:numPr>
+          <w:ilvl w:val="0"/>
+          <w:numId w:val="27"/>
+        </w:numPr>
+        <w:spacing w:after="100" w:afterAutospacing="1" w:line="360" w:lineRule="auto"/>
+        <w:ind w:left="0" w:firstLine="709"/>
+        <w:jc w:val="both"/>
+        <w:rPr>
+          <w:rFonts w:ascii="Times New Roman" w:eastAsia="Times New Roman" w:hAnsi="Times New Roman" w:cs="Times New Roman"/>
+          <w:sz w:val="28"/>
+          <w:szCs w:val="28"/>
+          <w:lang w:eastAsia="ru-RU"/>
+        </w:rPr>
+      </w:pPr>
+      <w:r>
+        <w:rPr>
+          <w:rFonts w:ascii="Times New Roman" w:eastAsia="Times New Roman" w:hAnsi="Times New Roman" w:cs="Times New Roman"/>
+          <w:sz w:val="28"/>
+          <w:szCs w:val="28"/>
+          <w:lang w:eastAsia="ru-RU"/>
+        </w:rPr>
+        <w:t xml:space="preserve">Система контроля версий </w:t>
+      </w:r>
+      <w:r>
+        <w:rPr>
+          <w:rFonts w:ascii="Times New Roman" w:eastAsia="Times New Roman" w:hAnsi="Times New Roman" w:cs="Times New Roman"/>
+          <w:sz w:val="28"/>
+          <w:szCs w:val="28"/>
+          <w:lang w:val="en-US" w:eastAsia="ru-RU"/>
+        </w:rPr>
+        <w:t>GitHub</w:t>
+      </w:r>
+      <w:r>
+        <w:rPr>
+          <w:rFonts w:ascii="Times New Roman" w:eastAsia="Times New Roman" w:hAnsi="Times New Roman" w:cs="Times New Roman"/>
+          <w:sz w:val="28"/>
+          <w:szCs w:val="28"/>
+          <w:lang w:eastAsia="ru-RU"/>
+        </w:rPr>
+        <w:t xml:space="preserve"> </w:t>
+      </w:r>
+      <w:r>
+        <w:rPr>
+          <w:rFonts w:ascii="Times New Roman" w:eastAsia="Times New Roman" w:hAnsi="Times New Roman" w:cs="Times New Roman"/>
+          <w:sz w:val="28"/>
+          <w:szCs w:val="28"/>
+          <w:lang w:eastAsia="ru-RU"/>
+        </w:rPr>
+        <w:t xml:space="preserve">и </w:t>
+      </w:r>
+      <w:r>
+        <w:rPr>
+          <w:rFonts w:ascii="Times New Roman" w:eastAsia="Times New Roman" w:hAnsi="Times New Roman" w:cs="Times New Roman"/>
+          <w:sz w:val="28"/>
+          <w:szCs w:val="28"/>
+          <w:lang w:val="en-US" w:eastAsia="ru-RU"/>
+        </w:rPr>
+        <w:t>GitLab</w:t>
+      </w:r>
+      <w:r>
+        <w:rPr>
+          <w:rFonts w:ascii="Times New Roman" w:eastAsia="Times New Roman" w:hAnsi="Times New Roman" w:cs="Times New Roman"/>
+          <w:sz w:val="28"/>
+          <w:szCs w:val="28"/>
+          <w:lang w:eastAsia="ru-RU"/>
+        </w:rPr>
+        <w:t>.</w:t>
+      </w:r>
+    </w:p>
+    <w:p>
+      <w:pPr>
+        <w:spacing w:after="100" w:afterAutospacing="1" w:line="360" w:lineRule="auto"/>
+        <w:ind w:firstLine="709"/>
+        <w:contextualSpacing/>
+        <w:jc w:val="both"/>
+        <w:rPr>
+          <w:rFonts w:ascii="Times New Roman" w:eastAsia="Times New Roman" w:hAnsi="Times New Roman" w:cs="Times New Roman"/>
+          <w:sz w:val="28"/>
+          <w:szCs w:val="28"/>
+          <w:lang w:eastAsia="ru-RU"/>
+        </w:rPr>
+      </w:pPr>
+      <w:r>
+        <w:rPr>
+          <w:rFonts w:ascii="Times New Roman" w:eastAsia="Times New Roman" w:hAnsi="Times New Roman" w:cs="Times New Roman"/>
+          <w:sz w:val="28"/>
+          <w:szCs w:val="28"/>
+          <w:lang w:eastAsia="ru-RU"/>
+        </w:rPr>
+        <w:t>Весь процесс разработки системы отслеживался в системе контроля версий, который упрощал разработку и отслеживание изменений в продукте.</w:t>
+      </w:r>
+    </w:p>
+    <w:p>
+      <w:pPr>
+        <w:spacing w:after="100" w:afterAutospacing="1" w:line="360" w:lineRule="auto"/>
+        <w:ind w:firstLine="709"/>
+        <w:contextualSpacing/>
+        <w:jc w:val="both"/>
+        <w:rPr>
+          <w:rFonts w:ascii="Times New Roman" w:eastAsia="Times New Roman" w:hAnsi="Times New Roman" w:cs="Times New Roman"/>
+          <w:sz w:val="28"/>
+          <w:szCs w:val="28"/>
+          <w:lang w:eastAsia="ru-RU"/>
+        </w:rPr>
+      </w:pPr>
+      <w:r>
+        <w:rPr>
+          <w:rFonts w:ascii="Times New Roman" w:eastAsia="Times New Roman" w:hAnsi="Times New Roman" w:cs="Times New Roman"/>
+          <w:sz w:val="28"/>
+          <w:szCs w:val="28"/>
+          <w:lang w:eastAsia="ru-RU"/>
+        </w:rPr>
+        <w:t xml:space="preserve">Для более удобного отслеживания изменений было создано несколько тематических веток, а именно: </w:t>
+      </w:r>
+      <w:r>
+        <w:rPr>
+          <w:rFonts w:ascii="Times New Roman" w:eastAsia="Times New Roman" w:hAnsi="Times New Roman" w:cs="Times New Roman"/>
+          <w:sz w:val="28"/>
+          <w:szCs w:val="28"/>
+          <w:lang w:val="en-US" w:eastAsia="ru-RU"/>
+        </w:rPr>
+        <w:t>develop</w:t>
+      </w:r>
+      <w:r>
+        <w:rPr>
+          <w:rFonts w:ascii="Times New Roman" w:eastAsia="Times New Roman" w:hAnsi="Times New Roman" w:cs="Times New Roman"/>
+          <w:sz w:val="28"/>
+          <w:szCs w:val="28"/>
+          <w:lang w:eastAsia="ru-RU"/>
+        </w:rPr>
+        <w:t xml:space="preserve"> (</w:t>
+      </w:r>
+      <w:r>
+        <w:rPr>
+          <w:rFonts w:ascii="Times New Roman" w:eastAsia="Times New Roman" w:hAnsi="Times New Roman" w:cs="Times New Roman"/>
+          <w:sz w:val="28"/>
+          <w:szCs w:val="28"/>
+          <w:lang w:eastAsia="ru-RU"/>
+        </w:rPr>
+        <w:t>непосредственная разработка самого продукта</w:t>
+      </w:r>
+      <w:r>
+        <w:rPr>
+          <w:rFonts w:ascii="Times New Roman" w:eastAsia="Times New Roman" w:hAnsi="Times New Roman" w:cs="Times New Roman"/>
+          <w:sz w:val="28"/>
+          <w:szCs w:val="28"/>
+          <w:lang w:eastAsia="ru-RU"/>
+        </w:rPr>
+        <w:t>)</w:t>
+      </w:r>
+      <w:r>
+        <w:rPr>
+          <w:rFonts w:ascii="Times New Roman" w:eastAsia="Times New Roman" w:hAnsi="Times New Roman" w:cs="Times New Roman"/>
+          <w:sz w:val="28"/>
+          <w:szCs w:val="28"/>
+          <w:lang w:eastAsia="ru-RU"/>
+        </w:rPr>
+        <w:t xml:space="preserve">, </w:t>
+      </w:r>
+      <w:r>
+        <w:rPr>
+          <w:rFonts w:ascii="Times New Roman" w:eastAsia="Times New Roman" w:hAnsi="Times New Roman" w:cs="Times New Roman"/>
+          <w:sz w:val="28"/>
+          <w:szCs w:val="28"/>
+          <w:lang w:val="en-US" w:eastAsia="ru-RU"/>
+        </w:rPr>
+        <w:t>testing</w:t>
+      </w:r>
+      <w:r>
+        <w:rPr>
+          <w:rFonts w:ascii="Times New Roman" w:eastAsia="Times New Roman" w:hAnsi="Times New Roman" w:cs="Times New Roman"/>
+          <w:sz w:val="28"/>
+          <w:szCs w:val="28"/>
+          <w:lang w:eastAsia="ru-RU"/>
+        </w:rPr>
+        <w:t xml:space="preserve"> (</w:t>
+      </w:r>
+      <w:r>
+        <w:rPr>
+          <w:rFonts w:ascii="Times New Roman" w:eastAsia="Times New Roman" w:hAnsi="Times New Roman" w:cs="Times New Roman"/>
+          <w:sz w:val="28"/>
+          <w:szCs w:val="28"/>
+          <w:lang w:eastAsia="ru-RU"/>
+        </w:rPr>
+        <w:t>реализация юнит-тестирования и тестирования продукта в целом</w:t>
+      </w:r>
+      <w:r>
+        <w:rPr>
+          <w:rFonts w:ascii="Times New Roman" w:eastAsia="Times New Roman" w:hAnsi="Times New Roman" w:cs="Times New Roman"/>
+          <w:sz w:val="28"/>
+          <w:szCs w:val="28"/>
+          <w:lang w:eastAsia="ru-RU"/>
+        </w:rPr>
+        <w:t>)</w:t>
+      </w:r>
+      <w:r>
+        <w:rPr>
+          <w:rFonts w:ascii="Times New Roman" w:eastAsia="Times New Roman" w:hAnsi="Times New Roman" w:cs="Times New Roman"/>
+          <w:sz w:val="28"/>
+          <w:szCs w:val="28"/>
+          <w:lang w:eastAsia="ru-RU"/>
+        </w:rPr>
+        <w:t xml:space="preserve">, </w:t>
+      </w:r>
+      <w:r>
+        <w:rPr>
+          <w:rFonts w:ascii="Times New Roman" w:eastAsia="Times New Roman" w:hAnsi="Times New Roman" w:cs="Times New Roman"/>
+          <w:sz w:val="28"/>
+          <w:szCs w:val="28"/>
+          <w:lang w:val="en-US" w:eastAsia="ru-RU"/>
+        </w:rPr>
+        <w:t>main</w:t>
+      </w:r>
+      <w:r>
+        <w:rPr>
+          <w:rFonts w:ascii="Times New Roman" w:eastAsia="Times New Roman" w:hAnsi="Times New Roman" w:cs="Times New Roman"/>
+          <w:sz w:val="28"/>
+          <w:szCs w:val="28"/>
+          <w:lang w:eastAsia="ru-RU"/>
+        </w:rPr>
+        <w:t xml:space="preserve"> </w:t>
+      </w:r>
+      <w:r>
+        <w:rPr>
+          <w:rFonts w:ascii="Times New Roman" w:eastAsia="Times New Roman" w:hAnsi="Times New Roman" w:cs="Times New Roman"/>
+          <w:sz w:val="28"/>
+          <w:szCs w:val="28"/>
+          <w:lang w:eastAsia="ru-RU"/>
+        </w:rPr>
+        <w:t>(</w:t>
+      </w:r>
+      <w:r>
+        <w:rPr>
+          <w:rFonts w:ascii="Times New Roman" w:eastAsia="Times New Roman" w:hAnsi="Times New Roman" w:cs="Times New Roman"/>
+          <w:sz w:val="28"/>
+          <w:szCs w:val="28"/>
+          <w:lang w:eastAsia="ru-RU"/>
+        </w:rPr>
+        <w:t>основная ветка для реализации готовых версий продукта</w:t>
+      </w:r>
+      <w:r>
+        <w:rPr>
+          <w:rFonts w:ascii="Times New Roman" w:eastAsia="Times New Roman" w:hAnsi="Times New Roman" w:cs="Times New Roman"/>
+          <w:sz w:val="28"/>
+          <w:szCs w:val="28"/>
+          <w:lang w:eastAsia="ru-RU"/>
+        </w:rPr>
+        <w:t>)</w:t>
+      </w:r>
+      <w:r>
+        <w:rPr>
+          <w:rFonts w:ascii="Times New Roman" w:eastAsia="Times New Roman" w:hAnsi="Times New Roman" w:cs="Times New Roman"/>
+          <w:sz w:val="28"/>
+          <w:szCs w:val="28"/>
+          <w:lang w:eastAsia="ru-RU"/>
+        </w:rPr>
+        <w:t>.</w:t>
+      </w:r>
+    </w:p>
+    <w:p>
+      <w:pPr>
+        <w:spacing w:after="100" w:afterAutospacing="1" w:line="360" w:lineRule="auto"/>
+        <w:ind w:firstLine="709"/>
+        <w:contextualSpacing/>
+        <w:jc w:val="both"/>
+        <w:rPr>
+          <w:rFonts w:ascii="Times New Roman" w:eastAsia="Times New Roman" w:hAnsi="Times New Roman" w:cs="Times New Roman"/>
+          <w:sz w:val="28"/>
+          <w:szCs w:val="28"/>
+          <w:lang w:eastAsia="ru-RU"/>
+        </w:rPr>
+      </w:pPr>
+      <w:r>
+        <w:rPr>
+          <w:rFonts w:ascii="Times New Roman" w:eastAsia="Times New Roman" w:hAnsi="Times New Roman" w:cs="Times New Roman"/>
+          <w:sz w:val="28"/>
+          <w:szCs w:val="28"/>
+          <w:lang w:eastAsia="ru-RU"/>
+        </w:rPr>
+        <w:t>На первых этапах разработки продукта (а именно разработка общей документации и проектирование модулей) все изменения фиксировались в основной ветке. При переходе на этап реализации продукта, в соответствии с разработанной документацией, все изменения фиксировались соответственно на ветке разработки.</w:t>
+      </w:r>
+    </w:p>
+    <w:p>
+      <w:pPr>
+        <w:spacing w:after="100" w:afterAutospacing="1" w:line="360" w:lineRule="auto"/>
+        <w:ind w:firstLine="709"/>
+        <w:contextualSpacing/>
+        <w:jc w:val="both"/>
+        <w:rPr>
+          <w:rFonts w:ascii="Times New Roman" w:eastAsia="Times New Roman" w:hAnsi="Times New Roman" w:cs="Times New Roman"/>
+          <w:sz w:val="28"/>
+          <w:szCs w:val="28"/>
+          <w:lang w:eastAsia="ru-RU"/>
+        </w:rPr>
+      </w:pPr>
+      <w:r>
+        <w:rPr>
+          <w:rFonts w:ascii="Times New Roman" w:eastAsia="Times New Roman" w:hAnsi="Times New Roman" w:cs="Times New Roman"/>
+          <w:sz w:val="28"/>
+          <w:szCs w:val="28"/>
+          <w:lang w:eastAsia="ru-RU"/>
+        </w:rPr>
+        <w:t>После успешной разработки, версия продукта переходила на ветку для тестирования, на которой реализовывалось юнит-тестирование и ручное тестирование. Весь процесс сопровождается тестовой документацией, изменения в которой фиксируется на этой же ветке.</w:t>
+      </w:r>
+    </w:p>
+    <w:p>
+      <w:pPr>
+        <w:spacing w:after="100" w:afterAutospacing="1" w:line="360" w:lineRule="auto"/>
+        <w:ind w:firstLine="709"/>
+        <w:contextualSpacing/>
+        <w:jc w:val="both"/>
+        <w:rPr>
+          <w:rFonts w:ascii="Times New Roman" w:eastAsia="Times New Roman" w:hAnsi="Times New Roman" w:cs="Times New Roman"/>
+          <w:sz w:val="28"/>
+          <w:szCs w:val="28"/>
+          <w:lang w:eastAsia="ru-RU"/>
+        </w:rPr>
+      </w:pPr>
+      <w:r>
+        <w:rPr>
+          <w:rFonts w:ascii="Times New Roman" w:eastAsia="Times New Roman" w:hAnsi="Times New Roman" w:cs="Times New Roman"/>
+          <w:sz w:val="28"/>
+          <w:szCs w:val="28"/>
+          <w:lang w:eastAsia="ru-RU"/>
+        </w:rPr>
+        <w:t xml:space="preserve">После успешного тестирования версия продукта переходит на главную ветку продукта. </w:t>
+      </w:r>
+    </w:p>
+    <w:p>
+      <w:pPr>
+        <w:spacing w:after="100" w:afterAutospacing="1" w:line="360" w:lineRule="auto"/>
+        <w:ind w:firstLine="709"/>
+        <w:contextualSpacing/>
+        <w:jc w:val="both"/>
+        <w:rPr>
+          <w:rFonts w:ascii="Times New Roman" w:eastAsia="Times New Roman" w:hAnsi="Times New Roman" w:cs="Times New Roman"/>
+          <w:sz w:val="28"/>
+          <w:szCs w:val="28"/>
+          <w:lang w:eastAsia="ru-RU"/>
+        </w:rPr>
+      </w:pPr>
+      <w:r>
+        <w:rPr>
+          <w:rFonts w:ascii="Times New Roman" w:eastAsia="Times New Roman" w:hAnsi="Times New Roman" w:cs="Times New Roman"/>
+          <w:sz w:val="28"/>
+          <w:szCs w:val="28"/>
+          <w:lang w:eastAsia="ru-RU"/>
+        </w:rPr>
+        <w:t>В случае неудовлетворительного тестирования, продукт возвращался на ветку разработки и дорабатывался.</w:t>
+      </w:r>
+    </w:p>
+    <w:p>
+      <w:pPr>
+        <w:pStyle w:val="aa"/>
+        <w:numPr>
+          <w:ilvl w:val="0"/>
+          <w:numId w:val="27"/>
+        </w:numPr>
+        <w:spacing w:after="100" w:afterAutospacing="1" w:line="360" w:lineRule="auto"/>
+        <w:jc w:val="both"/>
+        <w:rPr>
+          <w:rFonts w:ascii="Times New Roman" w:eastAsia="Times New Roman" w:hAnsi="Times New Roman" w:cs="Times New Roman"/>
+          <w:sz w:val="28"/>
+          <w:szCs w:val="28"/>
+          <w:lang w:eastAsia="ru-RU"/>
+        </w:rPr>
+      </w:pPr>
       <w:proofErr w:type="spellStart"/>
       <w:r>
         <w:rPr>
           <w:rFonts w:ascii="Times New Roman" w:eastAsia="Times New Roman" w:hAnsi="Times New Roman" w:cs="Times New Roman"/>
           <w:sz w:val="28"/>
           <w:szCs w:val="28"/>
-          <w:highlight w:val="yellow"/>
+          <w:lang w:eastAsia="ru-RU"/>
+        </w:rPr>
+        <w:t>Канбан</w:t>
+      </w:r>
+      <w:proofErr w:type="spellEnd"/>
+      <w:r>
+        <w:rPr>
+          <w:rFonts w:ascii="Times New Roman" w:eastAsia="Times New Roman" w:hAnsi="Times New Roman" w:cs="Times New Roman"/>
+          <w:sz w:val="28"/>
+          <w:szCs w:val="28"/>
+          <w:lang w:eastAsia="ru-RU"/>
+        </w:rPr>
+        <w:t xml:space="preserve"> доска (</w:t>
+      </w:r>
+      <w:proofErr w:type="spellStart"/>
+      <w:r>
+        <w:rPr>
+          <w:rFonts w:ascii="Times New Roman" w:eastAsia="Times New Roman" w:hAnsi="Times New Roman" w:cs="Times New Roman"/>
+          <w:sz w:val="28"/>
+          <w:szCs w:val="28"/>
+          <w:lang w:val="en-US" w:eastAsia="ru-RU"/>
+        </w:rPr>
+        <w:t>Yozhka</w:t>
+      </w:r>
+      <w:proofErr w:type="spellEnd"/>
+      <w:r>
+        <w:rPr>
+          <w:rFonts w:ascii="Times New Roman" w:eastAsia="Times New Roman" w:hAnsi="Times New Roman" w:cs="Times New Roman"/>
+          <w:sz w:val="28"/>
+          <w:szCs w:val="28"/>
+          <w:lang w:eastAsia="ru-RU"/>
+        </w:rPr>
+        <w:t>).</w:t>
+      </w:r>
+    </w:p>
+    <w:p>
+      <w:pPr>
+        <w:spacing w:after="100" w:afterAutospacing="1" w:line="360" w:lineRule="auto"/>
+        <w:ind w:firstLine="709"/>
+        <w:contextualSpacing/>
+        <w:jc w:val="both"/>
+        <w:rPr>
+          <w:rFonts w:ascii="Times New Roman" w:eastAsia="Times New Roman" w:hAnsi="Times New Roman" w:cs="Times New Roman"/>
+          <w:sz w:val="28"/>
+          <w:szCs w:val="28"/>
+          <w:lang w:eastAsia="ru-RU"/>
+        </w:rPr>
+      </w:pPr>
+      <w:r>
+        <w:rPr>
+          <w:rFonts w:ascii="Times New Roman" w:eastAsia="Times New Roman" w:hAnsi="Times New Roman" w:cs="Times New Roman"/>
+          <w:sz w:val="28"/>
+          <w:szCs w:val="28"/>
+          <w:lang w:eastAsia="ru-RU"/>
+        </w:rPr>
+        <w:t xml:space="preserve">Так же для более удобного процесса разработки продукта была организована </w:t>
+      </w:r>
+      <w:proofErr w:type="spellStart"/>
+      <w:r>
+        <w:rPr>
+          <w:rFonts w:ascii="Times New Roman" w:eastAsia="Times New Roman" w:hAnsi="Times New Roman" w:cs="Times New Roman"/>
+          <w:sz w:val="28"/>
+          <w:szCs w:val="28"/>
+          <w:lang w:eastAsia="ru-RU"/>
+        </w:rPr>
+        <w:t>Канбан</w:t>
+      </w:r>
+      <w:proofErr w:type="spellEnd"/>
+      <w:r>
+        <w:rPr>
+          <w:rFonts w:ascii="Times New Roman" w:eastAsia="Times New Roman" w:hAnsi="Times New Roman" w:cs="Times New Roman"/>
+          <w:sz w:val="28"/>
+          <w:szCs w:val="28"/>
+          <w:lang w:eastAsia="ru-RU"/>
+        </w:rPr>
+        <w:t xml:space="preserve"> доска на основе сервиса </w:t>
+      </w:r>
+      <w:proofErr w:type="spellStart"/>
+      <w:r>
+        <w:rPr>
+          <w:rFonts w:ascii="Times New Roman" w:eastAsia="Times New Roman" w:hAnsi="Times New Roman" w:cs="Times New Roman"/>
+          <w:sz w:val="28"/>
+          <w:szCs w:val="28"/>
+          <w:lang w:val="en-US" w:eastAsia="ru-RU"/>
+        </w:rPr>
+        <w:t>Yozhka</w:t>
+      </w:r>
+      <w:proofErr w:type="spellEnd"/>
+      <w:r>
+        <w:rPr>
+          <w:rFonts w:ascii="Times New Roman" w:eastAsia="Times New Roman" w:hAnsi="Times New Roman" w:cs="Times New Roman"/>
+          <w:sz w:val="28"/>
+          <w:szCs w:val="28"/>
+          <w:lang w:eastAsia="ru-RU"/>
+        </w:rPr>
+        <w:t>.</w:t>
+      </w:r>
+    </w:p>
+    <w:p>
+      <w:pPr>
+        <w:spacing w:after="100" w:afterAutospacing="1" w:line="360" w:lineRule="auto"/>
+        <w:ind w:firstLine="709"/>
+        <w:contextualSpacing/>
+        <w:jc w:val="both"/>
+        <w:rPr>
+          <w:rFonts w:ascii="Times New Roman" w:eastAsia="Times New Roman" w:hAnsi="Times New Roman" w:cs="Times New Roman"/>
+          <w:sz w:val="28"/>
+          <w:szCs w:val="28"/>
+          <w:lang w:eastAsia="ru-RU"/>
+        </w:rPr>
+      </w:pPr>
+      <w:proofErr w:type="spellStart"/>
+      <w:r>
+        <w:rPr>
+          <w:rFonts w:ascii="Times New Roman" w:eastAsia="Times New Roman" w:hAnsi="Times New Roman" w:cs="Times New Roman"/>
+          <w:sz w:val="28"/>
+          <w:szCs w:val="28"/>
+          <w:lang w:eastAsia="ru-RU"/>
+        </w:rPr>
+        <w:lastRenderedPageBreak/>
+        <w:t>Канбан</w:t>
+      </w:r>
+      <w:proofErr w:type="spellEnd"/>
+      <w:r>
+        <w:rPr>
+          <w:rFonts w:ascii="Times New Roman" w:eastAsia="Times New Roman" w:hAnsi="Times New Roman" w:cs="Times New Roman"/>
+          <w:sz w:val="28"/>
+          <w:szCs w:val="28"/>
+          <w:lang w:eastAsia="ru-RU"/>
+        </w:rPr>
+        <w:t xml:space="preserve">-доска </w:t>
+      </w:r>
+      <w:r>
+        <w:rPr>
+          <w:rFonts w:ascii="Times New Roman" w:eastAsia="Times New Roman" w:hAnsi="Times New Roman" w:cs="Times New Roman"/>
+          <w:sz w:val="28"/>
+          <w:szCs w:val="28"/>
+          <w:lang w:eastAsia="ru-RU"/>
+        </w:rPr>
+        <w:t>-</w:t>
+      </w:r>
+      <w:r>
+        <w:rPr>
+          <w:rFonts w:ascii="Times New Roman" w:eastAsia="Times New Roman" w:hAnsi="Times New Roman" w:cs="Times New Roman"/>
+          <w:sz w:val="28"/>
+          <w:szCs w:val="28"/>
+          <w:lang w:eastAsia="ru-RU"/>
+        </w:rPr>
+        <w:t xml:space="preserve"> термин, который означает визуальное представление рабочего процесса в системе </w:t>
+      </w:r>
+      <w:proofErr w:type="spellStart"/>
+      <w:r>
+        <w:rPr>
+          <w:rFonts w:ascii="Times New Roman" w:eastAsia="Times New Roman" w:hAnsi="Times New Roman" w:cs="Times New Roman"/>
+          <w:sz w:val="28"/>
+          <w:szCs w:val="28"/>
+          <w:lang w:eastAsia="ru-RU"/>
+        </w:rPr>
+        <w:t>Kanban</w:t>
+      </w:r>
+      <w:proofErr w:type="spellEnd"/>
+      <w:r>
+        <w:rPr>
+          <w:rFonts w:ascii="Times New Roman" w:eastAsia="Times New Roman" w:hAnsi="Times New Roman" w:cs="Times New Roman"/>
+          <w:sz w:val="28"/>
+          <w:szCs w:val="28"/>
+          <w:lang w:eastAsia="ru-RU"/>
+        </w:rPr>
+        <w:t>. Это инструмент визуального управления задачами, который помогает организовать рабочий процесс и контролировать выполнение задач на каждом этапе</w:t>
+      </w:r>
+      <w:r>
+        <w:rPr>
+          <w:rFonts w:ascii="Times New Roman" w:eastAsia="Times New Roman" w:hAnsi="Times New Roman" w:cs="Times New Roman"/>
+          <w:sz w:val="28"/>
+          <w:szCs w:val="28"/>
+          <w:lang w:eastAsia="ru-RU"/>
+        </w:rPr>
+        <w:t>.</w:t>
+      </w:r>
+    </w:p>
+    <w:p>
+      <w:pPr>
+        <w:spacing w:after="100" w:afterAutospacing="1" w:line="360" w:lineRule="auto"/>
+        <w:ind w:firstLine="709"/>
+        <w:contextualSpacing/>
+        <w:jc w:val="both"/>
+        <w:rPr>
+          <w:rFonts w:ascii="Times New Roman" w:eastAsia="Times New Roman" w:hAnsi="Times New Roman" w:cs="Times New Roman"/>
+          <w:sz w:val="28"/>
+          <w:szCs w:val="28"/>
+          <w:lang w:eastAsia="ru-RU"/>
+        </w:rPr>
+      </w:pPr>
+      <w:r>
+        <w:rPr>
+          <w:rFonts w:ascii="Times New Roman" w:eastAsia="Times New Roman" w:hAnsi="Times New Roman" w:cs="Times New Roman"/>
+          <w:sz w:val="28"/>
+          <w:szCs w:val="28"/>
+          <w:lang w:eastAsia="ru-RU"/>
+        </w:rPr>
+        <w:t xml:space="preserve">Задачи на </w:t>
+      </w:r>
+      <w:proofErr w:type="spellStart"/>
+      <w:r>
+        <w:rPr>
+          <w:rFonts w:ascii="Times New Roman" w:eastAsia="Times New Roman" w:hAnsi="Times New Roman" w:cs="Times New Roman"/>
+          <w:sz w:val="28"/>
+          <w:szCs w:val="28"/>
           <w:lang w:eastAsia="ru-RU"/>
         </w:rPr>
         <w:t>канбан</w:t>
       </w:r>
       <w:proofErr w:type="spellEnd"/>
+      <w:r>
+        <w:rPr>
+          <w:rFonts w:ascii="Times New Roman" w:eastAsia="Times New Roman" w:hAnsi="Times New Roman" w:cs="Times New Roman"/>
+          <w:sz w:val="28"/>
+          <w:szCs w:val="28"/>
+          <w:lang w:eastAsia="ru-RU"/>
+        </w:rPr>
+        <w:t xml:space="preserve"> доске</w:t>
+      </w:r>
+      <w:r>
+        <w:rPr>
+          <w:rFonts w:ascii="Times New Roman" w:eastAsia="Times New Roman" w:hAnsi="Times New Roman" w:cs="Times New Roman"/>
+          <w:sz w:val="28"/>
+          <w:szCs w:val="28"/>
+          <w:lang w:eastAsia="ru-RU"/>
+        </w:rPr>
+        <w:t xml:space="preserve"> были составлены в соответствии с целями проекта и его задачами. Так же для каждой задачи присвоены тематические тэги, которые помогают визуально отделять задачи по темам.</w:t>
+      </w:r>
+    </w:p>
+    <w:p>
+      <w:pPr>
+        <w:spacing w:after="100" w:afterAutospacing="1" w:line="360" w:lineRule="auto"/>
+        <w:ind w:firstLine="709"/>
+        <w:contextualSpacing/>
+        <w:jc w:val="both"/>
+        <w:rPr>
+          <w:rFonts w:ascii="Times New Roman" w:eastAsia="Times New Roman" w:hAnsi="Times New Roman" w:cs="Times New Roman"/>
+          <w:sz w:val="28"/>
+          <w:szCs w:val="28"/>
+          <w:lang w:eastAsia="ru-RU"/>
+        </w:rPr>
+      </w:pPr>
+      <w:r>
+        <w:rPr>
+          <w:rFonts w:ascii="Times New Roman" w:eastAsia="Times New Roman" w:hAnsi="Times New Roman" w:cs="Times New Roman"/>
+          <w:sz w:val="28"/>
+          <w:szCs w:val="28"/>
+          <w:lang w:eastAsia="ru-RU"/>
+        </w:rPr>
+        <w:t>Весь прогресс проекта постоянно фиксировался на доске.</w:t>
+      </w:r>
+    </w:p>
+    <w:p>
+      <w:pPr>
+        <w:spacing w:after="100" w:afterAutospacing="1" w:line="360" w:lineRule="auto"/>
+        <w:ind w:firstLine="709"/>
+        <w:contextualSpacing/>
+        <w:jc w:val="center"/>
+        <w:rPr>
+          <w:rFonts w:ascii="Times New Roman" w:eastAsia="Times New Roman" w:hAnsi="Times New Roman" w:cs="Times New Roman"/>
+          <w:sz w:val="28"/>
+          <w:szCs w:val="28"/>
+          <w:lang w:eastAsia="ru-RU"/>
+        </w:rPr>
+      </w:pPr>
+      <w:r>
+        <w:rPr>
+          <w:rFonts w:ascii="Times New Roman" w:eastAsia="Times New Roman" w:hAnsi="Times New Roman" w:cs="Times New Roman"/>
+          <w:sz w:val="28"/>
+          <w:szCs w:val="28"/>
+          <w:lang w:eastAsia="ru-RU"/>
+        </w:rPr>
+        <w:drawing>
+          <wp:inline distT="0" distB="0" distL="0" distR="0" wp14:anchorId="15D163CF" wp14:editId="7EF2B4DA">
+            <wp:extent cx="5939790" cy="5770245"/>
+            <wp:effectExtent l="0" t="0" r="3810" b="1905"/>
+            <wp:docPr id="10" name="Рисунок 10"/>
+            <wp:cNvGraphicFramePr>
+              <a:graphicFrameLocks xmlns:a="http://schemas.openxmlformats.org/drawingml/2006/main" noChangeAspect="1"/>
+            </wp:cNvGraphicFramePr>
+            <a:graphic xmlns:a="http://schemas.openxmlformats.org/drawingml/2006/main">
+              <a:graphicData uri="http://schemas.openxmlformats.org/drawingml/2006/picture">
+                <pic:pic xmlns:pic="http://schemas.openxmlformats.org/drawingml/2006/picture">
+                  <pic:nvPicPr>
+                    <pic:cNvPr id="1" name=""/>
+                    <pic:cNvPicPr/>
+                  </pic:nvPicPr>
+                  <pic:blipFill>
+                    <a:blip r:embed="rId17"/>
+                    <a:stretch>
+                      <a:fillRect/>
+                    </a:stretch>
+                  </pic:blipFill>
+                  <pic:spPr>
+                    <a:xfrm>
+                      <a:off x="0" y="0"/>
+                      <a:ext cx="5939790" cy="5770245"/>
+                    </a:xfrm>
+                    <a:prstGeom prst="rect">
+                      <a:avLst/>
+                    </a:prstGeom>
+                  </pic:spPr>
+                </pic:pic>
+              </a:graphicData>
+            </a:graphic>
+          </wp:inline>
+        </w:drawing>
+      </w:r>
+    </w:p>
+    <w:p>
+      <w:pPr>
+        <w:spacing w:after="100" w:afterAutospacing="1" w:line="360" w:lineRule="auto"/>
+        <w:ind w:firstLine="709"/>
+        <w:contextualSpacing/>
+        <w:jc w:val="center"/>
+        <w:rPr>
+          <w:rFonts w:ascii="Times New Roman" w:eastAsia="Times New Roman" w:hAnsi="Times New Roman" w:cs="Times New Roman"/>
+          <w:sz w:val="28"/>
+          <w:szCs w:val="28"/>
+          <w:lang w:eastAsia="ru-RU"/>
+        </w:rPr>
+      </w:pPr>
+      <w:r>
+        <w:rPr>
+          <w:rFonts w:ascii="Times New Roman" w:eastAsia="Times New Roman" w:hAnsi="Times New Roman" w:cs="Times New Roman"/>
+          <w:sz w:val="28"/>
+          <w:szCs w:val="28"/>
+          <w:lang w:eastAsia="ru-RU"/>
+        </w:rPr>
+        <w:t>Рисунок 10 – Состояние доски на 19.05.2026.</w:t>
+      </w:r>
+    </w:p>
+    <w:p>
+      <w:pPr>
+        <w:spacing w:after="100" w:afterAutospacing="1" w:line="360" w:lineRule="auto"/>
+        <w:ind w:firstLine="709"/>
+        <w:contextualSpacing/>
+        <w:jc w:val="both"/>
+        <w:rPr>
+          <w:rFonts w:ascii="Times New Roman" w:eastAsia="Times New Roman" w:hAnsi="Times New Roman" w:cs="Times New Roman"/>
+          <w:sz w:val="28"/>
+          <w:szCs w:val="28"/>
+          <w:lang w:eastAsia="ru-RU"/>
+        </w:rPr>
+      </w:pPr>
+    </w:p>
+    <w:p>
+      <w:pPr>
+        <w:spacing w:after="100" w:afterAutospacing="1" w:line="360" w:lineRule="auto"/>
+        <w:ind w:firstLine="709"/>
+        <w:contextualSpacing/>
+        <w:jc w:val="both"/>
+        <w:rPr>
+          <w:rFonts w:ascii="Times New Roman" w:eastAsia="Times New Roman" w:hAnsi="Times New Roman" w:cs="Times New Roman"/>
+          <w:sz w:val="28"/>
+          <w:szCs w:val="28"/>
+          <w:lang w:eastAsia="ru-RU"/>
+        </w:rPr>
+      </w:pPr>
+    </w:p>
+    <w:p>
+      <w:pPr>
+        <w:spacing w:after="100" w:afterAutospacing="1" w:line="360" w:lineRule="auto"/>
+        <w:ind w:firstLine="709"/>
+        <w:contextualSpacing/>
+        <w:jc w:val="both"/>
+        <w:rPr>
+          <w:rFonts w:ascii="Times New Roman" w:eastAsia="Times New Roman" w:hAnsi="Times New Roman" w:cs="Times New Roman"/>
+          <w:sz w:val="28"/>
+          <w:szCs w:val="28"/>
+          <w:lang w:eastAsia="ru-RU"/>
+        </w:rPr>
+      </w:pPr>
+      <w:r>
+        <w:rPr>
+          <w:rFonts w:ascii="Times New Roman" w:eastAsia="Times New Roman" w:hAnsi="Times New Roman" w:cs="Times New Roman"/>
+          <w:sz w:val="28"/>
+          <w:szCs w:val="28"/>
+          <w:lang w:eastAsia="ru-RU"/>
+        </w:rPr>
+        <w:lastRenderedPageBreak/>
+        <w:t>История изменений одной из задач на доске</w:t>
+      </w:r>
+    </w:p>
+    <w:p>
+      <w:pPr>
+        <w:spacing w:after="100" w:afterAutospacing="1" w:line="360" w:lineRule="auto"/>
+        <w:ind w:firstLine="709"/>
+        <w:contextualSpacing/>
+        <w:jc w:val="center"/>
+        <w:rPr>
+          <w:rFonts w:ascii="Times New Roman" w:eastAsia="Times New Roman" w:hAnsi="Times New Roman" w:cs="Times New Roman"/>
+          <w:sz w:val="28"/>
+          <w:szCs w:val="28"/>
+          <w:lang w:eastAsia="ru-RU"/>
+        </w:rPr>
+      </w:pPr>
+      <w:r>
+        <w:rPr>
+          <w:rFonts w:ascii="Times New Roman" w:eastAsia="Times New Roman" w:hAnsi="Times New Roman" w:cs="Times New Roman"/>
+          <w:sz w:val="28"/>
+          <w:szCs w:val="28"/>
+          <w:lang w:eastAsia="ru-RU"/>
+        </w:rPr>
+        <w:drawing>
+          <wp:inline distT="0" distB="0" distL="0" distR="0" wp14:anchorId="4A099243" wp14:editId="6E488106">
+            <wp:extent cx="5939790" cy="5735320"/>
+            <wp:effectExtent l="0" t="0" r="3810" b="0"/>
+            <wp:docPr id="11" name="Рисунок 11"/>
+            <wp:cNvGraphicFramePr>
+              <a:graphicFrameLocks xmlns:a="http://schemas.openxmlformats.org/drawingml/2006/main" noChangeAspect="1"/>
+            </wp:cNvGraphicFramePr>
+            <a:graphic xmlns:a="http://schemas.openxmlformats.org/drawingml/2006/main">
+              <a:graphicData uri="http://schemas.openxmlformats.org/drawingml/2006/picture">
+                <pic:pic xmlns:pic="http://schemas.openxmlformats.org/drawingml/2006/picture">
+                  <pic:nvPicPr>
+                    <pic:cNvPr id="1" name=""/>
+                    <pic:cNvPicPr/>
+                  </pic:nvPicPr>
+                  <pic:blipFill>
+                    <a:blip r:embed="rId18"/>
+                    <a:stretch>
+                      <a:fillRect/>
+                    </a:stretch>
+                  </pic:blipFill>
+                  <pic:spPr>
+                    <a:xfrm>
+                      <a:off x="0" y="0"/>
+                      <a:ext cx="5939790" cy="5735320"/>
+                    </a:xfrm>
+                    <a:prstGeom prst="rect">
+                      <a:avLst/>
+                    </a:prstGeom>
+                  </pic:spPr>
+                </pic:pic>
+              </a:graphicData>
+            </a:graphic>
+          </wp:inline>
+        </w:drawing>
+      </w:r>
+    </w:p>
+    <w:p>
+      <w:pPr>
+        <w:spacing w:after="100" w:afterAutospacing="1" w:line="360" w:lineRule="auto"/>
+        <w:ind w:firstLine="709"/>
+        <w:contextualSpacing/>
+        <w:jc w:val="center"/>
+        <w:rPr>
+          <w:rFonts w:ascii="Times New Roman" w:eastAsia="Times New Roman" w:hAnsi="Times New Roman" w:cs="Times New Roman"/>
+          <w:sz w:val="28"/>
+          <w:szCs w:val="28"/>
+          <w:lang w:eastAsia="ru-RU"/>
+        </w:rPr>
+      </w:pPr>
+      <w:proofErr w:type="gramStart"/>
+      <w:r>
+        <w:rPr>
+          <w:rFonts w:ascii="Times New Roman" w:eastAsia="Times New Roman" w:hAnsi="Times New Roman" w:cs="Times New Roman"/>
+          <w:sz w:val="28"/>
+          <w:szCs w:val="28"/>
+          <w:lang w:eastAsia="ru-RU"/>
+        </w:rPr>
+        <w:t>Рисунок  -</w:t>
+      </w:r>
+      <w:proofErr w:type="gramEnd"/>
+      <w:r>
+        <w:rPr>
+          <w:rFonts w:ascii="Times New Roman" w:eastAsia="Times New Roman" w:hAnsi="Times New Roman" w:cs="Times New Roman"/>
+          <w:sz w:val="28"/>
+          <w:szCs w:val="28"/>
+          <w:lang w:eastAsia="ru-RU"/>
+        </w:rPr>
+        <w:t xml:space="preserve"> История изменений задачи «Создание общей информации».</w:t>
+      </w:r>
+    </w:p>
+    <w:p>
+      <w:pPr>
+        <w:spacing w:after="100" w:afterAutospacing="1" w:line="360" w:lineRule="auto"/>
+        <w:ind w:firstLine="709"/>
+        <w:contextualSpacing/>
+        <w:jc w:val="both"/>
+        <w:rPr>
+          <w:rFonts w:ascii="Times New Roman" w:eastAsia="Times New Roman" w:hAnsi="Times New Roman" w:cs="Times New Roman"/>
+          <w:sz w:val="28"/>
+          <w:szCs w:val="28"/>
+          <w:lang w:eastAsia="ru-RU"/>
+        </w:rPr>
+      </w:pPr>
+    </w:p>
+    <w:p>
+      <w:pPr>
+        <w:spacing w:after="100" w:afterAutospacing="1" w:line="360" w:lineRule="auto"/>
+        <w:ind w:firstLine="709"/>
+        <w:contextualSpacing/>
+        <w:jc w:val="both"/>
+        <w:rPr>
+          <w:rFonts w:ascii="Times New Roman" w:eastAsia="Times New Roman" w:hAnsi="Times New Roman" w:cs="Times New Roman"/>
+          <w:sz w:val="28"/>
+          <w:szCs w:val="28"/>
+          <w:lang w:eastAsia="ru-RU"/>
+        </w:rPr>
+      </w:pPr>
+    </w:p>
+    <w:p>
+      <w:pPr>
+        <w:spacing w:after="100" w:afterAutospacing="1" w:line="360" w:lineRule="auto"/>
+        <w:ind w:firstLine="709"/>
+        <w:contextualSpacing/>
+        <w:jc w:val="both"/>
+        <w:rPr>
+          <w:rFonts w:ascii="Times New Roman" w:eastAsia="Times New Roman" w:hAnsi="Times New Roman" w:cs="Times New Roman"/>
+          <w:sz w:val="28"/>
+          <w:szCs w:val="28"/>
+          <w:lang w:eastAsia="ru-RU"/>
+        </w:rPr>
+      </w:pPr>
+    </w:p>
+    <w:p>
+      <w:pPr>
+        <w:spacing w:after="100" w:afterAutospacing="1" w:line="360" w:lineRule="auto"/>
+        <w:ind w:firstLine="709"/>
+        <w:contextualSpacing/>
+        <w:jc w:val="both"/>
+        <w:rPr>
+          <w:rFonts w:ascii="Times New Roman" w:eastAsia="Times New Roman" w:hAnsi="Times New Roman" w:cs="Times New Roman"/>
+          <w:sz w:val="28"/>
+          <w:szCs w:val="28"/>
+          <w:lang w:eastAsia="ru-RU"/>
+        </w:rPr>
+      </w:pPr>
     </w:p>
     <w:p>
       <w:pPr>
@@ -28886,7 +29783,7 @@
         </w:rPr>
       </w:pPr>
       <w:bookmarkStart w:id="78" w:name="_Toc229829474"/>
-      <w:bookmarkStart w:id="79" w:name="_Toc230102768"/>
+      <w:bookmarkStart w:id="79" w:name="_Toc230104659"/>
       <w:r>
         <w:rPr>
           <w:rFonts w:eastAsia="Times New Roman"/>
@@ -29071,7 +29968,7 @@
       </w:pPr>
     </w:p>
     <w:sectPr>
-      <w:footerReference w:type="default" r:id="rId17"/>
+      <w:footerReference w:type="default" r:id="rId19"/>
       <w:pgSz w:w="11906" w:h="16838"/>
       <w:pgMar w:top="1134" w:right="851" w:bottom="1134" w:left="1701" w:header="709" w:footer="709" w:gutter="0"/>
       <w:pgNumType w:start="0"/>
@@ -31468,6 +32365,95 @@
     </w:lvl>
   </w:abstractNum>
   <w:abstractNum w:abstractNumId="21" w15:restartNumberingAfterBreak="0">
+    <w:nsid w:val="65430C70"/>
+    <w:multiLevelType w:val="hybridMultilevel"/>
+    <w:tmpl w:val="D9CE40DA"/>
+    <w:lvl w:ilvl="0" w:tplc="63288ACA">
+      <w:start w:val="1"/>
+      <w:numFmt w:val="decimal"/>
+      <w:lvlText w:val="%1."/>
+      <w:lvlJc w:val="left"/>
+      <w:pPr>
+        <w:ind w:left="1069" w:hanging="360"/>
+      </w:pPr>
+      <w:rPr>
+        <w:rFonts w:hint="default"/>
+      </w:rPr>
+    </w:lvl>
+    <w:lvl w:ilvl="1" w:tplc="04190019" w:tentative="1">
+      <w:start w:val="1"/>
+      <w:numFmt w:val="lowerLetter"/>
+      <w:lvlText w:val="%2."/>
+      <w:lvlJc w:val="left"/>
+      <w:pPr>
+        <w:ind w:left="1789" w:hanging="360"/>
+      </w:pPr>
+    </w:lvl>
+    <w:lvl w:ilvl="2" w:tplc="0419001B" w:tentative="1">
+      <w:start w:val="1"/>
+      <w:numFmt w:val="lowerRoman"/>
+      <w:lvlText w:val="%3."/>
+      <w:lvlJc w:val="right"/>
+      <w:pPr>
+        <w:ind w:left="2509" w:hanging="180"/>
+      </w:pPr>
+    </w:lvl>
+    <w:lvl w:ilvl="3" w:tplc="0419000F" w:tentative="1">
+      <w:start w:val="1"/>
+      <w:numFmt w:val="decimal"/>
+      <w:lvlText w:val="%4."/>
+      <w:lvlJc w:val="left"/>
+      <w:pPr>
+        <w:ind w:left="3229" w:hanging="360"/>
+      </w:pPr>
+    </w:lvl>
+    <w:lvl w:ilvl="4" w:tplc="04190019" w:tentative="1">
+      <w:start w:val="1"/>
+      <w:numFmt w:val="lowerLetter"/>
+      <w:lvlText w:val="%5."/>
+      <w:lvlJc w:val="left"/>
+      <w:pPr>
+        <w:ind w:left="3949" w:hanging="360"/>
+      </w:pPr>
+    </w:lvl>
+    <w:lvl w:ilvl="5" w:tplc="0419001B" w:tentative="1">
+      <w:start w:val="1"/>
+      <w:numFmt w:val="lowerRoman"/>
+      <w:lvlText w:val="%6."/>
+      <w:lvlJc w:val="right"/>
+      <w:pPr>
+        <w:ind w:left="4669" w:hanging="180"/>
+      </w:pPr>
+    </w:lvl>
+    <w:lvl w:ilvl="6" w:tplc="0419000F" w:tentative="1">
+      <w:start w:val="1"/>
+      <w:numFmt w:val="decimal"/>
+      <w:lvlText w:val="%7."/>
+      <w:lvlJc w:val="left"/>
+      <w:pPr>
+        <w:ind w:left="5389" w:hanging="360"/>
+      </w:pPr>
+    </w:lvl>
+    <w:lvl w:ilvl="7" w:tplc="04190019" w:tentative="1">
+      <w:start w:val="1"/>
+      <w:numFmt w:val="lowerLetter"/>
+      <w:lvlText w:val="%8."/>
+      <w:lvlJc w:val="left"/>
+      <w:pPr>
+        <w:ind w:left="6109" w:hanging="360"/>
+      </w:pPr>
+    </w:lvl>
+    <w:lvl w:ilvl="8" w:tplc="0419001B" w:tentative="1">
+      <w:start w:val="1"/>
+      <w:numFmt w:val="lowerRoman"/>
+      <w:lvlText w:val="%9."/>
+      <w:lvlJc w:val="right"/>
+      <w:pPr>
+        <w:ind w:left="6829" w:hanging="180"/>
+      </w:pPr>
+    </w:lvl>
+  </w:abstractNum>
+  <w:abstractNum w:abstractNumId="22" w15:restartNumberingAfterBreak="0">
     <w:nsid w:val="67C658B0"/>
     <w:multiLevelType w:val="hybridMultilevel"/>
     <w:tmpl w:val="1BE6BB12"/>
@@ -31579,7 +32565,7 @@
       </w:rPr>
     </w:lvl>
   </w:abstractNum>
-  <w:abstractNum w:abstractNumId="22" w15:restartNumberingAfterBreak="0">
+  <w:abstractNum w:abstractNumId="23" w15:restartNumberingAfterBreak="0">
     <w:nsid w:val="67DB7E98"/>
     <w:multiLevelType w:val="hybridMultilevel"/>
     <w:tmpl w:val="D42882F2"/>
@@ -31692,7 +32678,7 @@
       </w:rPr>
     </w:lvl>
   </w:abstractNum>
-  <w:abstractNum w:abstractNumId="23" w15:restartNumberingAfterBreak="0">
+  <w:abstractNum w:abstractNumId="24" w15:restartNumberingAfterBreak="0">
     <w:nsid w:val="6955234E"/>
     <w:multiLevelType w:val="hybridMultilevel"/>
     <w:tmpl w:val="58E85584"/>
@@ -31805,7 +32791,7 @@
       </w:rPr>
     </w:lvl>
   </w:abstractNum>
-  <w:abstractNum w:abstractNumId="24" w15:restartNumberingAfterBreak="0">
+  <w:abstractNum w:abstractNumId="25" w15:restartNumberingAfterBreak="0">
     <w:nsid w:val="738F0F93"/>
     <w:multiLevelType w:val="hybridMultilevel"/>
     <w:tmpl w:val="5C4E99A2"/>
@@ -31918,7 +32904,7 @@
       </w:rPr>
     </w:lvl>
   </w:abstractNum>
-  <w:abstractNum w:abstractNumId="25" w15:restartNumberingAfterBreak="0">
+  <w:abstractNum w:abstractNumId="26" w15:restartNumberingAfterBreak="0">
     <w:nsid w:val="7492456F"/>
     <w:multiLevelType w:val="hybridMultilevel"/>
     <w:tmpl w:val="DA30138E"/>
@@ -32044,7 +33030,7 @@
     <w:abstractNumId w:val="20"/>
   </w:num>
   <w:num w:numId="5">
-    <w:abstractNumId w:val="21"/>
+    <w:abstractNumId w:val="22"/>
   </w:num>
   <w:num w:numId="6">
     <w:abstractNumId w:val="18"/>
@@ -32065,7 +33051,7 @@
     <w:abstractNumId w:val="5"/>
   </w:num>
   <w:num w:numId="12">
-    <w:abstractNumId w:val="23"/>
+    <w:abstractNumId w:val="24"/>
   </w:num>
   <w:num w:numId="13">
     <w:abstractNumId w:val="15"/>
@@ -32077,7 +33063,7 @@
     <w:abstractNumId w:val="10"/>
   </w:num>
   <w:num w:numId="16">
-    <w:abstractNumId w:val="24"/>
+    <w:abstractNumId w:val="25"/>
   </w:num>
   <w:num w:numId="17">
     <w:abstractNumId w:val="1"/>
@@ -32092,10 +33078,10 @@
     <w:abstractNumId w:val="17"/>
   </w:num>
   <w:num w:numId="21">
-    <w:abstractNumId w:val="25"/>
+    <w:abstractNumId w:val="26"/>
   </w:num>
   <w:num w:numId="22">
-    <w:abstractNumId w:val="22"/>
+    <w:abstractNumId w:val="23"/>
   </w:num>
   <w:num w:numId="23">
     <w:abstractNumId w:val="9"/>
@@ -32108,6 +33094,9 @@
   </w:num>
   <w:num w:numId="26">
     <w:abstractNumId w:val="19"/>
+  </w:num>
+  <w:num w:numId="27">
+    <w:abstractNumId w:val="21"/>
   </w:num>
   <w:numIdMacAtCleanup w:val="24"/>
 </w:numbering>
@@ -33129,7 +34118,7 @@
 </file>
 
 <file path=customXml/itemProps1.xml><?xml version="1.0" encoding="utf-8"?>
-<ds:datastoreItem xmlns:ds="http://schemas.openxmlformats.org/officeDocument/2006/customXml" ds:itemID="{C1ACDCA6-7056-46A4-B72E-60B16966446B}">
+<ds:datastoreItem xmlns:ds="http://schemas.openxmlformats.org/officeDocument/2006/customXml" ds:itemID="{8328688B-CCE9-4349-832B-6B007FECE14B}">
   <ds:schemaRefs>
     <ds:schemaRef ds:uri="http://schemas.openxmlformats.org/officeDocument/2006/bibliography"/>
   </ds:schemaRefs>

</xml_diff>